<commit_message>
Aloqabank tadqiqot obyekti sifatida; o‘zbekcha qo‘shtirnoq va Times New Roman shrifti
- Kirish: Aloqabank uchinchi obyekt sifatida, “tekshiruv uchun qo‘shilgan” iboralari soddalashtirildi
- tools/pardoz.py: «…» → “…” (matn, izohlar, diagrammalar, ichki Excel) va barcha shriftlar Times New Roman (sarlavhalardagi Calibri/tema shriftlari ham)
- mundarija sahifa raqamlari yangilandi

Co-Authored-By: Claude Opus 5.5 <noreply@anthropic.com>
Claude-Session: https://claude.ai/code/session_01PxHTC8Q7yHdrpAeUA5KUgM
</commit_message>
<xml_diff>
--- a/Kamchiliklar_jadvali_tuzatish_yollari.docx
+++ b/Kamchiliklar_jadvali_tuzatish_yollari.docx
@@ -9,13 +9,13 @@
       </w:pPr>
       <w:r>
         <w:rPr>
-          <w:rFonts w:ascii="Times New Roman" w:cs="Times New Roman" w:eastAsia="Times New Roman" w:hAnsi="Times New Roman"/>
+          <w:rFonts w:ascii="Times New Roman" w:hAnsi="Times New Roman" w:eastAsia="Times New Roman" w:cs="Times New Roman"/>
           <w:b/>
           <w:bCs/>
           <w:sz w:val="28"/>
           <w:szCs w:val="28"/>
         </w:rPr>
-        <w:t xml:space="preserve">«Tijorat banklari moliyaviy barqarorligini xalqaro standartlar asosida baholash metodologiyasini takomillashtirish» (DSc) dissertatsiyasining kamchiliklari</w:t>
+        <w:t xml:space="preserve">“Tijorat banklari moliyaviy barqarorligini xalqaro standartlar asosida baholash metodologiyasini takomillashtirish” (DSc) dissertatsiyasining kamchiliklari</w:t>
       </w:r>
     </w:p>
     <w:p>
@@ -25,7 +25,7 @@
       </w:pPr>
       <w:r>
         <w:rPr>
-          <w:rFonts w:ascii="Times New Roman" w:cs="Times New Roman" w:eastAsia="Times New Roman" w:hAnsi="Times New Roman"/>
+          <w:rFonts w:ascii="Times New Roman" w:hAnsi="Times New Roman" w:eastAsia="Times New Roman" w:cs="Times New Roman"/>
           <w:b w:val="false"/>
           <w:bCs w:val="false"/>
           <w:sz w:val="22"/>
@@ -41,7 +41,7 @@
       </w:pPr>
       <w:r>
         <w:rPr>
-          <w:rFonts w:ascii="Times New Roman" w:cs="Times New Roman" w:eastAsia="Times New Roman" w:hAnsi="Times New Roman"/>
+          <w:rFonts w:ascii="Times New Roman" w:hAnsi="Times New Roman" w:eastAsia="Times New Roman" w:cs="Times New Roman"/>
           <w:b w:val="false"/>
           <w:bCs w:val="false"/>
           <w:sz w:val="22"/>
@@ -91,7 +91,7 @@
             </w:pPr>
             <w:r>
               <w:rPr>
-                <w:rFonts w:ascii="Times New Roman" w:cs="Times New Roman" w:eastAsia="Times New Roman" w:hAnsi="Times New Roman"/>
+                <w:rFonts w:ascii="Times New Roman" w:hAnsi="Times New Roman" w:eastAsia="Times New Roman" w:cs="Times New Roman"/>
                 <w:b w:val="false"/>
                 <w:bCs w:val="false"/>
                 <w:sz w:val="19"/>
@@ -124,7 +124,7 @@
             </w:pPr>
             <w:r>
               <w:rPr>
-                <w:rFonts w:ascii="Times New Roman" w:cs="Times New Roman" w:eastAsia="Times New Roman" w:hAnsi="Times New Roman"/>
+                <w:rFonts w:ascii="Times New Roman" w:hAnsi="Times New Roman" w:eastAsia="Times New Roman" w:cs="Times New Roman"/>
                 <w:b w:val="false"/>
                 <w:bCs w:val="false"/>
                 <w:sz w:val="20"/>
@@ -160,7 +160,7 @@
             </w:pPr>
             <w:r>
               <w:rPr>
-                <w:rFonts w:ascii="Times New Roman" w:cs="Times New Roman" w:eastAsia="Times New Roman" w:hAnsi="Times New Roman"/>
+                <w:rFonts w:ascii="Times New Roman" w:hAnsi="Times New Roman" w:eastAsia="Times New Roman" w:cs="Times New Roman"/>
                 <w:b w:val="false"/>
                 <w:bCs w:val="false"/>
                 <w:sz w:val="19"/>
@@ -193,7 +193,7 @@
             </w:pPr>
             <w:r>
               <w:rPr>
-                <w:rFonts w:ascii="Times New Roman" w:cs="Times New Roman" w:eastAsia="Times New Roman" w:hAnsi="Times New Roman"/>
+                <w:rFonts w:ascii="Times New Roman" w:hAnsi="Times New Roman" w:eastAsia="Times New Roman" w:cs="Times New Roman"/>
                 <w:b w:val="false"/>
                 <w:bCs w:val="false"/>
                 <w:sz w:val="20"/>
@@ -229,7 +229,7 @@
             </w:pPr>
             <w:r>
               <w:rPr>
-                <w:rFonts w:ascii="Times New Roman" w:cs="Times New Roman" w:eastAsia="Times New Roman" w:hAnsi="Times New Roman"/>
+                <w:rFonts w:ascii="Times New Roman" w:hAnsi="Times New Roman" w:eastAsia="Times New Roman" w:cs="Times New Roman"/>
                 <w:b w:val="false"/>
                 <w:bCs w:val="false"/>
                 <w:sz w:val="19"/>
@@ -262,7 +262,7 @@
             </w:pPr>
             <w:r>
               <w:rPr>
-                <w:rFonts w:ascii="Times New Roman" w:cs="Times New Roman" w:eastAsia="Times New Roman" w:hAnsi="Times New Roman"/>
+                <w:rFonts w:ascii="Times New Roman" w:hAnsi="Times New Roman" w:eastAsia="Times New Roman" w:cs="Times New Roman"/>
                 <w:b w:val="false"/>
                 <w:bCs w:val="false"/>
                 <w:sz w:val="20"/>
@@ -298,7 +298,7 @@
             </w:pPr>
             <w:r>
               <w:rPr>
-                <w:rFonts w:ascii="Times New Roman" w:cs="Times New Roman" w:eastAsia="Times New Roman" w:hAnsi="Times New Roman"/>
+                <w:rFonts w:ascii="Times New Roman" w:hAnsi="Times New Roman" w:eastAsia="Times New Roman" w:cs="Times New Roman"/>
                 <w:b w:val="false"/>
                 <w:bCs w:val="false"/>
                 <w:sz w:val="19"/>
@@ -331,7 +331,7 @@
             </w:pPr>
             <w:r>
               <w:rPr>
-                <w:rFonts w:ascii="Times New Roman" w:cs="Times New Roman" w:eastAsia="Times New Roman" w:hAnsi="Times New Roman"/>
+                <w:rFonts w:ascii="Times New Roman" w:hAnsi="Times New Roman" w:eastAsia="Times New Roman" w:cs="Times New Roman"/>
                 <w:b w:val="false"/>
                 <w:bCs w:val="false"/>
                 <w:sz w:val="20"/>
@@ -350,7 +350,7 @@
       </w:pPr>
       <w:r>
         <w:rPr>
-          <w:rFonts w:ascii="Times New Roman" w:cs="Times New Roman" w:eastAsia="Times New Roman" w:hAnsi="Times New Roman"/>
+          <w:rFonts w:ascii="Times New Roman" w:hAnsi="Times New Roman" w:eastAsia="Times New Roman" w:cs="Times New Roman"/>
           <w:b w:val="false"/>
           <w:bCs w:val="false"/>
           <w:sz w:val="24"/>
@@ -408,7 +408,7 @@
             </w:pPr>
             <w:r>
               <w:rPr>
-                <w:rFonts w:ascii="Times New Roman" w:cs="Times New Roman" w:eastAsia="Times New Roman" w:hAnsi="Times New Roman"/>
+                <w:rFonts w:ascii="Times New Roman" w:hAnsi="Times New Roman" w:eastAsia="Times New Roman" w:cs="Times New Roman"/>
                 <w:b/>
                 <w:bCs/>
                 <w:sz w:val="19"/>
@@ -442,7 +442,7 @@
             </w:pPr>
             <w:r>
               <w:rPr>
-                <w:rFonts w:ascii="Times New Roman" w:cs="Times New Roman" w:eastAsia="Times New Roman" w:hAnsi="Times New Roman"/>
+                <w:rFonts w:ascii="Times New Roman" w:hAnsi="Times New Roman" w:eastAsia="Times New Roman" w:cs="Times New Roman"/>
                 <w:b/>
                 <w:bCs/>
                 <w:sz w:val="19"/>
@@ -476,7 +476,7 @@
             </w:pPr>
             <w:r>
               <w:rPr>
-                <w:rFonts w:ascii="Times New Roman" w:cs="Times New Roman" w:eastAsia="Times New Roman" w:hAnsi="Times New Roman"/>
+                <w:rFonts w:ascii="Times New Roman" w:hAnsi="Times New Roman" w:eastAsia="Times New Roman" w:cs="Times New Roman"/>
                 <w:b/>
                 <w:bCs/>
                 <w:sz w:val="19"/>
@@ -510,7 +510,7 @@
             </w:pPr>
             <w:r>
               <w:rPr>
-                <w:rFonts w:ascii="Times New Roman" w:cs="Times New Roman" w:eastAsia="Times New Roman" w:hAnsi="Times New Roman"/>
+                <w:rFonts w:ascii="Times New Roman" w:hAnsi="Times New Roman" w:eastAsia="Times New Roman" w:cs="Times New Roman"/>
                 <w:b/>
                 <w:bCs/>
                 <w:sz w:val="19"/>
@@ -544,7 +544,7 @@
             </w:pPr>
             <w:r>
               <w:rPr>
-                <w:rFonts w:ascii="Times New Roman" w:cs="Times New Roman" w:eastAsia="Times New Roman" w:hAnsi="Times New Roman"/>
+                <w:rFonts w:ascii="Times New Roman" w:hAnsi="Times New Roman" w:eastAsia="Times New Roman" w:cs="Times New Roman"/>
                 <w:b/>
                 <w:bCs/>
                 <w:sz w:val="19"/>
@@ -578,7 +578,7 @@
             </w:pPr>
             <w:r>
               <w:rPr>
-                <w:rFonts w:ascii="Times New Roman" w:cs="Times New Roman" w:eastAsia="Times New Roman" w:hAnsi="Times New Roman"/>
+                <w:rFonts w:ascii="Times New Roman" w:hAnsi="Times New Roman" w:eastAsia="Times New Roman" w:cs="Times New Roman"/>
                 <w:b/>
                 <w:bCs/>
                 <w:sz w:val="19"/>
@@ -609,7 +609,7 @@
             <w:pPr/>
             <w:r>
               <w:rPr>
-                <w:rFonts w:ascii="Times New Roman" w:cs="Times New Roman" w:eastAsia="Times New Roman" w:hAnsi="Times New Roman"/>
+                <w:rFonts w:ascii="Times New Roman" w:hAnsi="Times New Roman" w:eastAsia="Times New Roman" w:cs="Times New Roman"/>
                 <w:b/>
                 <w:bCs/>
                 <w:color w:val="FF0000"/>
@@ -647,7 +647,7 @@
             </w:pPr>
             <w:r>
               <w:rPr>
-                <w:rFonts w:ascii="Times New Roman" w:cs="Times New Roman" w:eastAsia="Times New Roman" w:hAnsi="Times New Roman"/>
+                <w:rFonts w:ascii="Times New Roman" w:hAnsi="Times New Roman" w:eastAsia="Times New Roman" w:cs="Times New Roman"/>
                 <w:b/>
                 <w:bCs/>
                 <w:sz w:val="21"/>
@@ -685,7 +685,7 @@
             </w:pPr>
             <w:r>
               <w:rPr>
-                <w:rFonts w:ascii="Times New Roman" w:cs="Times New Roman" w:eastAsia="Times New Roman" w:hAnsi="Times New Roman"/>
+                <w:rFonts w:ascii="Times New Roman" w:hAnsi="Times New Roman" w:eastAsia="Times New Roman" w:cs="Times New Roman"/>
                 <w:b w:val="false"/>
                 <w:bCs w:val="false"/>
                 <w:sz w:val="19"/>
@@ -718,7 +718,7 @@
             </w:pPr>
             <w:r>
               <w:rPr>
-                <w:rFonts w:ascii="Times New Roman" w:cs="Times New Roman" w:eastAsia="Times New Roman" w:hAnsi="Times New Roman"/>
+                <w:rFonts w:ascii="Times New Roman" w:hAnsi="Times New Roman" w:eastAsia="Times New Roman" w:cs="Times New Roman"/>
                 <w:b w:val="false"/>
                 <w:bCs w:val="false"/>
                 <w:sz w:val="19"/>
@@ -751,7 +751,7 @@
             </w:pPr>
             <w:r>
               <w:rPr>
-                <w:rFonts w:ascii="Times New Roman" w:cs="Times New Roman" w:eastAsia="Times New Roman" w:hAnsi="Times New Roman"/>
+                <w:rFonts w:ascii="Times New Roman" w:hAnsi="Times New Roman" w:eastAsia="Times New Roman" w:cs="Times New Roman"/>
                 <w:b w:val="false"/>
                 <w:bCs w:val="false"/>
                 <w:sz w:val="19"/>
@@ -784,13 +784,13 @@
             </w:pPr>
             <w:r>
               <w:rPr>
-                <w:rFonts w:ascii="Times New Roman" w:cs="Times New Roman" w:eastAsia="Times New Roman" w:hAnsi="Times New Roman"/>
-                <w:b w:val="false"/>
-                <w:bCs w:val="false"/>
-                <w:sz w:val="19"/>
-                <w:szCs w:val="19"/>
-              </w:rPr>
-              <w:t xml:space="preserve">NSFR bo‘yicha «regulyativ kapital o‘rniga xususiy kapital olinishi me’yorni 7,2 foiz punktga oshiradi» deyilgan. Bu natija asosiy matnda umuman yoritilmagan.</w:t>
+                <w:rFonts w:ascii="Times New Roman" w:hAnsi="Times New Roman" w:eastAsia="Times New Roman" w:cs="Times New Roman"/>
+                <w:b w:val="false"/>
+                <w:bCs w:val="false"/>
+                <w:sz w:val="19"/>
+                <w:szCs w:val="19"/>
+              </w:rPr>
+              <w:t xml:space="preserve">NSFR bo‘yicha “regulyativ kapital o‘rniga xususiy kapital olinishi me’yorni 7,2 foiz punktga oshiradi” deyilgan. Bu natija asosiy matnda umuman yoritilmagan.</w:t>
             </w:r>
           </w:p>
         </w:tc>
@@ -817,7 +817,7 @@
             </w:pPr>
             <w:r>
               <w:rPr>
-                <w:rFonts w:ascii="Times New Roman" w:cs="Times New Roman" w:eastAsia="Times New Roman" w:hAnsi="Times New Roman"/>
+                <w:rFonts w:ascii="Times New Roman" w:hAnsi="Times New Roman" w:eastAsia="Times New Roman" w:cs="Times New Roman"/>
                 <w:b w:val="false"/>
                 <w:bCs w:val="false"/>
                 <w:sz w:val="19"/>
@@ -851,7 +851,7 @@
             </w:pPr>
             <w:r>
               <w:rPr>
-                <w:rFonts w:ascii="Times New Roman" w:cs="Times New Roman" w:eastAsia="Times New Roman" w:hAnsi="Times New Roman"/>
+                <w:rFonts w:ascii="Times New Roman" w:hAnsi="Times New Roman" w:eastAsia="Times New Roman" w:cs="Times New Roman"/>
                 <w:b w:val="false"/>
                 <w:bCs w:val="false"/>
                 <w:sz w:val="19"/>
@@ -882,7 +882,7 @@
             <w:pPr/>
             <w:r>
               <w:rPr>
-                <w:rFonts w:ascii="Times New Roman" w:cs="Times New Roman" w:eastAsia="Times New Roman" w:hAnsi="Times New Roman"/>
+                <w:rFonts w:ascii="Times New Roman" w:hAnsi="Times New Roman" w:eastAsia="Times New Roman" w:cs="Times New Roman"/>
                 <w:b w:val="false"/>
                 <w:bCs w:val="false"/>
                 <w:color w:val="FF0000"/>
@@ -921,7 +921,7 @@
             </w:pPr>
             <w:r>
               <w:rPr>
-                <w:rFonts w:ascii="Times New Roman" w:cs="Times New Roman" w:eastAsia="Times New Roman" w:hAnsi="Times New Roman"/>
+                <w:rFonts w:ascii="Times New Roman" w:hAnsi="Times New Roman" w:eastAsia="Times New Roman" w:cs="Times New Roman"/>
                 <w:b w:val="false"/>
                 <w:bCs w:val="false"/>
                 <w:sz w:val="19"/>
@@ -954,7 +954,7 @@
             </w:pPr>
             <w:r>
               <w:rPr>
-                <w:rFonts w:ascii="Times New Roman" w:cs="Times New Roman" w:eastAsia="Times New Roman" w:hAnsi="Times New Roman"/>
+                <w:rFonts w:ascii="Times New Roman" w:hAnsi="Times New Roman" w:eastAsia="Times New Roman" w:cs="Times New Roman"/>
                 <w:b w:val="false"/>
                 <w:bCs w:val="false"/>
                 <w:sz w:val="19"/>
@@ -987,7 +987,7 @@
             </w:pPr>
             <w:r>
               <w:rPr>
-                <w:rFonts w:ascii="Times New Roman" w:cs="Times New Roman" w:eastAsia="Times New Roman" w:hAnsi="Times New Roman"/>
+                <w:rFonts w:ascii="Times New Roman" w:hAnsi="Times New Roman" w:eastAsia="Times New Roman" w:cs="Times New Roman"/>
                 <w:b w:val="false"/>
                 <w:bCs w:val="false"/>
                 <w:sz w:val="19"/>
@@ -1020,13 +1020,13 @@
             </w:pPr>
             <w:r>
               <w:rPr>
-                <w:rFonts w:ascii="Times New Roman" w:cs="Times New Roman" w:eastAsia="Times New Roman" w:hAnsi="Times New Roman"/>
-                <w:b w:val="false"/>
-                <w:bCs w:val="false"/>
-                <w:sz w:val="19"/>
-                <w:szCs w:val="19"/>
-              </w:rPr>
-              <w:t xml:space="preserve">NSFR ning «hisobot farqi» Kirish va Xulosada 2,7 p.p., 2.3.4-jadval va matnda esa 2,8 p.p. deb berilgan.</w:t>
+                <w:rFonts w:ascii="Times New Roman" w:hAnsi="Times New Roman" w:eastAsia="Times New Roman" w:cs="Times New Roman"/>
+                <w:b w:val="false"/>
+                <w:bCs w:val="false"/>
+                <w:sz w:val="19"/>
+                <w:szCs w:val="19"/>
+              </w:rPr>
+              <w:t xml:space="preserve">NSFR ning “hisobot farqi” Kirish va Xulosada 2,7 p.p., 2.3.4-jadval va matnda esa 2,8 p.p. deb berilgan.</w:t>
             </w:r>
           </w:p>
         </w:tc>
@@ -1053,7 +1053,7 @@
             </w:pPr>
             <w:r>
               <w:rPr>
-                <w:rFonts w:ascii="Times New Roman" w:cs="Times New Roman" w:eastAsia="Times New Roman" w:hAnsi="Times New Roman"/>
+                <w:rFonts w:ascii="Times New Roman" w:hAnsi="Times New Roman" w:eastAsia="Times New Roman" w:cs="Times New Roman"/>
                 <w:b w:val="false"/>
                 <w:bCs w:val="false"/>
                 <w:sz w:val="19"/>
@@ -1087,13 +1087,13 @@
             </w:pPr>
             <w:r>
               <w:rPr>
-                <w:rFonts w:ascii="Times New Roman" w:cs="Times New Roman" w:eastAsia="Times New Roman" w:hAnsi="Times New Roman"/>
-                <w:b w:val="false"/>
-                <w:bCs w:val="false"/>
-                <w:sz w:val="19"/>
-                <w:szCs w:val="19"/>
-              </w:rPr>
-              <w:t xml:space="preserve">Tuzatildi («2,7–2,8»)</w:t>
+                <w:rFonts w:ascii="Times New Roman" w:hAnsi="Times New Roman" w:eastAsia="Times New Roman" w:cs="Times New Roman"/>
+                <w:b w:val="false"/>
+                <w:bCs w:val="false"/>
+                <w:sz w:val="19"/>
+                <w:szCs w:val="19"/>
+              </w:rPr>
+              <w:t xml:space="preserve">Tuzatildi (“2,7–2,8”)</w:t>
             </w:r>
           </w:p>
         </w:tc>
@@ -1118,14 +1118,14 @@
             <w:pPr/>
             <w:r>
               <w:rPr>
-                <w:rFonts w:ascii="Times New Roman" w:cs="Times New Roman" w:eastAsia="Times New Roman" w:hAnsi="Times New Roman"/>
+                <w:rFonts w:ascii="Times New Roman" w:hAnsi="Times New Roman" w:eastAsia="Times New Roman" w:cs="Times New Roman"/>
                 <w:b w:val="false"/>
                 <w:bCs w:val="false"/>
                 <w:color w:val="FF0000"/>
                 <w:sz w:val="19"/>
                 <w:szCs w:val="19"/>
               </w:rPr>
-              <w:t xml:space="preserve">Tuzatildi. Kirish va Xulosadagi «2,7–2,8» saqlandi; 2.3-§ matniga farq dekompozitsiya tartibiga bog‘liqligi (MB metodikasi bo‘yicha 2,7, Bazel III bo‘yicha 2,8) izohi qo‘shildi.</w:t>
+              <w:t xml:space="preserve">Tuzatildi. Kirish va Xulosadagi “2,7–2,8” saqlandi; 2.3-§ matniga farq dekompozitsiya tartibiga bog‘liqligi (MB metodikasi bo‘yicha 2,7, Bazel III bo‘yicha 2,8) izohi qo‘shildi.</w:t>
             </w:r>
           </w:p>
         </w:tc>
@@ -1157,7 +1157,7 @@
             </w:pPr>
             <w:r>
               <w:rPr>
-                <w:rFonts w:ascii="Times New Roman" w:cs="Times New Roman" w:eastAsia="Times New Roman" w:hAnsi="Times New Roman"/>
+                <w:rFonts w:ascii="Times New Roman" w:hAnsi="Times New Roman" w:eastAsia="Times New Roman" w:cs="Times New Roman"/>
                 <w:b w:val="false"/>
                 <w:bCs w:val="false"/>
                 <w:sz w:val="19"/>
@@ -1190,7 +1190,7 @@
             </w:pPr>
             <w:r>
               <w:rPr>
-                <w:rFonts w:ascii="Times New Roman" w:cs="Times New Roman" w:eastAsia="Times New Roman" w:hAnsi="Times New Roman"/>
+                <w:rFonts w:ascii="Times New Roman" w:hAnsi="Times New Roman" w:eastAsia="Times New Roman" w:cs="Times New Roman"/>
                 <w:b w:val="false"/>
                 <w:bCs w:val="false"/>
                 <w:sz w:val="19"/>
@@ -1223,7 +1223,7 @@
             </w:pPr>
             <w:r>
               <w:rPr>
-                <w:rFonts w:ascii="Times New Roman" w:cs="Times New Roman" w:eastAsia="Times New Roman" w:hAnsi="Times New Roman"/>
+                <w:rFonts w:ascii="Times New Roman" w:hAnsi="Times New Roman" w:eastAsia="Times New Roman" w:cs="Times New Roman"/>
                 <w:b w:val="false"/>
                 <w:bCs w:val="false"/>
                 <w:sz w:val="19"/>
@@ -1256,7 +1256,7 @@
             </w:pPr>
             <w:r>
               <w:rPr>
-                <w:rFonts w:ascii="Times New Roman" w:cs="Times New Roman" w:eastAsia="Times New Roman" w:hAnsi="Times New Roman"/>
+                <w:rFonts w:ascii="Times New Roman" w:hAnsi="Times New Roman" w:eastAsia="Times New Roman" w:cs="Times New Roman"/>
                 <w:b w:val="false"/>
                 <w:bCs w:val="false"/>
                 <w:sz w:val="19"/>
@@ -1289,7 +1289,7 @@
             </w:pPr>
             <w:r>
               <w:rPr>
-                <w:rFonts w:ascii="Times New Roman" w:cs="Times New Roman" w:eastAsia="Times New Roman" w:hAnsi="Times New Roman"/>
+                <w:rFonts w:ascii="Times New Roman" w:hAnsi="Times New Roman" w:eastAsia="Times New Roman" w:cs="Times New Roman"/>
                 <w:b w:val="false"/>
                 <w:bCs w:val="false"/>
                 <w:sz w:val="19"/>
@@ -1323,7 +1323,7 @@
             </w:pPr>
             <w:r>
               <w:rPr>
-                <w:rFonts w:ascii="Times New Roman" w:cs="Times New Roman" w:eastAsia="Times New Roman" w:hAnsi="Times New Roman"/>
+                <w:rFonts w:ascii="Times New Roman" w:hAnsi="Times New Roman" w:eastAsia="Times New Roman" w:cs="Times New Roman"/>
                 <w:b w:val="false"/>
                 <w:bCs w:val="false"/>
                 <w:sz w:val="19"/>
@@ -1354,7 +1354,7 @@
             <w:pPr/>
             <w:r>
               <w:rPr>
-                <w:rFonts w:ascii="Times New Roman" w:cs="Times New Roman" w:eastAsia="Times New Roman" w:hAnsi="Times New Roman"/>
+                <w:rFonts w:ascii="Times New Roman" w:hAnsi="Times New Roman" w:eastAsia="Times New Roman" w:cs="Times New Roman"/>
                 <w:b w:val="false"/>
                 <w:bCs w:val="false"/>
                 <w:color w:val="FF0000"/>
@@ -1393,7 +1393,7 @@
             </w:pPr>
             <w:r>
               <w:rPr>
-                <w:rFonts w:ascii="Times New Roman" w:cs="Times New Roman" w:eastAsia="Times New Roman" w:hAnsi="Times New Roman"/>
+                <w:rFonts w:ascii="Times New Roman" w:hAnsi="Times New Roman" w:eastAsia="Times New Roman" w:cs="Times New Roman"/>
                 <w:b w:val="false"/>
                 <w:bCs w:val="false"/>
                 <w:sz w:val="19"/>
@@ -1426,7 +1426,7 @@
             </w:pPr>
             <w:r>
               <w:rPr>
-                <w:rFonts w:ascii="Times New Roman" w:cs="Times New Roman" w:eastAsia="Times New Roman" w:hAnsi="Times New Roman"/>
+                <w:rFonts w:ascii="Times New Roman" w:hAnsi="Times New Roman" w:eastAsia="Times New Roman" w:cs="Times New Roman"/>
                 <w:b w:val="false"/>
                 <w:bCs w:val="false"/>
                 <w:sz w:val="19"/>
@@ -1459,7 +1459,7 @@
             </w:pPr>
             <w:r>
               <w:rPr>
-                <w:rFonts w:ascii="Times New Roman" w:cs="Times New Roman" w:eastAsia="Times New Roman" w:hAnsi="Times New Roman"/>
+                <w:rFonts w:ascii="Times New Roman" w:hAnsi="Times New Roman" w:eastAsia="Times New Roman" w:cs="Times New Roman"/>
                 <w:b w:val="false"/>
                 <w:bCs w:val="false"/>
                 <w:sz w:val="19"/>
@@ -1492,7 +1492,7 @@
             </w:pPr>
             <w:r>
               <w:rPr>
-                <w:rFonts w:ascii="Times New Roman" w:cs="Times New Roman" w:eastAsia="Times New Roman" w:hAnsi="Times New Roman"/>
+                <w:rFonts w:ascii="Times New Roman" w:hAnsi="Times New Roman" w:eastAsia="Times New Roman" w:cs="Times New Roman"/>
                 <w:b w:val="false"/>
                 <w:bCs w:val="false"/>
                 <w:sz w:val="19"/>
@@ -1525,7 +1525,7 @@
             </w:pPr>
             <w:r>
               <w:rPr>
-                <w:rFonts w:ascii="Times New Roman" w:cs="Times New Roman" w:eastAsia="Times New Roman" w:hAnsi="Times New Roman"/>
+                <w:rFonts w:ascii="Times New Roman" w:hAnsi="Times New Roman" w:eastAsia="Times New Roman" w:cs="Times New Roman"/>
                 <w:b w:val="false"/>
                 <w:bCs w:val="false"/>
                 <w:sz w:val="19"/>
@@ -1559,7 +1559,7 @@
             </w:pPr>
             <w:r>
               <w:rPr>
-                <w:rFonts w:ascii="Times New Roman" w:cs="Times New Roman" w:eastAsia="Times New Roman" w:hAnsi="Times New Roman"/>
+                <w:rFonts w:ascii="Times New Roman" w:hAnsi="Times New Roman" w:eastAsia="Times New Roman" w:cs="Times New Roman"/>
                 <w:b w:val="false"/>
                 <w:bCs w:val="false"/>
                 <w:sz w:val="19"/>
@@ -1590,7 +1590,7 @@
             <w:pPr/>
             <w:r>
               <w:rPr>
-                <w:rFonts w:ascii="Times New Roman" w:cs="Times New Roman" w:eastAsia="Times New Roman" w:hAnsi="Times New Roman"/>
+                <w:rFonts w:ascii="Times New Roman" w:hAnsi="Times New Roman" w:eastAsia="Times New Roman" w:cs="Times New Roman"/>
                 <w:b w:val="false"/>
                 <w:bCs w:val="false"/>
                 <w:color w:val="FF0000"/>
@@ -1629,7 +1629,7 @@
             </w:pPr>
             <w:r>
               <w:rPr>
-                <w:rFonts w:ascii="Times New Roman" w:cs="Times New Roman" w:eastAsia="Times New Roman" w:hAnsi="Times New Roman"/>
+                <w:rFonts w:ascii="Times New Roman" w:hAnsi="Times New Roman" w:eastAsia="Times New Roman" w:cs="Times New Roman"/>
                 <w:b w:val="false"/>
                 <w:bCs w:val="false"/>
                 <w:sz w:val="19"/>
@@ -1662,7 +1662,7 @@
             </w:pPr>
             <w:r>
               <w:rPr>
-                <w:rFonts w:ascii="Times New Roman" w:cs="Times New Roman" w:eastAsia="Times New Roman" w:hAnsi="Times New Roman"/>
+                <w:rFonts w:ascii="Times New Roman" w:hAnsi="Times New Roman" w:eastAsia="Times New Roman" w:cs="Times New Roman"/>
                 <w:b w:val="false"/>
                 <w:bCs w:val="false"/>
                 <w:sz w:val="19"/>
@@ -1695,7 +1695,7 @@
             </w:pPr>
             <w:r>
               <w:rPr>
-                <w:rFonts w:ascii="Times New Roman" w:cs="Times New Roman" w:eastAsia="Times New Roman" w:hAnsi="Times New Roman"/>
+                <w:rFonts w:ascii="Times New Roman" w:hAnsi="Times New Roman" w:eastAsia="Times New Roman" w:cs="Times New Roman"/>
                 <w:b w:val="false"/>
                 <w:bCs w:val="false"/>
                 <w:sz w:val="19"/>
@@ -1728,13 +1728,13 @@
             </w:pPr>
             <w:r>
               <w:rPr>
-                <w:rFonts w:ascii="Times New Roman" w:cs="Times New Roman" w:eastAsia="Times New Roman" w:hAnsi="Times New Roman"/>
-                <w:b w:val="false"/>
-                <w:bCs w:val="false"/>
-                <w:sz w:val="19"/>
-                <w:szCs w:val="19"/>
-              </w:rPr>
-              <w:t xml:space="preserve">«MBII milliy» nomi ostida ikki xil indeks berilgan. 3.1-§ dagi 13 ko‘rsatkichli indeks: SQB 3,27, MKB 3,13. 4.1–4.3-§ dagi 8 ko‘rsatkichli panel indeksi: SQB 3,61, MKB 2,90.</w:t>
+                <w:rFonts w:ascii="Times New Roman" w:hAnsi="Times New Roman" w:eastAsia="Times New Roman" w:cs="Times New Roman"/>
+                <w:b w:val="false"/>
+                <w:bCs w:val="false"/>
+                <w:sz w:val="19"/>
+                <w:szCs w:val="19"/>
+              </w:rPr>
+              <w:t xml:space="preserve">“MBII milliy” nomi ostida ikki xil indeks berilgan. 3.1-§ dagi 13 ko‘rsatkichli indeks: SQB 3,27, MKB 3,13. 4.1–4.3-§ dagi 8 ko‘rsatkichli panel indeksi: SQB 3,61, MKB 2,90.</w:t>
             </w:r>
           </w:p>
         </w:tc>
@@ -1761,7 +1761,7 @@
             </w:pPr>
             <w:r>
               <w:rPr>
-                <w:rFonts w:ascii="Times New Roman" w:cs="Times New Roman" w:eastAsia="Times New Roman" w:hAnsi="Times New Roman"/>
+                <w:rFonts w:ascii="Times New Roman" w:hAnsi="Times New Roman" w:eastAsia="Times New Roman" w:cs="Times New Roman"/>
                 <w:b w:val="false"/>
                 <w:bCs w:val="false"/>
                 <w:sz w:val="19"/>
@@ -1795,7 +1795,7 @@
             </w:pPr>
             <w:r>
               <w:rPr>
-                <w:rFonts w:ascii="Times New Roman" w:cs="Times New Roman" w:eastAsia="Times New Roman" w:hAnsi="Times New Roman"/>
+                <w:rFonts w:ascii="Times New Roman" w:hAnsi="Times New Roman" w:eastAsia="Times New Roman" w:cs="Times New Roman"/>
                 <w:b w:val="false"/>
                 <w:bCs w:val="false"/>
                 <w:sz w:val="19"/>
@@ -1826,7 +1826,7 @@
             <w:pPr/>
             <w:r>
               <w:rPr>
-                <w:rFonts w:ascii="Times New Roman" w:cs="Times New Roman" w:eastAsia="Times New Roman" w:hAnsi="Times New Roman"/>
+                <w:rFonts w:ascii="Times New Roman" w:hAnsi="Times New Roman" w:eastAsia="Times New Roman" w:cs="Times New Roman"/>
                 <w:b w:val="false"/>
                 <w:bCs w:val="false"/>
                 <w:color w:val="FF0000"/>
@@ -1865,7 +1865,7 @@
             </w:pPr>
             <w:r>
               <w:rPr>
-                <w:rFonts w:ascii="Times New Roman" w:cs="Times New Roman" w:eastAsia="Times New Roman" w:hAnsi="Times New Roman"/>
+                <w:rFonts w:ascii="Times New Roman" w:hAnsi="Times New Roman" w:eastAsia="Times New Roman" w:cs="Times New Roman"/>
                 <w:b w:val="false"/>
                 <w:bCs w:val="false"/>
                 <w:sz w:val="19"/>
@@ -1898,7 +1898,7 @@
             </w:pPr>
             <w:r>
               <w:rPr>
-                <w:rFonts w:ascii="Times New Roman" w:cs="Times New Roman" w:eastAsia="Times New Roman" w:hAnsi="Times New Roman"/>
+                <w:rFonts w:ascii="Times New Roman" w:hAnsi="Times New Roman" w:eastAsia="Times New Roman" w:cs="Times New Roman"/>
                 <w:b w:val="false"/>
                 <w:bCs w:val="false"/>
                 <w:sz w:val="19"/>
@@ -1931,7 +1931,7 @@
             </w:pPr>
             <w:r>
               <w:rPr>
-                <w:rFonts w:ascii="Times New Roman" w:cs="Times New Roman" w:eastAsia="Times New Roman" w:hAnsi="Times New Roman"/>
+                <w:rFonts w:ascii="Times New Roman" w:hAnsi="Times New Roman" w:eastAsia="Times New Roman" w:cs="Times New Roman"/>
                 <w:b w:val="false"/>
                 <w:bCs w:val="false"/>
                 <w:sz w:val="19"/>
@@ -1964,7 +1964,7 @@
             </w:pPr>
             <w:r>
               <w:rPr>
-                <w:rFonts w:ascii="Times New Roman" w:cs="Times New Roman" w:eastAsia="Times New Roman" w:hAnsi="Times New Roman"/>
+                <w:rFonts w:ascii="Times New Roman" w:hAnsi="Times New Roman" w:eastAsia="Times New Roman" w:cs="Times New Roman"/>
                 <w:b w:val="false"/>
                 <w:bCs w:val="false"/>
                 <w:sz w:val="19"/>
@@ -1997,13 +1997,13 @@
             </w:pPr>
             <w:r>
               <w:rPr>
-                <w:rFonts w:ascii="Times New Roman" w:cs="Times New Roman" w:eastAsia="Times New Roman" w:hAnsi="Times New Roman"/>
-                <w:b w:val="false"/>
-                <w:bCs w:val="false"/>
-                <w:sz w:val="19"/>
-                <w:szCs w:val="19"/>
-              </w:rPr>
-              <w:t xml:space="preserve">Yulduzchalar, matndagi «barcha spetsifikatsiyalarda 1 foiz darajada» jumlasi va 3.3.7-jadval tuzatildi.</w:t>
+                <w:rFonts w:ascii="Times New Roman" w:hAnsi="Times New Roman" w:eastAsia="Times New Roman" w:cs="Times New Roman"/>
+                <w:b w:val="false"/>
+                <w:bCs w:val="false"/>
+                <w:sz w:val="19"/>
+                <w:szCs w:val="19"/>
+              </w:rPr>
+              <w:t xml:space="preserve">Yulduzchalar, matndagi “barcha spetsifikatsiyalarda 1 foiz darajada” jumlasi va 3.3.7-jadval tuzatildi.</w:t>
             </w:r>
           </w:p>
         </w:tc>
@@ -2031,7 +2031,7 @@
             </w:pPr>
             <w:r>
               <w:rPr>
-                <w:rFonts w:ascii="Times New Roman" w:cs="Times New Roman" w:eastAsia="Times New Roman" w:hAnsi="Times New Roman"/>
+                <w:rFonts w:ascii="Times New Roman" w:hAnsi="Times New Roman" w:eastAsia="Times New Roman" w:cs="Times New Roman"/>
                 <w:b w:val="false"/>
                 <w:bCs w:val="false"/>
                 <w:sz w:val="19"/>
@@ -2062,7 +2062,7 @@
             <w:pPr/>
             <w:r>
               <w:rPr>
-                <w:rFonts w:ascii="Times New Roman" w:cs="Times New Roman" w:eastAsia="Times New Roman" w:hAnsi="Times New Roman"/>
+                <w:rFonts w:ascii="Times New Roman" w:hAnsi="Times New Roman" w:eastAsia="Times New Roman" w:cs="Times New Roman"/>
                 <w:b w:val="false"/>
                 <w:bCs w:val="false"/>
                 <w:color w:val="FF0000"/>
@@ -2101,7 +2101,7 @@
             </w:pPr>
             <w:r>
               <w:rPr>
-                <w:rFonts w:ascii="Times New Roman" w:cs="Times New Roman" w:eastAsia="Times New Roman" w:hAnsi="Times New Roman"/>
+                <w:rFonts w:ascii="Times New Roman" w:hAnsi="Times New Roman" w:eastAsia="Times New Roman" w:cs="Times New Roman"/>
                 <w:b w:val="false"/>
                 <w:bCs w:val="false"/>
                 <w:sz w:val="19"/>
@@ -2134,7 +2134,7 @@
             </w:pPr>
             <w:r>
               <w:rPr>
-                <w:rFonts w:ascii="Times New Roman" w:cs="Times New Roman" w:eastAsia="Times New Roman" w:hAnsi="Times New Roman"/>
+                <w:rFonts w:ascii="Times New Roman" w:hAnsi="Times New Roman" w:eastAsia="Times New Roman" w:cs="Times New Roman"/>
                 <w:b w:val="false"/>
                 <w:bCs w:val="false"/>
                 <w:sz w:val="19"/>
@@ -2167,7 +2167,7 @@
             </w:pPr>
             <w:r>
               <w:rPr>
-                <w:rFonts w:ascii="Times New Roman" w:cs="Times New Roman" w:eastAsia="Times New Roman" w:hAnsi="Times New Roman"/>
+                <w:rFonts w:ascii="Times New Roman" w:hAnsi="Times New Roman" w:eastAsia="Times New Roman" w:cs="Times New Roman"/>
                 <w:b w:val="false"/>
                 <w:bCs w:val="false"/>
                 <w:sz w:val="19"/>
@@ -2200,7 +2200,7 @@
             </w:pPr>
             <w:r>
               <w:rPr>
-                <w:rFonts w:ascii="Times New Roman" w:cs="Times New Roman" w:eastAsia="Times New Roman" w:hAnsi="Times New Roman"/>
+                <w:rFonts w:ascii="Times New Roman" w:hAnsi="Times New Roman" w:eastAsia="Times New Roman" w:cs="Times New Roman"/>
                 <w:b w:val="false"/>
                 <w:bCs w:val="false"/>
                 <w:sz w:val="19"/>
@@ -2233,7 +2233,7 @@
             </w:pPr>
             <w:r>
               <w:rPr>
-                <w:rFonts w:ascii="Times New Roman" w:cs="Times New Roman" w:eastAsia="Times New Roman" w:hAnsi="Times New Roman"/>
+                <w:rFonts w:ascii="Times New Roman" w:hAnsi="Times New Roman" w:eastAsia="Times New Roman" w:cs="Times New Roman"/>
                 <w:b w:val="false"/>
                 <w:bCs w:val="false"/>
                 <w:sz w:val="19"/>
@@ -2267,7 +2267,7 @@
             </w:pPr>
             <w:r>
               <w:rPr>
-                <w:rFonts w:ascii="Times New Roman" w:cs="Times New Roman" w:eastAsia="Times New Roman" w:hAnsi="Times New Roman"/>
+                <w:rFonts w:ascii="Times New Roman" w:hAnsi="Times New Roman" w:eastAsia="Times New Roman" w:cs="Times New Roman"/>
                 <w:b w:val="false"/>
                 <w:bCs w:val="false"/>
                 <w:sz w:val="19"/>
@@ -2298,7 +2298,7 @@
             <w:pPr/>
             <w:r>
               <w:rPr>
-                <w:rFonts w:ascii="Times New Roman" w:cs="Times New Roman" w:eastAsia="Times New Roman" w:hAnsi="Times New Roman"/>
+                <w:rFonts w:ascii="Times New Roman" w:hAnsi="Times New Roman" w:eastAsia="Times New Roman" w:cs="Times New Roman"/>
                 <w:b w:val="false"/>
                 <w:bCs w:val="false"/>
                 <w:color w:val="FF0000"/>
@@ -2337,7 +2337,7 @@
             </w:pPr>
             <w:r>
               <w:rPr>
-                <w:rFonts w:ascii="Times New Roman" w:cs="Times New Roman" w:eastAsia="Times New Roman" w:hAnsi="Times New Roman"/>
+                <w:rFonts w:ascii="Times New Roman" w:hAnsi="Times New Roman" w:eastAsia="Times New Roman" w:cs="Times New Roman"/>
                 <w:b w:val="false"/>
                 <w:bCs w:val="false"/>
                 <w:sz w:val="19"/>
@@ -2370,7 +2370,7 @@
             </w:pPr>
             <w:r>
               <w:rPr>
-                <w:rFonts w:ascii="Times New Roman" w:cs="Times New Roman" w:eastAsia="Times New Roman" w:hAnsi="Times New Roman"/>
+                <w:rFonts w:ascii="Times New Roman" w:hAnsi="Times New Roman" w:eastAsia="Times New Roman" w:cs="Times New Roman"/>
                 <w:b w:val="false"/>
                 <w:bCs w:val="false"/>
                 <w:sz w:val="19"/>
@@ -2403,7 +2403,7 @@
             </w:pPr>
             <w:r>
               <w:rPr>
-                <w:rFonts w:ascii="Times New Roman" w:cs="Times New Roman" w:eastAsia="Times New Roman" w:hAnsi="Times New Roman"/>
+                <w:rFonts w:ascii="Times New Roman" w:hAnsi="Times New Roman" w:eastAsia="Times New Roman" w:cs="Times New Roman"/>
                 <w:b w:val="false"/>
                 <w:bCs w:val="false"/>
                 <w:sz w:val="19"/>
@@ -2436,13 +2436,13 @@
             </w:pPr>
             <w:r>
               <w:rPr>
-                <w:rFonts w:ascii="Times New Roman" w:cs="Times New Roman" w:eastAsia="Times New Roman" w:hAnsi="Times New Roman"/>
-                <w:b w:val="false"/>
-                <w:bCs w:val="false"/>
-                <w:sz w:val="19"/>
-                <w:szCs w:val="19"/>
-              </w:rPr>
-              <w:t xml:space="preserve">«Ikki hisobot bo‘yicha aktivlar farqi 1–5 foizdan oshmaydi» deyilgan.</w:t>
+                <w:rFonts w:ascii="Times New Roman" w:hAnsi="Times New Roman" w:eastAsia="Times New Roman" w:cs="Times New Roman"/>
+                <w:b w:val="false"/>
+                <w:bCs w:val="false"/>
+                <w:sz w:val="19"/>
+                <w:szCs w:val="19"/>
+              </w:rPr>
+              <w:t xml:space="preserve">“Ikki hisobot bo‘yicha aktivlar farqi 1–5 foizdan oshmaydi” deyilgan.</w:t>
             </w:r>
           </w:p>
         </w:tc>
@@ -2469,7 +2469,7 @@
             </w:pPr>
             <w:r>
               <w:rPr>
-                <w:rFonts w:ascii="Times New Roman" w:cs="Times New Roman" w:eastAsia="Times New Roman" w:hAnsi="Times New Roman"/>
+                <w:rFonts w:ascii="Times New Roman" w:hAnsi="Times New Roman" w:eastAsia="Times New Roman" w:cs="Times New Roman"/>
                 <w:b w:val="false"/>
                 <w:bCs w:val="false"/>
                 <w:sz w:val="19"/>
@@ -2503,7 +2503,7 @@
             </w:pPr>
             <w:r>
               <w:rPr>
-                <w:rFonts w:ascii="Times New Roman" w:cs="Times New Roman" w:eastAsia="Times New Roman" w:hAnsi="Times New Roman"/>
+                <w:rFonts w:ascii="Times New Roman" w:hAnsi="Times New Roman" w:eastAsia="Times New Roman" w:cs="Times New Roman"/>
                 <w:b w:val="false"/>
                 <w:bCs w:val="false"/>
                 <w:sz w:val="19"/>
@@ -2534,7 +2534,7 @@
             <w:pPr/>
             <w:r>
               <w:rPr>
-                <w:rFonts w:ascii="Times New Roman" w:cs="Times New Roman" w:eastAsia="Times New Roman" w:hAnsi="Times New Roman"/>
+                <w:rFonts w:ascii="Times New Roman" w:hAnsi="Times New Roman" w:eastAsia="Times New Roman" w:cs="Times New Roman"/>
                 <w:b w:val="false"/>
                 <w:bCs w:val="false"/>
                 <w:color w:val="FF0000"/>
@@ -2573,7 +2573,7 @@
             </w:pPr>
             <w:r>
               <w:rPr>
-                <w:rFonts w:ascii="Times New Roman" w:cs="Times New Roman" w:eastAsia="Times New Roman" w:hAnsi="Times New Roman"/>
+                <w:rFonts w:ascii="Times New Roman" w:hAnsi="Times New Roman" w:eastAsia="Times New Roman" w:cs="Times New Roman"/>
                 <w:b w:val="false"/>
                 <w:bCs w:val="false"/>
                 <w:sz w:val="19"/>
@@ -2606,7 +2606,7 @@
             </w:pPr>
             <w:r>
               <w:rPr>
-                <w:rFonts w:ascii="Times New Roman" w:cs="Times New Roman" w:eastAsia="Times New Roman" w:hAnsi="Times New Roman"/>
+                <w:rFonts w:ascii="Times New Roman" w:hAnsi="Times New Roman" w:eastAsia="Times New Roman" w:cs="Times New Roman"/>
                 <w:b w:val="false"/>
                 <w:bCs w:val="false"/>
                 <w:sz w:val="19"/>
@@ -2639,7 +2639,7 @@
             </w:pPr>
             <w:r>
               <w:rPr>
-                <w:rFonts w:ascii="Times New Roman" w:cs="Times New Roman" w:eastAsia="Times New Roman" w:hAnsi="Times New Roman"/>
+                <w:rFonts w:ascii="Times New Roman" w:hAnsi="Times New Roman" w:eastAsia="Times New Roman" w:cs="Times New Roman"/>
                 <w:b w:val="false"/>
                 <w:bCs w:val="false"/>
                 <w:sz w:val="19"/>
@@ -2672,13 +2672,13 @@
             </w:pPr>
             <w:r>
               <w:rPr>
-                <w:rFonts w:ascii="Times New Roman" w:cs="Times New Roman" w:eastAsia="Times New Roman" w:hAnsi="Times New Roman"/>
-                <w:b w:val="false"/>
-                <w:bCs w:val="false"/>
-                <w:sz w:val="19"/>
-                <w:szCs w:val="19"/>
-              </w:rPr>
-              <w:t xml:space="preserve">MHXS bo‘yicha qadrsizlangan kreditlar rasmiy ko‘rsatkichdan «ikki-uch barobar» yuqori deyilgan.</w:t>
+                <w:rFonts w:ascii="Times New Roman" w:hAnsi="Times New Roman" w:eastAsia="Times New Roman" w:cs="Times New Roman"/>
+                <w:b w:val="false"/>
+                <w:bCs w:val="false"/>
+                <w:sz w:val="19"/>
+                <w:szCs w:val="19"/>
+              </w:rPr>
+              <w:t xml:space="preserve">MHXS bo‘yicha qadrsizlangan kreditlar rasmiy ko‘rsatkichdan “ikki-uch barobar” yuqori deyilgan.</w:t>
             </w:r>
           </w:p>
         </w:tc>
@@ -2705,7 +2705,7 @@
             </w:pPr>
             <w:r>
               <w:rPr>
-                <w:rFonts w:ascii="Times New Roman" w:cs="Times New Roman" w:eastAsia="Times New Roman" w:hAnsi="Times New Roman"/>
+                <w:rFonts w:ascii="Times New Roman" w:hAnsi="Times New Roman" w:eastAsia="Times New Roman" w:cs="Times New Roman"/>
                 <w:b w:val="false"/>
                 <w:bCs w:val="false"/>
                 <w:sz w:val="19"/>
@@ -2739,7 +2739,7 @@
             </w:pPr>
             <w:r>
               <w:rPr>
-                <w:rFonts w:ascii="Times New Roman" w:cs="Times New Roman" w:eastAsia="Times New Roman" w:hAnsi="Times New Roman"/>
+                <w:rFonts w:ascii="Times New Roman" w:hAnsi="Times New Roman" w:eastAsia="Times New Roman" w:cs="Times New Roman"/>
                 <w:b w:val="false"/>
                 <w:bCs w:val="false"/>
                 <w:sz w:val="19"/>
@@ -2770,7 +2770,7 @@
             <w:pPr/>
             <w:r>
               <w:rPr>
-                <w:rFonts w:ascii="Times New Roman" w:cs="Times New Roman" w:eastAsia="Times New Roman" w:hAnsi="Times New Roman"/>
+                <w:rFonts w:ascii="Times New Roman" w:hAnsi="Times New Roman" w:eastAsia="Times New Roman" w:cs="Times New Roman"/>
                 <w:b w:val="false"/>
                 <w:bCs w:val="false"/>
                 <w:color w:val="FF0000"/>
@@ -2809,7 +2809,7 @@
             </w:pPr>
             <w:r>
               <w:rPr>
-                <w:rFonts w:ascii="Times New Roman" w:cs="Times New Roman" w:eastAsia="Times New Roman" w:hAnsi="Times New Roman"/>
+                <w:rFonts w:ascii="Times New Roman" w:hAnsi="Times New Roman" w:eastAsia="Times New Roman" w:cs="Times New Roman"/>
                 <w:b w:val="false"/>
                 <w:bCs w:val="false"/>
                 <w:sz w:val="19"/>
@@ -2842,7 +2842,7 @@
             </w:pPr>
             <w:r>
               <w:rPr>
-                <w:rFonts w:ascii="Times New Roman" w:cs="Times New Roman" w:eastAsia="Times New Roman" w:hAnsi="Times New Roman"/>
+                <w:rFonts w:ascii="Times New Roman" w:hAnsi="Times New Roman" w:eastAsia="Times New Roman" w:cs="Times New Roman"/>
                 <w:b w:val="false"/>
                 <w:bCs w:val="false"/>
                 <w:sz w:val="19"/>
@@ -2875,7 +2875,7 @@
             </w:pPr>
             <w:r>
               <w:rPr>
-                <w:rFonts w:ascii="Times New Roman" w:cs="Times New Roman" w:eastAsia="Times New Roman" w:hAnsi="Times New Roman"/>
+                <w:rFonts w:ascii="Times New Roman" w:hAnsi="Times New Roman" w:eastAsia="Times New Roman" w:cs="Times New Roman"/>
                 <w:b w:val="false"/>
                 <w:bCs w:val="false"/>
                 <w:sz w:val="19"/>
@@ -2908,7 +2908,7 @@
             </w:pPr>
             <w:r>
               <w:rPr>
-                <w:rFonts w:ascii="Times New Roman" w:cs="Times New Roman" w:eastAsia="Times New Roman" w:hAnsi="Times New Roman"/>
+                <w:rFonts w:ascii="Times New Roman" w:hAnsi="Times New Roman" w:eastAsia="Times New Roman" w:cs="Times New Roman"/>
                 <w:b w:val="false"/>
                 <w:bCs w:val="false"/>
                 <w:sz w:val="19"/>
@@ -2941,7 +2941,7 @@
             </w:pPr>
             <w:r>
               <w:rPr>
-                <w:rFonts w:ascii="Times New Roman" w:cs="Times New Roman" w:eastAsia="Times New Roman" w:hAnsi="Times New Roman"/>
+                <w:rFonts w:ascii="Times New Roman" w:hAnsi="Times New Roman" w:eastAsia="Times New Roman" w:cs="Times New Roman"/>
                 <w:b w:val="false"/>
                 <w:bCs w:val="false"/>
                 <w:sz w:val="19"/>
@@ -2975,7 +2975,7 @@
             </w:pPr>
             <w:r>
               <w:rPr>
-                <w:rFonts w:ascii="Times New Roman" w:cs="Times New Roman" w:eastAsia="Times New Roman" w:hAnsi="Times New Roman"/>
+                <w:rFonts w:ascii="Times New Roman" w:hAnsi="Times New Roman" w:eastAsia="Times New Roman" w:cs="Times New Roman"/>
                 <w:b w:val="false"/>
                 <w:bCs w:val="false"/>
                 <w:sz w:val="19"/>
@@ -3006,7 +3006,7 @@
             <w:pPr/>
             <w:r>
               <w:rPr>
-                <w:rFonts w:ascii="Times New Roman" w:cs="Times New Roman" w:eastAsia="Times New Roman" w:hAnsi="Times New Roman"/>
+                <w:rFonts w:ascii="Times New Roman" w:hAnsi="Times New Roman" w:eastAsia="Times New Roman" w:cs="Times New Roman"/>
                 <w:b w:val="false"/>
                 <w:bCs w:val="false"/>
                 <w:color w:val="FF0000"/>
@@ -3045,7 +3045,7 @@
             </w:pPr>
             <w:r>
               <w:rPr>
-                <w:rFonts w:ascii="Times New Roman" w:cs="Times New Roman" w:eastAsia="Times New Roman" w:hAnsi="Times New Roman"/>
+                <w:rFonts w:ascii="Times New Roman" w:hAnsi="Times New Roman" w:eastAsia="Times New Roman" w:cs="Times New Roman"/>
                 <w:b w:val="false"/>
                 <w:bCs w:val="false"/>
                 <w:sz w:val="19"/>
@@ -3078,7 +3078,7 @@
             </w:pPr>
             <w:r>
               <w:rPr>
-                <w:rFonts w:ascii="Times New Roman" w:cs="Times New Roman" w:eastAsia="Times New Roman" w:hAnsi="Times New Roman"/>
+                <w:rFonts w:ascii="Times New Roman" w:hAnsi="Times New Roman" w:eastAsia="Times New Roman" w:cs="Times New Roman"/>
                 <w:b w:val="false"/>
                 <w:bCs w:val="false"/>
                 <w:sz w:val="19"/>
@@ -3111,7 +3111,7 @@
             </w:pPr>
             <w:r>
               <w:rPr>
-                <w:rFonts w:ascii="Times New Roman" w:cs="Times New Roman" w:eastAsia="Times New Roman" w:hAnsi="Times New Roman"/>
+                <w:rFonts w:ascii="Times New Roman" w:hAnsi="Times New Roman" w:eastAsia="Times New Roman" w:cs="Times New Roman"/>
                 <w:b w:val="false"/>
                 <w:bCs w:val="false"/>
                 <w:sz w:val="19"/>
@@ -3144,13 +3144,13 @@
             </w:pPr>
             <w:r>
               <w:rPr>
-                <w:rFonts w:ascii="Times New Roman" w:cs="Times New Roman" w:eastAsia="Times New Roman" w:hAnsi="Times New Roman"/>
-                <w:b w:val="false"/>
-                <w:bCs w:val="false"/>
-                <w:sz w:val="19"/>
-                <w:szCs w:val="19"/>
-              </w:rPr>
-              <w:t xml:space="preserve">BRB indeksi «zararlardan 3–4 chorak oldin» qizil zonaga tushgan deyilgan.</w:t>
+                <w:rFonts w:ascii="Times New Roman" w:hAnsi="Times New Roman" w:eastAsia="Times New Roman" w:cs="Times New Roman"/>
+                <w:b w:val="false"/>
+                <w:bCs w:val="false"/>
+                <w:sz w:val="19"/>
+                <w:szCs w:val="19"/>
+              </w:rPr>
+              <w:t xml:space="preserve">BRB indeksi “zararlardan 3–4 chorak oldin” qizil zonaga tushgan deyilgan.</w:t>
             </w:r>
           </w:p>
         </w:tc>
@@ -3177,7 +3177,7 @@
             </w:pPr>
             <w:r>
               <w:rPr>
-                <w:rFonts w:ascii="Times New Roman" w:cs="Times New Roman" w:eastAsia="Times New Roman" w:hAnsi="Times New Roman"/>
+                <w:rFonts w:ascii="Times New Roman" w:hAnsi="Times New Roman" w:eastAsia="Times New Roman" w:cs="Times New Roman"/>
                 <w:b w:val="false"/>
                 <w:bCs w:val="false"/>
                 <w:sz w:val="19"/>
@@ -3211,7 +3211,7 @@
             </w:pPr>
             <w:r>
               <w:rPr>
-                <w:rFonts w:ascii="Times New Roman" w:cs="Times New Roman" w:eastAsia="Times New Roman" w:hAnsi="Times New Roman"/>
+                <w:rFonts w:ascii="Times New Roman" w:hAnsi="Times New Roman" w:eastAsia="Times New Roman" w:cs="Times New Roman"/>
                 <w:b w:val="false"/>
                 <w:bCs w:val="false"/>
                 <w:sz w:val="19"/>
@@ -3242,7 +3242,7 @@
             <w:pPr/>
             <w:r>
               <w:rPr>
-                <w:rFonts w:ascii="Times New Roman" w:cs="Times New Roman" w:eastAsia="Times New Roman" w:hAnsi="Times New Roman"/>
+                <w:rFonts w:ascii="Times New Roman" w:hAnsi="Times New Roman" w:eastAsia="Times New Roman" w:cs="Times New Roman"/>
                 <w:b w:val="false"/>
                 <w:bCs w:val="false"/>
                 <w:color w:val="FF0000"/>
@@ -3281,7 +3281,7 @@
             </w:pPr>
             <w:r>
               <w:rPr>
-                <w:rFonts w:ascii="Times New Roman" w:cs="Times New Roman" w:eastAsia="Times New Roman" w:hAnsi="Times New Roman"/>
+                <w:rFonts w:ascii="Times New Roman" w:hAnsi="Times New Roman" w:eastAsia="Times New Roman" w:cs="Times New Roman"/>
                 <w:b w:val="false"/>
                 <w:bCs w:val="false"/>
                 <w:sz w:val="19"/>
@@ -3314,7 +3314,7 @@
             </w:pPr>
             <w:r>
               <w:rPr>
-                <w:rFonts w:ascii="Times New Roman" w:cs="Times New Roman" w:eastAsia="Times New Roman" w:hAnsi="Times New Roman"/>
+                <w:rFonts w:ascii="Times New Roman" w:hAnsi="Times New Roman" w:eastAsia="Times New Roman" w:cs="Times New Roman"/>
                 <w:b w:val="false"/>
                 <w:bCs w:val="false"/>
                 <w:sz w:val="19"/>
@@ -3347,7 +3347,7 @@
             </w:pPr>
             <w:r>
               <w:rPr>
-                <w:rFonts w:ascii="Times New Roman" w:cs="Times New Roman" w:eastAsia="Times New Roman" w:hAnsi="Times New Roman"/>
+                <w:rFonts w:ascii="Times New Roman" w:hAnsi="Times New Roman" w:eastAsia="Times New Roman" w:cs="Times New Roman"/>
                 <w:b w:val="false"/>
                 <w:bCs w:val="false"/>
                 <w:sz w:val="19"/>
@@ -3380,13 +3380,13 @@
             </w:pPr>
             <w:r>
               <w:rPr>
-                <w:rFonts w:ascii="Times New Roman" w:cs="Times New Roman" w:eastAsia="Times New Roman" w:hAnsi="Times New Roman"/>
-                <w:b w:val="false"/>
-                <w:bCs w:val="false"/>
-                <w:sz w:val="19"/>
-                <w:szCs w:val="19"/>
-              </w:rPr>
-              <w:t xml:space="preserve">SQB indeksi «sariq zonaning yuqori qismida (3,17–3,32)» deyilgan.</w:t>
+                <w:rFonts w:ascii="Times New Roman" w:hAnsi="Times New Roman" w:eastAsia="Times New Roman" w:cs="Times New Roman"/>
+                <w:b w:val="false"/>
+                <w:bCs w:val="false"/>
+                <w:sz w:val="19"/>
+                <w:szCs w:val="19"/>
+              </w:rPr>
+              <w:t xml:space="preserve">SQB indeksi “sariq zonaning yuqori qismida (3,17–3,32)” deyilgan.</w:t>
             </w:r>
           </w:p>
         </w:tc>
@@ -3413,7 +3413,7 @@
             </w:pPr>
             <w:r>
               <w:rPr>
-                <w:rFonts w:ascii="Times New Roman" w:cs="Times New Roman" w:eastAsia="Times New Roman" w:hAnsi="Times New Roman"/>
+                <w:rFonts w:ascii="Times New Roman" w:hAnsi="Times New Roman" w:eastAsia="Times New Roman" w:cs="Times New Roman"/>
                 <w:b w:val="false"/>
                 <w:bCs w:val="false"/>
                 <w:sz w:val="19"/>
@@ -3447,7 +3447,7 @@
             </w:pPr>
             <w:r>
               <w:rPr>
-                <w:rFonts w:ascii="Times New Roman" w:cs="Times New Roman" w:eastAsia="Times New Roman" w:hAnsi="Times New Roman"/>
+                <w:rFonts w:ascii="Times New Roman" w:hAnsi="Times New Roman" w:eastAsia="Times New Roman" w:cs="Times New Roman"/>
                 <w:b w:val="false"/>
                 <w:bCs w:val="false"/>
                 <w:sz w:val="19"/>
@@ -3478,7 +3478,7 @@
             <w:pPr/>
             <w:r>
               <w:rPr>
-                <w:rFonts w:ascii="Times New Roman" w:cs="Times New Roman" w:eastAsia="Times New Roman" w:hAnsi="Times New Roman"/>
+                <w:rFonts w:ascii="Times New Roman" w:hAnsi="Times New Roman" w:eastAsia="Times New Roman" w:cs="Times New Roman"/>
                 <w:b w:val="false"/>
                 <w:bCs w:val="false"/>
                 <w:color w:val="FF0000"/>
@@ -3517,7 +3517,7 @@
             </w:pPr>
             <w:r>
               <w:rPr>
-                <w:rFonts w:ascii="Times New Roman" w:cs="Times New Roman" w:eastAsia="Times New Roman" w:hAnsi="Times New Roman"/>
+                <w:rFonts w:ascii="Times New Roman" w:hAnsi="Times New Roman" w:eastAsia="Times New Roman" w:cs="Times New Roman"/>
                 <w:b w:val="false"/>
                 <w:bCs w:val="false"/>
                 <w:sz w:val="19"/>
@@ -3550,7 +3550,7 @@
             </w:pPr>
             <w:r>
               <w:rPr>
-                <w:rFonts w:ascii="Times New Roman" w:cs="Times New Roman" w:eastAsia="Times New Roman" w:hAnsi="Times New Roman"/>
+                <w:rFonts w:ascii="Times New Roman" w:hAnsi="Times New Roman" w:eastAsia="Times New Roman" w:cs="Times New Roman"/>
                 <w:b w:val="false"/>
                 <w:bCs w:val="false"/>
                 <w:sz w:val="19"/>
@@ -3583,7 +3583,7 @@
             </w:pPr>
             <w:r>
               <w:rPr>
-                <w:rFonts w:ascii="Times New Roman" w:cs="Times New Roman" w:eastAsia="Times New Roman" w:hAnsi="Times New Roman"/>
+                <w:rFonts w:ascii="Times New Roman" w:hAnsi="Times New Roman" w:eastAsia="Times New Roman" w:cs="Times New Roman"/>
                 <w:b w:val="false"/>
                 <w:bCs w:val="false"/>
                 <w:sz w:val="19"/>
@@ -3616,13 +3616,13 @@
             </w:pPr>
             <w:r>
               <w:rPr>
-                <w:rFonts w:ascii="Times New Roman" w:cs="Times New Roman" w:eastAsia="Times New Roman" w:hAnsi="Times New Roman"/>
-                <w:b w:val="false"/>
-                <w:bCs w:val="false"/>
-                <w:sz w:val="19"/>
-                <w:szCs w:val="19"/>
-              </w:rPr>
-              <w:t xml:space="preserve">Z-score bo‘yicha davlat banklari «2023–2025-yillarda» barqarorroq deyilgan.</w:t>
+                <w:rFonts w:ascii="Times New Roman" w:hAnsi="Times New Roman" w:eastAsia="Times New Roman" w:cs="Times New Roman"/>
+                <w:b w:val="false"/>
+                <w:bCs w:val="false"/>
+                <w:sz w:val="19"/>
+                <w:szCs w:val="19"/>
+              </w:rPr>
+              <w:t xml:space="preserve">Z-score bo‘yicha davlat banklari “2023–2025-yillarda” barqarorroq deyilgan.</w:t>
             </w:r>
           </w:p>
         </w:tc>
@@ -3649,7 +3649,7 @@
             </w:pPr>
             <w:r>
               <w:rPr>
-                <w:rFonts w:ascii="Times New Roman" w:cs="Times New Roman" w:eastAsia="Times New Roman" w:hAnsi="Times New Roman"/>
+                <w:rFonts w:ascii="Times New Roman" w:hAnsi="Times New Roman" w:eastAsia="Times New Roman" w:cs="Times New Roman"/>
                 <w:b w:val="false"/>
                 <w:bCs w:val="false"/>
                 <w:sz w:val="19"/>
@@ -3683,7 +3683,7 @@
             </w:pPr>
             <w:r>
               <w:rPr>
-                <w:rFonts w:ascii="Times New Roman" w:cs="Times New Roman" w:eastAsia="Times New Roman" w:hAnsi="Times New Roman"/>
+                <w:rFonts w:ascii="Times New Roman" w:hAnsi="Times New Roman" w:eastAsia="Times New Roman" w:cs="Times New Roman"/>
                 <w:b w:val="false"/>
                 <w:bCs w:val="false"/>
                 <w:sz w:val="19"/>
@@ -3714,7 +3714,7 @@
             <w:pPr/>
             <w:r>
               <w:rPr>
-                <w:rFonts w:ascii="Times New Roman" w:cs="Times New Roman" w:eastAsia="Times New Roman" w:hAnsi="Times New Roman"/>
+                <w:rFonts w:ascii="Times New Roman" w:hAnsi="Times New Roman" w:eastAsia="Times New Roman" w:cs="Times New Roman"/>
                 <w:b w:val="false"/>
                 <w:bCs w:val="false"/>
                 <w:color w:val="FF0000"/>
@@ -3753,7 +3753,7 @@
             </w:pPr>
             <w:r>
               <w:rPr>
-                <w:rFonts w:ascii="Times New Roman" w:cs="Times New Roman" w:eastAsia="Times New Roman" w:hAnsi="Times New Roman"/>
+                <w:rFonts w:ascii="Times New Roman" w:hAnsi="Times New Roman" w:eastAsia="Times New Roman" w:cs="Times New Roman"/>
                 <w:b w:val="false"/>
                 <w:bCs w:val="false"/>
                 <w:sz w:val="19"/>
@@ -3786,7 +3786,7 @@
             </w:pPr>
             <w:r>
               <w:rPr>
-                <w:rFonts w:ascii="Times New Roman" w:cs="Times New Roman" w:eastAsia="Times New Roman" w:hAnsi="Times New Roman"/>
+                <w:rFonts w:ascii="Times New Roman" w:hAnsi="Times New Roman" w:eastAsia="Times New Roman" w:cs="Times New Roman"/>
                 <w:b w:val="false"/>
                 <w:bCs w:val="false"/>
                 <w:sz w:val="19"/>
@@ -3819,7 +3819,7 @@
             </w:pPr>
             <w:r>
               <w:rPr>
-                <w:rFonts w:ascii="Times New Roman" w:cs="Times New Roman" w:eastAsia="Times New Roman" w:hAnsi="Times New Roman"/>
+                <w:rFonts w:ascii="Times New Roman" w:hAnsi="Times New Roman" w:eastAsia="Times New Roman" w:cs="Times New Roman"/>
                 <w:b w:val="false"/>
                 <w:bCs w:val="false"/>
                 <w:sz w:val="19"/>
@@ -3852,7 +3852,7 @@
             </w:pPr>
             <w:r>
               <w:rPr>
-                <w:rFonts w:ascii="Times New Roman" w:cs="Times New Roman" w:eastAsia="Times New Roman" w:hAnsi="Times New Roman"/>
+                <w:rFonts w:ascii="Times New Roman" w:hAnsi="Times New Roman" w:eastAsia="Times New Roman" w:cs="Times New Roman"/>
                 <w:b w:val="false"/>
                 <w:bCs w:val="false"/>
                 <w:sz w:val="19"/>
@@ -3885,13 +3885,13 @@
             </w:pPr>
             <w:r>
               <w:rPr>
-                <w:rFonts w:ascii="Times New Roman" w:cs="Times New Roman" w:eastAsia="Times New Roman" w:hAnsi="Times New Roman"/>
-                <w:b w:val="false"/>
-                <w:bCs w:val="false"/>
-                <w:sz w:val="19"/>
-                <w:szCs w:val="19"/>
-              </w:rPr>
-              <w:t xml:space="preserve">3.3.1-rasmdagi 2021-yilgi 0,61 farq faqat «Ipoteka-bank» xususiylashtirilgunga qadar davlat banki deb olinganda chiqadi. Demak, davlat banki belgisi vaqt bo‘yicha o‘zgaradi. Shunda 3.3.3-jadval izohidagi «vaqt bo‘yicha o‘zgarmaydi» degan fikr ham aniqlashtirilishi kerak.</w:t>
+                <w:rFonts w:ascii="Times New Roman" w:hAnsi="Times New Roman" w:eastAsia="Times New Roman" w:cs="Times New Roman"/>
+                <w:b w:val="false"/>
+                <w:bCs w:val="false"/>
+                <w:sz w:val="19"/>
+                <w:szCs w:val="19"/>
+              </w:rPr>
+              <w:t xml:space="preserve">3.3.1-rasmdagi 2021-yilgi 0,61 farq faqat “Ipoteka-bank” xususiylashtirilgunga qadar davlat banki deb olinganda chiqadi. Demak, davlat banki belgisi vaqt bo‘yicha o‘zgaradi. Shunda 3.3.3-jadval izohidagi “vaqt bo‘yicha o‘zgarmaydi” degan fikr ham aniqlashtirilishi kerak.</w:t>
             </w:r>
           </w:p>
         </w:tc>
@@ -3919,7 +3919,7 @@
             </w:pPr>
             <w:r>
               <w:rPr>
-                <w:rFonts w:ascii="Times New Roman" w:cs="Times New Roman" w:eastAsia="Times New Roman" w:hAnsi="Times New Roman"/>
+                <w:rFonts w:ascii="Times New Roman" w:hAnsi="Times New Roman" w:eastAsia="Times New Roman" w:cs="Times New Roman"/>
                 <w:b w:val="false"/>
                 <w:bCs w:val="false"/>
                 <w:sz w:val="19"/>
@@ -3950,14 +3950,14 @@
             <w:pPr/>
             <w:r>
               <w:rPr>
-                <w:rFonts w:ascii="Times New Roman" w:cs="Times New Roman" w:eastAsia="Times New Roman" w:hAnsi="Times New Roman"/>
+                <w:rFonts w:ascii="Times New Roman" w:hAnsi="Times New Roman" w:eastAsia="Times New Roman" w:cs="Times New Roman"/>
                 <w:b w:val="false"/>
                 <w:bCs w:val="false"/>
                 <w:color w:val="FF0000"/>
                 <w:sz w:val="19"/>
                 <w:szCs w:val="19"/>
               </w:rPr>
-              <w:t xml:space="preserve">Tuzatildi. Tasdiqlandi: panelda «Ipoteka-bank» ATB 2023-yil II chorakgacha davlat banki (D=1), III chorakdan xususiy. 3.3.3-jadval izohi aniqlashtirildi («deyarli o‘zgarmaydi; faqat Ipoteka-bankda 2023-y. III chorakda o‘zgargan»).</w:t>
+              <w:t xml:space="preserve">Tuzatildi. Tasdiqlandi: panelda “Ipoteka-bank” ATB 2023-yil II chorakgacha davlat banki (D=1), III chorakdan xususiy. 3.3.3-jadval izohi aniqlashtirildi (“deyarli o‘zgarmaydi; faqat Ipoteka-bankda 2023-y. III chorakda o‘zgargan”).</w:t>
             </w:r>
           </w:p>
         </w:tc>
@@ -3989,7 +3989,7 @@
             </w:pPr>
             <w:r>
               <w:rPr>
-                <w:rFonts w:ascii="Times New Roman" w:cs="Times New Roman" w:eastAsia="Times New Roman" w:hAnsi="Times New Roman"/>
+                <w:rFonts w:ascii="Times New Roman" w:hAnsi="Times New Roman" w:eastAsia="Times New Roman" w:cs="Times New Roman"/>
                 <w:b w:val="false"/>
                 <w:bCs w:val="false"/>
                 <w:sz w:val="19"/>
@@ -4022,7 +4022,7 @@
             </w:pPr>
             <w:r>
               <w:rPr>
-                <w:rFonts w:ascii="Times New Roman" w:cs="Times New Roman" w:eastAsia="Times New Roman" w:hAnsi="Times New Roman"/>
+                <w:rFonts w:ascii="Times New Roman" w:hAnsi="Times New Roman" w:eastAsia="Times New Roman" w:cs="Times New Roman"/>
                 <w:b w:val="false"/>
                 <w:bCs w:val="false"/>
                 <w:sz w:val="19"/>
@@ -4055,7 +4055,7 @@
             </w:pPr>
             <w:r>
               <w:rPr>
-                <w:rFonts w:ascii="Times New Roman" w:cs="Times New Roman" w:eastAsia="Times New Roman" w:hAnsi="Times New Roman"/>
+                <w:rFonts w:ascii="Times New Roman" w:hAnsi="Times New Roman" w:eastAsia="Times New Roman" w:cs="Times New Roman"/>
                 <w:b w:val="false"/>
                 <w:bCs w:val="false"/>
                 <w:sz w:val="19"/>
@@ -4088,13 +4088,13 @@
             </w:pPr>
             <w:r>
               <w:rPr>
-                <w:rFonts w:ascii="Times New Roman" w:cs="Times New Roman" w:eastAsia="Times New Roman" w:hAnsi="Times New Roman"/>
-                <w:b w:val="false"/>
-                <w:bCs w:val="false"/>
-                <w:sz w:val="19"/>
-                <w:szCs w:val="19"/>
-              </w:rPr>
-              <w:t xml:space="preserve">«13% … 3% lik saqlash buferi» deyilgan, keyingi qatorda esa «Kapitalni saqlash buferi 2,5%, 2025-yildan». Yangi nizom esa 2026-yildan amal qiladi.</w:t>
+                <w:rFonts w:ascii="Times New Roman" w:hAnsi="Times New Roman" w:eastAsia="Times New Roman" w:cs="Times New Roman"/>
+                <w:b w:val="false"/>
+                <w:bCs w:val="false"/>
+                <w:sz w:val="19"/>
+                <w:szCs w:val="19"/>
+              </w:rPr>
+              <w:t xml:space="preserve">“13% … 3% lik saqlash buferi” deyilgan, keyingi qatorda esa “Kapitalni saqlash buferi 2,5%, 2025-yildan”. Yangi nizom esa 2026-yildan amal qiladi.</w:t>
             </w:r>
           </w:p>
         </w:tc>
@@ -4121,7 +4121,7 @@
             </w:pPr>
             <w:r>
               <w:rPr>
-                <w:rFonts w:ascii="Times New Roman" w:cs="Times New Roman" w:eastAsia="Times New Roman" w:hAnsi="Times New Roman"/>
+                <w:rFonts w:ascii="Times New Roman" w:hAnsi="Times New Roman" w:eastAsia="Times New Roman" w:cs="Times New Roman"/>
                 <w:b w:val="false"/>
                 <w:bCs w:val="false"/>
                 <w:sz w:val="19"/>
@@ -4155,7 +4155,7 @@
             </w:pPr>
             <w:r>
               <w:rPr>
-                <w:rFonts w:ascii="Times New Roman" w:cs="Times New Roman" w:eastAsia="Times New Roman" w:hAnsi="Times New Roman"/>
+                <w:rFonts w:ascii="Times New Roman" w:hAnsi="Times New Roman" w:eastAsia="Times New Roman" w:cs="Times New Roman"/>
                 <w:b w:val="false"/>
                 <w:bCs w:val="false"/>
                 <w:sz w:val="19"/>
@@ -4186,14 +4186,14 @@
             <w:pPr/>
             <w:r>
               <w:rPr>
-                <w:rFonts w:ascii="Times New Roman" w:cs="Times New Roman" w:eastAsia="Times New Roman" w:hAnsi="Times New Roman"/>
+                <w:rFonts w:ascii="Times New Roman" w:hAnsi="Times New Roman" w:eastAsia="Times New Roman" w:cs="Times New Roman"/>
                 <w:b w:val="false"/>
                 <w:bCs w:val="false"/>
                 <w:color w:val="FF0000"/>
                 <w:sz w:val="19"/>
                 <w:szCs w:val="19"/>
               </w:rPr>
-              <w:t xml:space="preserve">Tuzatildi. Hal qilindi: 2.1.1-jadval Markaziy bankning 2025-yil moliyaviy barqarorlik sharhi (1-jadval, 129-b.) va SQB ning 22-jadval shakli bo‘yicha qayta yozildi: 2025-yilgacha CET1 8%, jami 13% (3% bufer bilan), leverej 6%; 2026-yildan 4,5% / 8% / 3% + buferlar (CCoB 2,5%, CCyB 1,5%, D-SIB 1%). «HLA/aktivlar ≥ 10%» qatori qo‘shildi. 2.1-§ stress-test chegaralari aniqlashtirildi. Yangi ilmiy natija qo‘shildi (2.3-§): 2026-yildan D-SIB uchun 9,5% CET1 talabiga nisbatan SQB milliy hisobot bo‘yicha +0,71 p.p. yuqori, MHXS bo‘yicha −0,63 p.p. past.</w:t>
+              <w:t xml:space="preserve">Tuzatildi. Hal qilindi: 2.1.1-jadval Markaziy bankning 2025-yil moliyaviy barqarorlik sharhi (1-jadval, 129-b.) va SQB ning 22-jadval shakli bo‘yicha qayta yozildi: 2025-yilgacha CET1 8%, jami 13% (3% bufer bilan), leverej 6%; 2026-yildan 4,5% / 8% / 3% + buferlar (CCoB 2,5%, CCyB 1,5%, D-SIB 1%). “HLA/aktivlar ≥ 10%” qatori qo‘shildi. 2.1-§ stress-test chegaralari aniqlashtirildi. Yangi ilmiy natija qo‘shildi (2.3-§): 2026-yildan D-SIB uchun 9,5% CET1 talabiga nisbatan SQB milliy hisobot bo‘yicha +0,71 p.p. yuqori, MHXS bo‘yicha −0,63 p.p. past.</w:t>
             </w:r>
           </w:p>
         </w:tc>
@@ -4225,7 +4225,7 @@
             </w:pPr>
             <w:r>
               <w:rPr>
-                <w:rFonts w:ascii="Times New Roman" w:cs="Times New Roman" w:eastAsia="Times New Roman" w:hAnsi="Times New Roman"/>
+                <w:rFonts w:ascii="Times New Roman" w:hAnsi="Times New Roman" w:eastAsia="Times New Roman" w:cs="Times New Roman"/>
                 <w:b w:val="false"/>
                 <w:bCs w:val="false"/>
                 <w:sz w:val="19"/>
@@ -4258,7 +4258,7 @@
             </w:pPr>
             <w:r>
               <w:rPr>
-                <w:rFonts w:ascii="Times New Roman" w:cs="Times New Roman" w:eastAsia="Times New Roman" w:hAnsi="Times New Roman"/>
+                <w:rFonts w:ascii="Times New Roman" w:hAnsi="Times New Roman" w:eastAsia="Times New Roman" w:cs="Times New Roman"/>
                 <w:b w:val="false"/>
                 <w:bCs w:val="false"/>
                 <w:sz w:val="19"/>
@@ -4291,7 +4291,7 @@
             </w:pPr>
             <w:r>
               <w:rPr>
-                <w:rFonts w:ascii="Times New Roman" w:cs="Times New Roman" w:eastAsia="Times New Roman" w:hAnsi="Times New Roman"/>
+                <w:rFonts w:ascii="Times New Roman" w:hAnsi="Times New Roman" w:eastAsia="Times New Roman" w:cs="Times New Roman"/>
                 <w:b w:val="false"/>
                 <w:bCs w:val="false"/>
                 <w:sz w:val="19"/>
@@ -4324,13 +4324,13 @@
             </w:pPr>
             <w:r>
               <w:rPr>
-                <w:rFonts w:ascii="Times New Roman" w:cs="Times New Roman" w:eastAsia="Times New Roman" w:hAnsi="Times New Roman"/>
-                <w:b w:val="false"/>
-                <w:bCs w:val="false"/>
-                <w:sz w:val="19"/>
-                <w:szCs w:val="19"/>
-              </w:rPr>
-              <w:t xml:space="preserve">«Garant bank» uchun ijobiy ssenariy, 2027: «3,25 (sariq)». Qoidaga ko‘ra 3,25 va undan yuqori qiymat yashil zonaga kiradi.</w:t>
+                <w:rFonts w:ascii="Times New Roman" w:hAnsi="Times New Roman" w:eastAsia="Times New Roman" w:cs="Times New Roman"/>
+                <w:b w:val="false"/>
+                <w:bCs w:val="false"/>
+                <w:sz w:val="19"/>
+                <w:szCs w:val="19"/>
+              </w:rPr>
+              <w:t xml:space="preserve">“Garant bank” uchun ijobiy ssenariy, 2027: “3,25 (sariq)”. Qoidaga ko‘ra 3,25 va undan yuqori qiymat yashil zonaga kiradi.</w:t>
             </w:r>
           </w:p>
         </w:tc>
@@ -4357,7 +4357,7 @@
             </w:pPr>
             <w:r>
               <w:rPr>
-                <w:rFonts w:ascii="Times New Roman" w:cs="Times New Roman" w:eastAsia="Times New Roman" w:hAnsi="Times New Roman"/>
+                <w:rFonts w:ascii="Times New Roman" w:hAnsi="Times New Roman" w:eastAsia="Times New Roman" w:cs="Times New Roman"/>
                 <w:b w:val="false"/>
                 <w:bCs w:val="false"/>
                 <w:sz w:val="19"/>
@@ -4391,7 +4391,7 @@
             </w:pPr>
             <w:r>
               <w:rPr>
-                <w:rFonts w:ascii="Times New Roman" w:cs="Times New Roman" w:eastAsia="Times New Roman" w:hAnsi="Times New Roman"/>
+                <w:rFonts w:ascii="Times New Roman" w:hAnsi="Times New Roman" w:eastAsia="Times New Roman" w:cs="Times New Roman"/>
                 <w:b w:val="false"/>
                 <w:bCs w:val="false"/>
                 <w:sz w:val="19"/>
@@ -4422,14 +4422,14 @@
             <w:pPr/>
             <w:r>
               <w:rPr>
-                <w:rFonts w:ascii="Times New Roman" w:cs="Times New Roman" w:eastAsia="Times New Roman" w:hAnsi="Times New Roman"/>
+                <w:rFonts w:ascii="Times New Roman" w:hAnsi="Times New Roman" w:eastAsia="Times New Roman" w:cs="Times New Roman"/>
                 <w:b w:val="false"/>
                 <w:bCs w:val="false"/>
                 <w:color w:val="FF0000"/>
                 <w:sz w:val="19"/>
                 <w:szCs w:val="19"/>
               </w:rPr>
-              <w:t xml:space="preserve">Tuzatildi. Hal qilindi: Garant bank (ijobiy, 2027) aniq qiymati 3,248 → «3,248 (sariq)»; chegaraga yaqin boshqa qiymatlar ham uch xonada (Davr bank 3,251; Tenge bank 3,252; Xalq banki 3,254); 7-ilova izohiga qoida qo‘shildi.</w:t>
+              <w:t xml:space="preserve">Tuzatildi. Hal qilindi: Garant bank (ijobiy, 2027) aniq qiymati 3,248 → “3,248 (sariq)”; chegaraga yaqin boshqa qiymatlar ham uch xonada (Davr bank 3,251; Tenge bank 3,252; Xalq banki 3,254); 7-ilova izohiga qoida qo‘shildi.</w:t>
             </w:r>
           </w:p>
         </w:tc>
@@ -4461,7 +4461,7 @@
             </w:pPr>
             <w:r>
               <w:rPr>
-                <w:rFonts w:ascii="Times New Roman" w:cs="Times New Roman" w:eastAsia="Times New Roman" w:hAnsi="Times New Roman"/>
+                <w:rFonts w:ascii="Times New Roman" w:hAnsi="Times New Roman" w:eastAsia="Times New Roman" w:cs="Times New Roman"/>
                 <w:b w:val="false"/>
                 <w:bCs w:val="false"/>
                 <w:sz w:val="19"/>
@@ -4494,7 +4494,7 @@
             </w:pPr>
             <w:r>
               <w:rPr>
-                <w:rFonts w:ascii="Times New Roman" w:cs="Times New Roman" w:eastAsia="Times New Roman" w:hAnsi="Times New Roman"/>
+                <w:rFonts w:ascii="Times New Roman" w:hAnsi="Times New Roman" w:eastAsia="Times New Roman" w:cs="Times New Roman"/>
                 <w:b w:val="false"/>
                 <w:bCs w:val="false"/>
                 <w:sz w:val="19"/>
@@ -4527,7 +4527,7 @@
             </w:pPr>
             <w:r>
               <w:rPr>
-                <w:rFonts w:ascii="Times New Roman" w:cs="Times New Roman" w:eastAsia="Times New Roman" w:hAnsi="Times New Roman"/>
+                <w:rFonts w:ascii="Times New Roman" w:hAnsi="Times New Roman" w:eastAsia="Times New Roman" w:cs="Times New Roman"/>
                 <w:b w:val="false"/>
                 <w:bCs w:val="false"/>
                 <w:sz w:val="19"/>
@@ -4560,13 +4560,13 @@
             </w:pPr>
             <w:r>
               <w:rPr>
-                <w:rFonts w:ascii="Times New Roman" w:cs="Times New Roman" w:eastAsia="Times New Roman" w:hAnsi="Times New Roman"/>
-                <w:b w:val="false"/>
-                <w:bCs w:val="false"/>
-                <w:sz w:val="19"/>
-                <w:szCs w:val="19"/>
-              </w:rPr>
-              <w:t xml:space="preserve">Izohda «–» – byulletenda ma’lumot berilmagan» deyilgan, lekin jadvalda «–» belgisi yo‘q.</w:t>
+                <w:rFonts w:ascii="Times New Roman" w:hAnsi="Times New Roman" w:eastAsia="Times New Roman" w:cs="Times New Roman"/>
+                <w:b w:val="false"/>
+                <w:bCs w:val="false"/>
+                <w:sz w:val="19"/>
+                <w:szCs w:val="19"/>
+              </w:rPr>
+              <w:t xml:space="preserve">Izohda “–” – byulletenda ma’lumot berilmagan” deyilgan, lekin jadvalda “–” belgisi yo‘q.</w:t>
             </w:r>
           </w:p>
         </w:tc>
@@ -4593,7 +4593,7 @@
             </w:pPr>
             <w:r>
               <w:rPr>
-                <w:rFonts w:ascii="Times New Roman" w:cs="Times New Roman" w:eastAsia="Times New Roman" w:hAnsi="Times New Roman"/>
+                <w:rFonts w:ascii="Times New Roman" w:hAnsi="Times New Roman" w:eastAsia="Times New Roman" w:cs="Times New Roman"/>
                 <w:b w:val="false"/>
                 <w:bCs w:val="false"/>
                 <w:sz w:val="19"/>
@@ -4627,7 +4627,7 @@
             </w:pPr>
             <w:r>
               <w:rPr>
-                <w:rFonts w:ascii="Times New Roman" w:cs="Times New Roman" w:eastAsia="Times New Roman" w:hAnsi="Times New Roman"/>
+                <w:rFonts w:ascii="Times New Roman" w:hAnsi="Times New Roman" w:eastAsia="Times New Roman" w:cs="Times New Roman"/>
                 <w:b w:val="false"/>
                 <w:bCs w:val="false"/>
                 <w:sz w:val="19"/>
@@ -4658,14 +4658,14 @@
             <w:pPr/>
             <w:r>
               <w:rPr>
-                <w:rFonts w:ascii="Times New Roman" w:cs="Times New Roman" w:eastAsia="Times New Roman" w:hAnsi="Times New Roman"/>
+                <w:rFonts w:ascii="Times New Roman" w:hAnsi="Times New Roman" w:eastAsia="Times New Roman" w:cs="Times New Roman"/>
                 <w:b w:val="false"/>
                 <w:bCs w:val="false"/>
                 <w:color w:val="FF0000"/>
                 <w:sz w:val="19"/>
                 <w:szCs w:val="19"/>
               </w:rPr>
-              <w:t xml:space="preserve">Tuzatildi. Hal qilindi: noto‘g‘ri izoh o‘rniga «substandart va muammoli kreditlar ulushi 2024–2025-yillar uchun manbada butun songacha yaxlitlangan» izohi yozildi.</w:t>
+              <w:t xml:space="preserve">Tuzatildi. Hal qilindi: noto‘g‘ri izoh o‘rniga “substandart va muammoli kreditlar ulushi 2024–2025-yillar uchun manbada butun songacha yaxlitlangan” izohi yozildi.</w:t>
             </w:r>
           </w:p>
         </w:tc>
@@ -4697,7 +4697,7 @@
             </w:pPr>
             <w:r>
               <w:rPr>
-                <w:rFonts w:ascii="Times New Roman" w:cs="Times New Roman" w:eastAsia="Times New Roman" w:hAnsi="Times New Roman"/>
+                <w:rFonts w:ascii="Times New Roman" w:hAnsi="Times New Roman" w:eastAsia="Times New Roman" w:cs="Times New Roman"/>
                 <w:b w:val="false"/>
                 <w:bCs w:val="false"/>
                 <w:sz w:val="19"/>
@@ -4730,7 +4730,7 @@
             </w:pPr>
             <w:r>
               <w:rPr>
-                <w:rFonts w:ascii="Times New Roman" w:cs="Times New Roman" w:eastAsia="Times New Roman" w:hAnsi="Times New Roman"/>
+                <w:rFonts w:ascii="Times New Roman" w:hAnsi="Times New Roman" w:eastAsia="Times New Roman" w:cs="Times New Roman"/>
                 <w:b w:val="false"/>
                 <w:bCs w:val="false"/>
                 <w:sz w:val="19"/>
@@ -4763,7 +4763,7 @@
             </w:pPr>
             <w:r>
               <w:rPr>
-                <w:rFonts w:ascii="Times New Roman" w:cs="Times New Roman" w:eastAsia="Times New Roman" w:hAnsi="Times New Roman"/>
+                <w:rFonts w:ascii="Times New Roman" w:hAnsi="Times New Roman" w:eastAsia="Times New Roman" w:cs="Times New Roman"/>
                 <w:b w:val="false"/>
                 <w:bCs w:val="false"/>
                 <w:sz w:val="19"/>
@@ -4796,13 +4796,13 @@
             </w:pPr>
             <w:r>
               <w:rPr>
-                <w:rFonts w:ascii="Times New Roman" w:cs="Times New Roman" w:eastAsia="Times New Roman" w:hAnsi="Times New Roman"/>
-                <w:b w:val="false"/>
-                <w:bCs w:val="false"/>
-                <w:sz w:val="19"/>
-                <w:szCs w:val="19"/>
-              </w:rPr>
-              <w:t xml:space="preserve">«Asosiy stavka, kurs va inflyatsiya 3.3-§ da statistik ahamiyatsiz chiqqan» deyilgan. Holbuki 3.3.6-jadvalda stavka */**, kurs Pooled modelda *** bilan ahamiyatli, 3.3.7-jadvalda H5 «tasdiqlandi».</w:t>
+                <w:rFonts w:ascii="Times New Roman" w:hAnsi="Times New Roman" w:eastAsia="Times New Roman" w:cs="Times New Roman"/>
+                <w:b w:val="false"/>
+                <w:bCs w:val="false"/>
+                <w:sz w:val="19"/>
+                <w:szCs w:val="19"/>
+              </w:rPr>
+              <w:t xml:space="preserve">“Asosiy stavka, kurs va inflyatsiya 3.3-§ da statistik ahamiyatsiz chiqqan” deyilgan. Holbuki 3.3.6-jadvalda stavka */**, kurs Pooled modelda *** bilan ahamiyatli, 3.3.7-jadvalda H5 “tasdiqlandi”.</w:t>
             </w:r>
           </w:p>
         </w:tc>
@@ -4829,7 +4829,7 @@
             </w:pPr>
             <w:r>
               <w:rPr>
-                <w:rFonts w:ascii="Times New Roman" w:cs="Times New Roman" w:eastAsia="Times New Roman" w:hAnsi="Times New Roman"/>
+                <w:rFonts w:ascii="Times New Roman" w:hAnsi="Times New Roman" w:eastAsia="Times New Roman" w:cs="Times New Roman"/>
                 <w:b w:val="false"/>
                 <w:bCs w:val="false"/>
                 <w:sz w:val="19"/>
@@ -4863,7 +4863,7 @@
             </w:pPr>
             <w:r>
               <w:rPr>
-                <w:rFonts w:ascii="Times New Roman" w:cs="Times New Roman" w:eastAsia="Times New Roman" w:hAnsi="Times New Roman"/>
+                <w:rFonts w:ascii="Times New Roman" w:hAnsi="Times New Roman" w:eastAsia="Times New Roman" w:cs="Times New Roman"/>
                 <w:b w:val="false"/>
                 <w:bCs w:val="false"/>
                 <w:sz w:val="19"/>
@@ -4894,7 +4894,7 @@
             <w:pPr/>
             <w:r>
               <w:rPr>
-                <w:rFonts w:ascii="Times New Roman" w:cs="Times New Roman" w:eastAsia="Times New Roman" w:hAnsi="Times New Roman"/>
+                <w:rFonts w:ascii="Times New Roman" w:hAnsi="Times New Roman" w:eastAsia="Times New Roman" w:cs="Times New Roman"/>
                 <w:b w:val="false"/>
                 <w:bCs w:val="false"/>
                 <w:color w:val="FF0000"/>
@@ -4933,7 +4933,7 @@
             </w:pPr>
             <w:r>
               <w:rPr>
-                <w:rFonts w:ascii="Times New Roman" w:cs="Times New Roman" w:eastAsia="Times New Roman" w:hAnsi="Times New Roman"/>
+                <w:rFonts w:ascii="Times New Roman" w:hAnsi="Times New Roman" w:eastAsia="Times New Roman" w:cs="Times New Roman"/>
                 <w:b w:val="false"/>
                 <w:bCs w:val="false"/>
                 <w:sz w:val="19"/>
@@ -4966,7 +4966,7 @@
             </w:pPr>
             <w:r>
               <w:rPr>
-                <w:rFonts w:ascii="Times New Roman" w:cs="Times New Roman" w:eastAsia="Times New Roman" w:hAnsi="Times New Roman"/>
+                <w:rFonts w:ascii="Times New Roman" w:hAnsi="Times New Roman" w:eastAsia="Times New Roman" w:cs="Times New Roman"/>
                 <w:b w:val="false"/>
                 <w:bCs w:val="false"/>
                 <w:sz w:val="19"/>
@@ -4999,7 +4999,7 @@
             </w:pPr>
             <w:r>
               <w:rPr>
-                <w:rFonts w:ascii="Times New Roman" w:cs="Times New Roman" w:eastAsia="Times New Roman" w:hAnsi="Times New Roman"/>
+                <w:rFonts w:ascii="Times New Roman" w:hAnsi="Times New Roman" w:eastAsia="Times New Roman" w:cs="Times New Roman"/>
                 <w:b w:val="false"/>
                 <w:bCs w:val="false"/>
                 <w:sz w:val="19"/>
@@ -5032,7 +5032,7 @@
             </w:pPr>
             <w:r>
               <w:rPr>
-                <w:rFonts w:ascii="Times New Roman" w:cs="Times New Roman" w:eastAsia="Times New Roman" w:hAnsi="Times New Roman"/>
+                <w:rFonts w:ascii="Times New Roman" w:hAnsi="Times New Roman" w:eastAsia="Times New Roman" w:cs="Times New Roman"/>
                 <w:b w:val="false"/>
                 <w:bCs w:val="false"/>
                 <w:sz w:val="19"/>
@@ -5065,13 +5065,13 @@
             </w:pPr>
             <w:r>
               <w:rPr>
-                <w:rFonts w:ascii="Times New Roman" w:cs="Times New Roman" w:eastAsia="Times New Roman" w:hAnsi="Times New Roman"/>
-                <w:b w:val="false"/>
-                <w:bCs w:val="false"/>
-                <w:sz w:val="19"/>
-                <w:szCs w:val="19"/>
-              </w:rPr>
-              <w:t xml:space="preserve">Ikkala paragrafga izoh qo‘shildi. Tavsiya: 3.3.6-jadvaldagi makro koeffitsiyentlarni uzoqroq qator asosida qayta baholang yoki ularni «indikativ» deb belgilang.</w:t>
+                <w:rFonts w:ascii="Times New Roman" w:hAnsi="Times New Roman" w:eastAsia="Times New Roman" w:cs="Times New Roman"/>
+                <w:b w:val="false"/>
+                <w:bCs w:val="false"/>
+                <w:sz w:val="19"/>
+                <w:szCs w:val="19"/>
+              </w:rPr>
+              <w:t xml:space="preserve">Ikkala paragrafga izoh qo‘shildi. Tavsiya: 3.3.6-jadvaldagi makro koeffitsiyentlarni uzoqroq qator asosida qayta baholang yoki ularni “indikativ” deb belgilang.</w:t>
             </w:r>
           </w:p>
         </w:tc>
@@ -5099,7 +5099,7 @@
             </w:pPr>
             <w:r>
               <w:rPr>
-                <w:rFonts w:ascii="Times New Roman" w:cs="Times New Roman" w:eastAsia="Times New Roman" w:hAnsi="Times New Roman"/>
+                <w:rFonts w:ascii="Times New Roman" w:hAnsi="Times New Roman" w:eastAsia="Times New Roman" w:cs="Times New Roman"/>
                 <w:b w:val="false"/>
                 <w:bCs w:val="false"/>
                 <w:sz w:val="19"/>
@@ -5130,14 +5130,14 @@
             <w:pPr/>
             <w:r>
               <w:rPr>
-                <w:rFonts w:ascii="Times New Roman" w:cs="Times New Roman" w:eastAsia="Times New Roman" w:hAnsi="Times New Roman"/>
+                <w:rFonts w:ascii="Times New Roman" w:hAnsi="Times New Roman" w:eastAsia="Times New Roman" w:cs="Times New Roman"/>
                 <w:b w:val="false"/>
                 <w:bCs w:val="false"/>
                 <w:color w:val="FF0000"/>
                 <w:sz w:val="19"/>
                 <w:szCs w:val="19"/>
               </w:rPr>
-              <w:t xml:space="preserve">Tuzatildi. To‘liq hal qilindi: 3.3.6-jadval izohiga makro koeffitsiyentlar 8 ta vaqt nuqtasidan aniqlangani va «indikativ» ekani, prognozda 4.2-§ dagi uzunroq qator bahosi qo‘llanishi yozildi (taqrizchi izohlari bilan birga).</w:t>
+              <w:t xml:space="preserve">Tuzatildi. To‘liq hal qilindi: 3.3.6-jadval izohiga makro koeffitsiyentlar 8 ta vaqt nuqtasidan aniqlangani va “indikativ” ekani, prognozda 4.2-§ dagi uzunroq qator bahosi qo‘llanishi yozildi (taqrizchi izohlari bilan birga).</w:t>
             </w:r>
           </w:p>
         </w:tc>
@@ -5169,7 +5169,7 @@
             </w:pPr>
             <w:r>
               <w:rPr>
-                <w:rFonts w:ascii="Times New Roman" w:cs="Times New Roman" w:eastAsia="Times New Roman" w:hAnsi="Times New Roman"/>
+                <w:rFonts w:ascii="Times New Roman" w:hAnsi="Times New Roman" w:eastAsia="Times New Roman" w:cs="Times New Roman"/>
                 <w:b w:val="false"/>
                 <w:bCs w:val="false"/>
                 <w:sz w:val="19"/>
@@ -5202,7 +5202,7 @@
             </w:pPr>
             <w:r>
               <w:rPr>
-                <w:rFonts w:ascii="Times New Roman" w:cs="Times New Roman" w:eastAsia="Times New Roman" w:hAnsi="Times New Roman"/>
+                <w:rFonts w:ascii="Times New Roman" w:hAnsi="Times New Roman" w:eastAsia="Times New Roman" w:cs="Times New Roman"/>
                 <w:b w:val="false"/>
                 <w:bCs w:val="false"/>
                 <w:sz w:val="19"/>
@@ -5235,7 +5235,7 @@
             </w:pPr>
             <w:r>
               <w:rPr>
-                <w:rFonts w:ascii="Times New Roman" w:cs="Times New Roman" w:eastAsia="Times New Roman" w:hAnsi="Times New Roman"/>
+                <w:rFonts w:ascii="Times New Roman" w:hAnsi="Times New Roman" w:eastAsia="Times New Roman" w:cs="Times New Roman"/>
                 <w:b w:val="false"/>
                 <w:bCs w:val="false"/>
                 <w:sz w:val="19"/>
@@ -5268,13 +5268,13 @@
             </w:pPr>
             <w:r>
               <w:rPr>
-                <w:rFonts w:ascii="Times New Roman" w:cs="Times New Roman" w:eastAsia="Times New Roman" w:hAnsi="Times New Roman"/>
-                <w:b w:val="false"/>
-                <w:bCs w:val="false"/>
-                <w:sz w:val="19"/>
-                <w:szCs w:val="19"/>
-              </w:rPr>
-              <w:t xml:space="preserve">«Ikki mustaqil model to‘rt chorakdan keyin bir xil natija berdi» deyilgan. Aslida 2-model lagsiz YaIM(t) bilan baholangan, tizim darajasidagi lagsiz model esa ahamiyatsiz chiqqan.</w:t>
+                <w:rFonts w:ascii="Times New Roman" w:hAnsi="Times New Roman" w:eastAsia="Times New Roman" w:cs="Times New Roman"/>
+                <w:b w:val="false"/>
+                <w:bCs w:val="false"/>
+                <w:sz w:val="19"/>
+                <w:szCs w:val="19"/>
+              </w:rPr>
+              <w:t xml:space="preserve">“Ikki mustaqil model to‘rt chorakdan keyin bir xil natija berdi” deyilgan. Aslida 2-model lagsiz YaIM(t) bilan baholangan, tizim darajasidagi lagsiz model esa ahamiyatsiz chiqqan.</w:t>
             </w:r>
           </w:p>
         </w:tc>
@@ -5301,7 +5301,7 @@
             </w:pPr>
             <w:r>
               <w:rPr>
-                <w:rFonts w:ascii="Times New Roman" w:cs="Times New Roman" w:eastAsia="Times New Roman" w:hAnsi="Times New Roman"/>
+                <w:rFonts w:ascii="Times New Roman" w:hAnsi="Times New Roman" w:eastAsia="Times New Roman" w:cs="Times New Roman"/>
                 <w:b w:val="false"/>
                 <w:bCs w:val="false"/>
                 <w:sz w:val="19"/>
@@ -5335,7 +5335,7 @@
             </w:pPr>
             <w:r>
               <w:rPr>
-                <w:rFonts w:ascii="Times New Roman" w:cs="Times New Roman" w:eastAsia="Times New Roman" w:hAnsi="Times New Roman"/>
+                <w:rFonts w:ascii="Times New Roman" w:hAnsi="Times New Roman" w:eastAsia="Times New Roman" w:cs="Times New Roman"/>
                 <w:b w:val="false"/>
                 <w:bCs w:val="false"/>
                 <w:sz w:val="19"/>
@@ -5366,7 +5366,7 @@
             <w:pPr/>
             <w:r>
               <w:rPr>
-                <w:rFonts w:ascii="Times New Roman" w:cs="Times New Roman" w:eastAsia="Times New Roman" w:hAnsi="Times New Roman"/>
+                <w:rFonts w:ascii="Times New Roman" w:hAnsi="Times New Roman" w:eastAsia="Times New Roman" w:cs="Times New Roman"/>
                 <w:b w:val="false"/>
                 <w:bCs w:val="false"/>
                 <w:color w:val="FF0000"/>
@@ -5405,7 +5405,7 @@
             </w:pPr>
             <w:r>
               <w:rPr>
-                <w:rFonts w:ascii="Times New Roman" w:cs="Times New Roman" w:eastAsia="Times New Roman" w:hAnsi="Times New Roman"/>
+                <w:rFonts w:ascii="Times New Roman" w:hAnsi="Times New Roman" w:eastAsia="Times New Roman" w:cs="Times New Roman"/>
                 <w:b w:val="false"/>
                 <w:bCs w:val="false"/>
                 <w:sz w:val="19"/>
@@ -5438,7 +5438,7 @@
             </w:pPr>
             <w:r>
               <w:rPr>
-                <w:rFonts w:ascii="Times New Roman" w:cs="Times New Roman" w:eastAsia="Times New Roman" w:hAnsi="Times New Roman"/>
+                <w:rFonts w:ascii="Times New Roman" w:hAnsi="Times New Roman" w:eastAsia="Times New Roman" w:cs="Times New Roman"/>
                 <w:b w:val="false"/>
                 <w:bCs w:val="false"/>
                 <w:sz w:val="19"/>
@@ -5471,7 +5471,7 @@
             </w:pPr>
             <w:r>
               <w:rPr>
-                <w:rFonts w:ascii="Times New Roman" w:cs="Times New Roman" w:eastAsia="Times New Roman" w:hAnsi="Times New Roman"/>
+                <w:rFonts w:ascii="Times New Roman" w:hAnsi="Times New Roman" w:eastAsia="Times New Roman" w:cs="Times New Roman"/>
                 <w:b w:val="false"/>
                 <w:bCs w:val="false"/>
                 <w:sz w:val="19"/>
@@ -5504,13 +5504,13 @@
             </w:pPr>
             <w:r>
               <w:rPr>
-                <w:rFonts w:ascii="Times New Roman" w:cs="Times New Roman" w:eastAsia="Times New Roman" w:hAnsi="Times New Roman"/>
-                <w:b w:val="false"/>
-                <w:bCs w:val="false"/>
-                <w:sz w:val="19"/>
-                <w:szCs w:val="19"/>
-              </w:rPr>
-              <w:t xml:space="preserve">Orqaga tekshiruvdan faqat 2023-yil natijasi keltirilgan. 2024-yilda o‘rtachaga qaytuvchi model aniqroq (0,33 va 0,73). Taklif etilgan usul esa hech bir yilda «o‘zgarishsiz» prognozdan aniqroq emas.</w:t>
+                <w:rFonts w:ascii="Times New Roman" w:hAnsi="Times New Roman" w:eastAsia="Times New Roman" w:cs="Times New Roman"/>
+                <w:b w:val="false"/>
+                <w:bCs w:val="false"/>
+                <w:sz w:val="19"/>
+                <w:szCs w:val="19"/>
+              </w:rPr>
+              <w:t xml:space="preserve">Orqaga tekshiruvdan faqat 2023-yil natijasi keltirilgan. 2024-yilda o‘rtachaga qaytuvchi model aniqroq (0,33 va 0,73). Taklif etilgan usul esa hech bir yilda “o‘zgarishsiz” prognozdan aniqroq emas.</w:t>
             </w:r>
           </w:p>
         </w:tc>
@@ -5537,13 +5537,13 @@
             </w:pPr>
             <w:r>
               <w:rPr>
-                <w:rFonts w:ascii="Times New Roman" w:cs="Times New Roman" w:eastAsia="Times New Roman" w:hAnsi="Times New Roman"/>
-                <w:b w:val="false"/>
-                <w:bCs w:val="false"/>
-                <w:sz w:val="19"/>
-                <w:szCs w:val="19"/>
-              </w:rPr>
-              <w:t xml:space="preserve">Matn muvozanatli qilindi. «Taklif etilgan usul» va «1-modelning o‘zi» o‘rtasidagi farqni (2025-yil YaIM 7,7% ga nisbatan og‘ish usuli) aniq yozing.</w:t>
+                <w:rFonts w:ascii="Times New Roman" w:hAnsi="Times New Roman" w:eastAsia="Times New Roman" w:cs="Times New Roman"/>
+                <w:b w:val="false"/>
+                <w:bCs w:val="false"/>
+                <w:sz w:val="19"/>
+                <w:szCs w:val="19"/>
+              </w:rPr>
+              <w:t xml:space="preserve">Matn muvozanatli qilindi. “Taklif etilgan usul” va “1-modelning o‘zi” o‘rtasidagi farqni (2025-yil YaIM 7,7% ga nisbatan og‘ish usuli) aniq yozing.</w:t>
             </w:r>
           </w:p>
         </w:tc>
@@ -5571,7 +5571,7 @@
             </w:pPr>
             <w:r>
               <w:rPr>
-                <w:rFonts w:ascii="Times New Roman" w:cs="Times New Roman" w:eastAsia="Times New Roman" w:hAnsi="Times New Roman"/>
+                <w:rFonts w:ascii="Times New Roman" w:hAnsi="Times New Roman" w:eastAsia="Times New Roman" w:cs="Times New Roman"/>
                 <w:b w:val="false"/>
                 <w:bCs w:val="false"/>
                 <w:sz w:val="19"/>
@@ -5602,7 +5602,7 @@
             <w:pPr/>
             <w:r>
               <w:rPr>
-                <w:rFonts w:ascii="Times New Roman" w:cs="Times New Roman" w:eastAsia="Times New Roman" w:hAnsi="Times New Roman"/>
+                <w:rFonts w:ascii="Times New Roman" w:hAnsi="Times New Roman" w:eastAsia="Times New Roman" w:cs="Times New Roman"/>
                 <w:b w:val="false"/>
                 <w:bCs w:val="false"/>
                 <w:color w:val="FF0000"/>
@@ -5641,7 +5641,7 @@
             </w:pPr>
             <w:r>
               <w:rPr>
-                <w:rFonts w:ascii="Times New Roman" w:cs="Times New Roman" w:eastAsia="Times New Roman" w:hAnsi="Times New Roman"/>
+                <w:rFonts w:ascii="Times New Roman" w:hAnsi="Times New Roman" w:eastAsia="Times New Roman" w:cs="Times New Roman"/>
                 <w:b w:val="false"/>
                 <w:bCs w:val="false"/>
                 <w:sz w:val="19"/>
@@ -5674,7 +5674,7 @@
             </w:pPr>
             <w:r>
               <w:rPr>
-                <w:rFonts w:ascii="Times New Roman" w:cs="Times New Roman" w:eastAsia="Times New Roman" w:hAnsi="Times New Roman"/>
+                <w:rFonts w:ascii="Times New Roman" w:hAnsi="Times New Roman" w:eastAsia="Times New Roman" w:cs="Times New Roman"/>
                 <w:b w:val="false"/>
                 <w:bCs w:val="false"/>
                 <w:sz w:val="19"/>
@@ -5707,7 +5707,7 @@
             </w:pPr>
             <w:r>
               <w:rPr>
-                <w:rFonts w:ascii="Times New Roman" w:cs="Times New Roman" w:eastAsia="Times New Roman" w:hAnsi="Times New Roman"/>
+                <w:rFonts w:ascii="Times New Roman" w:hAnsi="Times New Roman" w:eastAsia="Times New Roman" w:cs="Times New Roman"/>
                 <w:b w:val="false"/>
                 <w:bCs w:val="false"/>
                 <w:sz w:val="19"/>
@@ -5740,13 +5740,13 @@
             </w:pPr>
             <w:r>
               <w:rPr>
-                <w:rFonts w:ascii="Times New Roman" w:cs="Times New Roman" w:eastAsia="Times New Roman" w:hAnsi="Times New Roman"/>
-                <w:b w:val="false"/>
-                <w:bCs w:val="false"/>
-                <w:sz w:val="19"/>
-                <w:szCs w:val="19"/>
-              </w:rPr>
-              <w:t xml:space="preserve">Davlat banklarida «daromad deyarli to‘liq yo‘qoladi» deyilgan.</w:t>
+                <w:rFonts w:ascii="Times New Roman" w:hAnsi="Times New Roman" w:eastAsia="Times New Roman" w:cs="Times New Roman"/>
+                <w:b w:val="false"/>
+                <w:bCs w:val="false"/>
+                <w:sz w:val="19"/>
+                <w:szCs w:val="19"/>
+              </w:rPr>
+              <w:t xml:space="preserve">Davlat banklarida “daromad deyarli to‘liq yo‘qoladi” deyilgan.</w:t>
             </w:r>
           </w:p>
         </w:tc>
@@ -5773,7 +5773,7 @@
             </w:pPr>
             <w:r>
               <w:rPr>
-                <w:rFonts w:ascii="Times New Roman" w:cs="Times New Roman" w:eastAsia="Times New Roman" w:hAnsi="Times New Roman"/>
+                <w:rFonts w:ascii="Times New Roman" w:hAnsi="Times New Roman" w:eastAsia="Times New Roman" w:cs="Times New Roman"/>
                 <w:b w:val="false"/>
                 <w:bCs w:val="false"/>
                 <w:sz w:val="19"/>
@@ -5807,7 +5807,7 @@
             </w:pPr>
             <w:r>
               <w:rPr>
-                <w:rFonts w:ascii="Times New Roman" w:cs="Times New Roman" w:eastAsia="Times New Roman" w:hAnsi="Times New Roman"/>
+                <w:rFonts w:ascii="Times New Roman" w:hAnsi="Times New Roman" w:eastAsia="Times New Roman" w:cs="Times New Roman"/>
                 <w:b w:val="false"/>
                 <w:bCs w:val="false"/>
                 <w:sz w:val="19"/>
@@ -5838,7 +5838,7 @@
             <w:pPr/>
             <w:r>
               <w:rPr>
-                <w:rFonts w:ascii="Times New Roman" w:cs="Times New Roman" w:eastAsia="Times New Roman" w:hAnsi="Times New Roman"/>
+                <w:rFonts w:ascii="Times New Roman" w:hAnsi="Times New Roman" w:eastAsia="Times New Roman" w:cs="Times New Roman"/>
                 <w:b w:val="false"/>
                 <w:bCs w:val="false"/>
                 <w:color w:val="FF0000"/>
@@ -5876,7 +5876,7 @@
             </w:pPr>
             <w:r>
               <w:rPr>
-                <w:rFonts w:ascii="Times New Roman" w:cs="Times New Roman" w:eastAsia="Times New Roman" w:hAnsi="Times New Roman"/>
+                <w:rFonts w:ascii="Times New Roman" w:hAnsi="Times New Roman" w:eastAsia="Times New Roman" w:cs="Times New Roman"/>
                 <w:b/>
                 <w:bCs/>
                 <w:sz w:val="21"/>
@@ -5914,7 +5914,7 @@
             </w:pPr>
             <w:r>
               <w:rPr>
-                <w:rFonts w:ascii="Times New Roman" w:cs="Times New Roman" w:eastAsia="Times New Roman" w:hAnsi="Times New Roman"/>
+                <w:rFonts w:ascii="Times New Roman" w:hAnsi="Times New Roman" w:eastAsia="Times New Roman" w:cs="Times New Roman"/>
                 <w:b w:val="false"/>
                 <w:bCs w:val="false"/>
                 <w:sz w:val="19"/>
@@ -5947,7 +5947,7 @@
             </w:pPr>
             <w:r>
               <w:rPr>
-                <w:rFonts w:ascii="Times New Roman" w:cs="Times New Roman" w:eastAsia="Times New Roman" w:hAnsi="Times New Roman"/>
+                <w:rFonts w:ascii="Times New Roman" w:hAnsi="Times New Roman" w:eastAsia="Times New Roman" w:cs="Times New Roman"/>
                 <w:b w:val="false"/>
                 <w:bCs w:val="false"/>
                 <w:sz w:val="19"/>
@@ -5980,7 +5980,7 @@
             </w:pPr>
             <w:r>
               <w:rPr>
-                <w:rFonts w:ascii="Times New Roman" w:cs="Times New Roman" w:eastAsia="Times New Roman" w:hAnsi="Times New Roman"/>
+                <w:rFonts w:ascii="Times New Roman" w:hAnsi="Times New Roman" w:eastAsia="Times New Roman" w:cs="Times New Roman"/>
                 <w:b w:val="false"/>
                 <w:bCs w:val="false"/>
                 <w:sz w:val="19"/>
@@ -6013,13 +6013,13 @@
             </w:pPr>
             <w:r>
               <w:rPr>
-                <w:rFonts w:ascii="Times New Roman" w:cs="Times New Roman" w:eastAsia="Times New Roman" w:hAnsi="Times New Roman"/>
-                <w:b w:val="false"/>
-                <w:bCs w:val="false"/>
-                <w:sz w:val="19"/>
-                <w:szCs w:val="19"/>
-              </w:rPr>
-              <w:t xml:space="preserve">«AUC = 0,86 … empirik jihatdan isbotlangan» deyilgan. Bu natija atigi 10 ta hodisaga (8 bank) va 26 ta ijobiy kuzatuvga tayanadi, ular esa bir-birini qoplaydigan 4 choraklik oynalardan olingan. Bundan tashqari, AUC taklif etilgan 13 ko‘rsatkichli MHXS indeksi uchun emas, 8 ko‘rsatkichli milliy panel indeksi uchun hisoblangan. Bu indeksda kapital bloki barcha banklarda 4 ball, MHXS bosqichlari va valyuta bloki esa yo‘q.</w:t>
+                <w:rFonts w:ascii="Times New Roman" w:hAnsi="Times New Roman" w:eastAsia="Times New Roman" w:cs="Times New Roman"/>
+                <w:b w:val="false"/>
+                <w:bCs w:val="false"/>
+                <w:sz w:val="19"/>
+                <w:szCs w:val="19"/>
+              </w:rPr>
+              <w:t xml:space="preserve">“AUC = 0,86 … empirik jihatdan isbotlangan” deyilgan. Bu natija atigi 10 ta hodisaga (8 bank) va 26 ta ijobiy kuzatuvga tayanadi, ular esa bir-birini qoplaydigan 4 choraklik oynalardan olingan. Bundan tashqari, AUC taklif etilgan 13 ko‘rsatkichli MHXS indeksi uchun emas, 8 ko‘rsatkichli milliy panel indeksi uchun hisoblangan. Bu indeksda kapital bloki barcha banklarda 4 ball, MHXS bosqichlari va valyuta bloki esa yo‘q.</w:t>
             </w:r>
           </w:p>
         </w:tc>
@@ -6046,7 +6046,7 @@
             </w:pPr>
             <w:r>
               <w:rPr>
-                <w:rFonts w:ascii="Times New Roman" w:cs="Times New Roman" w:eastAsia="Times New Roman" w:hAnsi="Times New Roman"/>
+                <w:rFonts w:ascii="Times New Roman" w:hAnsi="Times New Roman" w:eastAsia="Times New Roman" w:cs="Times New Roman"/>
                 <w:b w:val="false"/>
                 <w:bCs w:val="false"/>
                 <w:sz w:val="19"/>
@@ -6080,7 +6080,7 @@
             </w:pPr>
             <w:r>
               <w:rPr>
-                <w:rFonts w:ascii="Times New Roman" w:cs="Times New Roman" w:eastAsia="Times New Roman" w:hAnsi="Times New Roman"/>
+                <w:rFonts w:ascii="Times New Roman" w:hAnsi="Times New Roman" w:eastAsia="Times New Roman" w:cs="Times New Roman"/>
                 <w:b w:val="false"/>
                 <w:bCs w:val="false"/>
                 <w:sz w:val="19"/>
@@ -6111,7 +6111,7 @@
             <w:pPr/>
             <w:r>
               <w:rPr>
-                <w:rFonts w:ascii="Times New Roman" w:cs="Times New Roman" w:eastAsia="Times New Roman" w:hAnsi="Times New Roman"/>
+                <w:rFonts w:ascii="Times New Roman" w:hAnsi="Times New Roman" w:eastAsia="Times New Roman" w:cs="Times New Roman"/>
                 <w:b w:val="false"/>
                 <w:bCs w:val="false"/>
                 <w:color w:val="FF0000"/>
@@ -6150,7 +6150,7 @@
             </w:pPr>
             <w:r>
               <w:rPr>
-                <w:rFonts w:ascii="Times New Roman" w:cs="Times New Roman" w:eastAsia="Times New Roman" w:hAnsi="Times New Roman"/>
+                <w:rFonts w:ascii="Times New Roman" w:hAnsi="Times New Roman" w:eastAsia="Times New Roman" w:cs="Times New Roman"/>
                 <w:b w:val="false"/>
                 <w:bCs w:val="false"/>
                 <w:sz w:val="19"/>
@@ -6183,7 +6183,7 @@
             </w:pPr>
             <w:r>
               <w:rPr>
-                <w:rFonts w:ascii="Times New Roman" w:cs="Times New Roman" w:eastAsia="Times New Roman" w:hAnsi="Times New Roman"/>
+                <w:rFonts w:ascii="Times New Roman" w:hAnsi="Times New Roman" w:eastAsia="Times New Roman" w:cs="Times New Roman"/>
                 <w:b w:val="false"/>
                 <w:bCs w:val="false"/>
                 <w:sz w:val="19"/>
@@ -6216,7 +6216,7 @@
             </w:pPr>
             <w:r>
               <w:rPr>
-                <w:rFonts w:ascii="Times New Roman" w:cs="Times New Roman" w:eastAsia="Times New Roman" w:hAnsi="Times New Roman"/>
+                <w:rFonts w:ascii="Times New Roman" w:hAnsi="Times New Roman" w:eastAsia="Times New Roman" w:cs="Times New Roman"/>
                 <w:b w:val="false"/>
                 <w:bCs w:val="false"/>
                 <w:sz w:val="19"/>
@@ -6249,13 +6249,13 @@
             </w:pPr>
             <w:r>
               <w:rPr>
-                <w:rFonts w:ascii="Times New Roman" w:cs="Times New Roman" w:eastAsia="Times New Roman" w:hAnsi="Times New Roman"/>
-                <w:b w:val="false"/>
-                <w:bCs w:val="false"/>
-                <w:sz w:val="19"/>
-                <w:szCs w:val="19"/>
-              </w:rPr>
-              <w:t xml:space="preserve">Bloklar tarkibi bir xil emas. Konseptual modelda besh blokdan biri «boshqaruv sifati», baholash ta’rifida «bozor risklariga sezgirlik», integral indeksda esa «valyuta riskiga sezgirlik».</w:t>
+                <w:rFonts w:ascii="Times New Roman" w:hAnsi="Times New Roman" w:eastAsia="Times New Roman" w:cs="Times New Roman"/>
+                <w:b w:val="false"/>
+                <w:bCs w:val="false"/>
+                <w:sz w:val="19"/>
+                <w:szCs w:val="19"/>
+              </w:rPr>
+              <w:t xml:space="preserve">Bloklar tarkibi bir xil emas. Konseptual modelda besh blokdan biri “boshqaruv sifati”, baholash ta’rifida “bozor risklariga sezgirlik”, integral indeksda esa “valyuta riskiga sezgirlik”.</w:t>
             </w:r>
           </w:p>
         </w:tc>
@@ -6282,7 +6282,7 @@
             </w:pPr>
             <w:r>
               <w:rPr>
-                <w:rFonts w:ascii="Times New Roman" w:cs="Times New Roman" w:eastAsia="Times New Roman" w:hAnsi="Times New Roman"/>
+                <w:rFonts w:ascii="Times New Roman" w:hAnsi="Times New Roman" w:eastAsia="Times New Roman" w:cs="Times New Roman"/>
                 <w:b w:val="false"/>
                 <w:bCs w:val="false"/>
                 <w:sz w:val="19"/>
@@ -6316,7 +6316,7 @@
             </w:pPr>
             <w:r>
               <w:rPr>
-                <w:rFonts w:ascii="Times New Roman" w:cs="Times New Roman" w:eastAsia="Times New Roman" w:hAnsi="Times New Roman"/>
+                <w:rFonts w:ascii="Times New Roman" w:hAnsi="Times New Roman" w:eastAsia="Times New Roman" w:cs="Times New Roman"/>
                 <w:b w:val="false"/>
                 <w:bCs w:val="false"/>
                 <w:sz w:val="19"/>
@@ -6347,7 +6347,7 @@
             <w:pPr/>
             <w:r>
               <w:rPr>
-                <w:rFonts w:ascii="Times New Roman" w:cs="Times New Roman" w:eastAsia="Times New Roman" w:hAnsi="Times New Roman"/>
+                <w:rFonts w:ascii="Times New Roman" w:hAnsi="Times New Roman" w:eastAsia="Times New Roman" w:cs="Times New Roman"/>
                 <w:b w:val="false"/>
                 <w:bCs w:val="false"/>
                 <w:color w:val="FF0000"/>
@@ -6386,7 +6386,7 @@
             </w:pPr>
             <w:r>
               <w:rPr>
-                <w:rFonts w:ascii="Times New Roman" w:cs="Times New Roman" w:eastAsia="Times New Roman" w:hAnsi="Times New Roman"/>
+                <w:rFonts w:ascii="Times New Roman" w:hAnsi="Times New Roman" w:eastAsia="Times New Roman" w:cs="Times New Roman"/>
                 <w:b w:val="false"/>
                 <w:bCs w:val="false"/>
                 <w:sz w:val="19"/>
@@ -6419,7 +6419,7 @@
             </w:pPr>
             <w:r>
               <w:rPr>
-                <w:rFonts w:ascii="Times New Roman" w:cs="Times New Roman" w:eastAsia="Times New Roman" w:hAnsi="Times New Roman"/>
+                <w:rFonts w:ascii="Times New Roman" w:hAnsi="Times New Roman" w:eastAsia="Times New Roman" w:cs="Times New Roman"/>
                 <w:b w:val="false"/>
                 <w:bCs w:val="false"/>
                 <w:sz w:val="19"/>
@@ -6452,7 +6452,7 @@
             </w:pPr>
             <w:r>
               <w:rPr>
-                <w:rFonts w:ascii="Times New Roman" w:cs="Times New Roman" w:eastAsia="Times New Roman" w:hAnsi="Times New Roman"/>
+                <w:rFonts w:ascii="Times New Roman" w:hAnsi="Times New Roman" w:eastAsia="Times New Roman" w:cs="Times New Roman"/>
                 <w:b w:val="false"/>
                 <w:bCs w:val="false"/>
                 <w:sz w:val="19"/>
@@ -6485,13 +6485,13 @@
             </w:pPr>
             <w:r>
               <w:rPr>
-                <w:rFonts w:ascii="Times New Roman" w:cs="Times New Roman" w:eastAsia="Times New Roman" w:hAnsi="Times New Roman"/>
-                <w:b w:val="false"/>
-                <w:bCs w:val="false"/>
-                <w:sz w:val="19"/>
-                <w:szCs w:val="19"/>
-              </w:rPr>
-              <w:t xml:space="preserve">«Empirik usullar o‘rtachasi»ga logit ustunidagi ekspert vaznlari (0,25* va 0,10*) ham kiritilgan, shuning uchun bu sof empirik o‘rtacha emas. Kapital bloki 25 bank panelida barcha banklarda bir xil ball olgan, ya’ni uni bu panelda tekshirib bo‘lmaydi. Entropiya usuli eng yuqori vaznni daromadlilikka (0,46) bergan. Shunga qaramay «barcha usullar aktivlar sifatining yetakchiligini tasdiqladi» degan xulosa chiqarilgan.</w:t>
+                <w:rFonts w:ascii="Times New Roman" w:hAnsi="Times New Roman" w:eastAsia="Times New Roman" w:cs="Times New Roman"/>
+                <w:b w:val="false"/>
+                <w:bCs w:val="false"/>
+                <w:sz w:val="19"/>
+                <w:szCs w:val="19"/>
+              </w:rPr>
+              <w:t xml:space="preserve">“Empirik usullar o‘rtachasi”ga logit ustunidagi ekspert vaznlari (0,25* va 0,10*) ham kiritilgan, shuning uchun bu sof empirik o‘rtacha emas. Kapital bloki 25 bank panelida barcha banklarda bir xil ball olgan, ya’ni uni bu panelda tekshirib bo‘lmaydi. Entropiya usuli eng yuqori vaznni daromadlilikka (0,46) bergan. Shunga qaramay “barcha usullar aktivlar sifatining yetakchiligini tasdiqladi” degan xulosa chiqarilgan.</w:t>
             </w:r>
           </w:p>
         </w:tc>
@@ -6518,13 +6518,13 @@
             </w:pPr>
             <w:r>
               <w:rPr>
-                <w:rFonts w:ascii="Times New Roman" w:cs="Times New Roman" w:eastAsia="Times New Roman" w:hAnsi="Times New Roman"/>
-                <w:b w:val="false"/>
-                <w:bCs w:val="false"/>
-                <w:sz w:val="19"/>
-                <w:szCs w:val="19"/>
-              </w:rPr>
-              <w:t xml:space="preserve">O‘rtachani faqat empirik baholardan hisoblang. Xulosani «aktivlar sifati vazni barcha usullarda ekspert vaznidan kam emas» ko‘rinishida yozing. 3.2.3-jadvalga variatsiya koeffitsiyenti usuli ustunini qo‘shing.</w:t>
+                <w:rFonts w:ascii="Times New Roman" w:hAnsi="Times New Roman" w:eastAsia="Times New Roman" w:cs="Times New Roman"/>
+                <w:b w:val="false"/>
+                <w:bCs w:val="false"/>
+                <w:sz w:val="19"/>
+                <w:szCs w:val="19"/>
+              </w:rPr>
+              <w:t xml:space="preserve">O‘rtachani faqat empirik baholardan hisoblang. Xulosani “aktivlar sifati vazni barcha usullarda ekspert vaznidan kam emas” ko‘rinishida yozing. 3.2.3-jadvalga variatsiya koeffitsiyenti usuli ustunini qo‘shing.</w:t>
             </w:r>
           </w:p>
         </w:tc>
@@ -6552,7 +6552,7 @@
             </w:pPr>
             <w:r>
               <w:rPr>
-                <w:rFonts w:ascii="Times New Roman" w:cs="Times New Roman" w:eastAsia="Times New Roman" w:hAnsi="Times New Roman"/>
+                <w:rFonts w:ascii="Times New Roman" w:hAnsi="Times New Roman" w:eastAsia="Times New Roman" w:cs="Times New Roman"/>
                 <w:b w:val="false"/>
                 <w:bCs w:val="false"/>
                 <w:sz w:val="19"/>
@@ -6583,7 +6583,7 @@
             <w:pPr/>
             <w:r>
               <w:rPr>
-                <w:rFonts w:ascii="Times New Roman" w:cs="Times New Roman" w:eastAsia="Times New Roman" w:hAnsi="Times New Roman"/>
+                <w:rFonts w:ascii="Times New Roman" w:hAnsi="Times New Roman" w:eastAsia="Times New Roman" w:cs="Times New Roman"/>
                 <w:b w:val="false"/>
                 <w:bCs w:val="false"/>
                 <w:color w:val="FF0000"/>
@@ -6622,7 +6622,7 @@
             </w:pPr>
             <w:r>
               <w:rPr>
-                <w:rFonts w:ascii="Times New Roman" w:cs="Times New Roman" w:eastAsia="Times New Roman" w:hAnsi="Times New Roman"/>
+                <w:rFonts w:ascii="Times New Roman" w:hAnsi="Times New Roman" w:eastAsia="Times New Roman" w:cs="Times New Roman"/>
                 <w:b w:val="false"/>
                 <w:bCs w:val="false"/>
                 <w:sz w:val="19"/>
@@ -6655,7 +6655,7 @@
             </w:pPr>
             <w:r>
               <w:rPr>
-                <w:rFonts w:ascii="Times New Roman" w:cs="Times New Roman" w:eastAsia="Times New Roman" w:hAnsi="Times New Roman"/>
+                <w:rFonts w:ascii="Times New Roman" w:hAnsi="Times New Roman" w:eastAsia="Times New Roman" w:cs="Times New Roman"/>
                 <w:b w:val="false"/>
                 <w:bCs w:val="false"/>
                 <w:sz w:val="19"/>
@@ -6688,7 +6688,7 @@
             </w:pPr>
             <w:r>
               <w:rPr>
-                <w:rFonts w:ascii="Times New Roman" w:cs="Times New Roman" w:eastAsia="Times New Roman" w:hAnsi="Times New Roman"/>
+                <w:rFonts w:ascii="Times New Roman" w:hAnsi="Times New Roman" w:eastAsia="Times New Roman" w:cs="Times New Roman"/>
                 <w:b w:val="false"/>
                 <w:bCs w:val="false"/>
                 <w:sz w:val="19"/>
@@ -6721,13 +6721,13 @@
             </w:pPr>
             <w:r>
               <w:rPr>
-                <w:rFonts w:ascii="Times New Roman" w:cs="Times New Roman" w:eastAsia="Times New Roman" w:hAnsi="Times New Roman"/>
-                <w:b w:val="false"/>
-                <w:bCs w:val="false"/>
-                <w:sz w:val="19"/>
-                <w:szCs w:val="19"/>
-              </w:rPr>
-              <w:t xml:space="preserve">L1 uchun 2 ball chegarasi «Markaziy bankning 10% minimal talabi» deb olingan, lekin 10% bu lahzali likvidlik normativi, ya’ni boshqa ko‘rsatkich. L2 shkalasi bilan matn o‘rtasida ziddiyat bor edi (80% «muammo belgisi» degan joyda 4 ball). A2 chegaralari tahlil qilinayotgan tanlanma qiymatlaridan olingan (in-sample). Sinf chegaralari 1–4 oraliqni teng to‘rtga bo‘lish orqali belgilangan.</w:t>
+                <w:rFonts w:ascii="Times New Roman" w:hAnsi="Times New Roman" w:eastAsia="Times New Roman" w:cs="Times New Roman"/>
+                <w:b w:val="false"/>
+                <w:bCs w:val="false"/>
+                <w:sz w:val="19"/>
+                <w:szCs w:val="19"/>
+              </w:rPr>
+              <w:t xml:space="preserve">L1 uchun 2 ball chegarasi “Markaziy bankning 10% minimal talabi” deb olingan, lekin 10% bu lahzali likvidlik normativi, ya’ni boshqa ko‘rsatkich. L2 shkalasi bilan matn o‘rtasida ziddiyat bor edi (80% “muammo belgisi” degan joyda 4 ball). A2 chegaralari tahlil qilinayotgan tanlanma qiymatlaridan olingan (in-sample). Sinf chegaralari 1–4 oraliqni teng to‘rtga bo‘lish orqali belgilangan.</w:t>
             </w:r>
           </w:p>
         </w:tc>
@@ -6754,7 +6754,7 @@
             </w:pPr>
             <w:r>
               <w:rPr>
-                <w:rFonts w:ascii="Times New Roman" w:cs="Times New Roman" w:eastAsia="Times New Roman" w:hAnsi="Times New Roman"/>
+                <w:rFonts w:ascii="Times New Roman" w:hAnsi="Times New Roman" w:eastAsia="Times New Roman" w:cs="Times New Roman"/>
                 <w:b w:val="false"/>
                 <w:bCs w:val="false"/>
                 <w:sz w:val="19"/>
@@ -6788,7 +6788,7 @@
             </w:pPr>
             <w:r>
               <w:rPr>
-                <w:rFonts w:ascii="Times New Roman" w:cs="Times New Roman" w:eastAsia="Times New Roman" w:hAnsi="Times New Roman"/>
+                <w:rFonts w:ascii="Times New Roman" w:hAnsi="Times New Roman" w:eastAsia="Times New Roman" w:cs="Times New Roman"/>
                 <w:b w:val="false"/>
                 <w:bCs w:val="false"/>
                 <w:sz w:val="19"/>
@@ -6819,14 +6819,14 @@
             <w:pPr/>
             <w:r>
               <w:rPr>
-                <w:rFonts w:ascii="Times New Roman" w:cs="Times New Roman" w:eastAsia="Times New Roman" w:hAnsi="Times New Roman"/>
+                <w:rFonts w:ascii="Times New Roman" w:hAnsi="Times New Roman" w:eastAsia="Times New Roman" w:cs="Times New Roman"/>
                 <w:b w:val="false"/>
                 <w:bCs w:val="false"/>
                 <w:color w:val="FF0000"/>
                 <w:sz w:val="19"/>
                 <w:szCs w:val="19"/>
               </w:rPr>
-              <w:t xml:space="preserve">Tuzatildi. Hal qilindi: L1 uchun 10% – SQB ning 22-jadval shaklidagi «yuqori likvid aktivlarning jami aktivlardagi ulushi» prudensial me’yori (lahzali likvidlik emas – taqrizchi fikri asossiz, manba keltirildi). A2 chegaralari EBA Risk Dashboard (Q4 2024, 33-b.) bilan tashqi tekshirildi: YeI o‘rtacha 2-bosqich ulushi 9,6–9,7%, maksimum 15,9%. Sinf oraliqlari yarim ochiq ko‘rinishda yozildi (3.1.4 va 3.2.4-jadvallar), teng oraliqlar asoslandi.</w:t>
+              <w:t xml:space="preserve">Tuzatildi. Hal qilindi: L1 uchun 10% – SQB ning 22-jadval shaklidagi “yuqori likvid aktivlarning jami aktivlardagi ulushi” prudensial me’yori (lahzali likvidlik emas – taqrizchi fikri asossiz, manba keltirildi). A2 chegaralari EBA Risk Dashboard (Q4 2024, 33-b.) bilan tashqi tekshirildi: YeI o‘rtacha 2-bosqich ulushi 9,6–9,7%, maksimum 15,9%. Sinf oraliqlari yarim ochiq ko‘rinishda yozildi (3.1.4 va 3.2.4-jadvallar), teng oraliqlar asoslandi.</w:t>
             </w:r>
           </w:p>
         </w:tc>
@@ -6858,7 +6858,7 @@
             </w:pPr>
             <w:r>
               <w:rPr>
-                <w:rFonts w:ascii="Times New Roman" w:cs="Times New Roman" w:eastAsia="Times New Roman" w:hAnsi="Times New Roman"/>
+                <w:rFonts w:ascii="Times New Roman" w:hAnsi="Times New Roman" w:eastAsia="Times New Roman" w:cs="Times New Roman"/>
                 <w:b w:val="false"/>
                 <w:bCs w:val="false"/>
                 <w:sz w:val="19"/>
@@ -6891,7 +6891,7 @@
             </w:pPr>
             <w:r>
               <w:rPr>
-                <w:rFonts w:ascii="Times New Roman" w:cs="Times New Roman" w:eastAsia="Times New Roman" w:hAnsi="Times New Roman"/>
+                <w:rFonts w:ascii="Times New Roman" w:hAnsi="Times New Roman" w:eastAsia="Times New Roman" w:cs="Times New Roman"/>
                 <w:b w:val="false"/>
                 <w:bCs w:val="false"/>
                 <w:sz w:val="19"/>
@@ -6924,7 +6924,7 @@
             </w:pPr>
             <w:r>
               <w:rPr>
-                <w:rFonts w:ascii="Times New Roman" w:cs="Times New Roman" w:eastAsia="Times New Roman" w:hAnsi="Times New Roman"/>
+                <w:rFonts w:ascii="Times New Roman" w:hAnsi="Times New Roman" w:eastAsia="Times New Roman" w:cs="Times New Roman"/>
                 <w:b w:val="false"/>
                 <w:bCs w:val="false"/>
                 <w:sz w:val="19"/>
@@ -6957,13 +6957,13 @@
             </w:pPr>
             <w:r>
               <w:rPr>
-                <w:rFonts w:ascii="Times New Roman" w:cs="Times New Roman" w:eastAsia="Times New Roman" w:hAnsi="Times New Roman"/>
-                <w:b w:val="false"/>
-                <w:bCs w:val="false"/>
-                <w:sz w:val="19"/>
-                <w:szCs w:val="19"/>
-              </w:rPr>
-              <w:t xml:space="preserve">III sinfda atigi 10 ta kuzatuv bor (9 tasida hodisa), IV sinfda esa kuzatuv yo‘q. «Sinflar chegaralari empirik tasdiqlandi» degan xulosa uchun bu juda kam.</w:t>
+                <w:rFonts w:ascii="Times New Roman" w:hAnsi="Times New Roman" w:eastAsia="Times New Roman" w:cs="Times New Roman"/>
+                <w:b w:val="false"/>
+                <w:bCs w:val="false"/>
+                <w:sz w:val="19"/>
+                <w:szCs w:val="19"/>
+              </w:rPr>
+              <w:t xml:space="preserve">III sinfda atigi 10 ta kuzatuv bor (9 tasida hodisa), IV sinfda esa kuzatuv yo‘q. “Sinflar chegaralari empirik tasdiqlandi” degan xulosa uchun bu juda kam.</w:t>
             </w:r>
           </w:p>
         </w:tc>
@@ -6990,7 +6990,7 @@
             </w:pPr>
             <w:r>
               <w:rPr>
-                <w:rFonts w:ascii="Times New Roman" w:cs="Times New Roman" w:eastAsia="Times New Roman" w:hAnsi="Times New Roman"/>
+                <w:rFonts w:ascii="Times New Roman" w:hAnsi="Times New Roman" w:eastAsia="Times New Roman" w:cs="Times New Roman"/>
                 <w:b w:val="false"/>
                 <w:bCs w:val="false"/>
                 <w:sz w:val="19"/>
@@ -7024,7 +7024,7 @@
             </w:pPr>
             <w:r>
               <w:rPr>
-                <w:rFonts w:ascii="Times New Roman" w:cs="Times New Roman" w:eastAsia="Times New Roman" w:hAnsi="Times New Roman"/>
+                <w:rFonts w:ascii="Times New Roman" w:hAnsi="Times New Roman" w:eastAsia="Times New Roman" w:cs="Times New Roman"/>
                 <w:b w:val="false"/>
                 <w:bCs w:val="false"/>
                 <w:sz w:val="19"/>
@@ -7055,14 +7055,14 @@
             <w:pPr/>
             <w:r>
               <w:rPr>
-                <w:rFonts w:ascii="Times New Roman" w:cs="Times New Roman" w:eastAsia="Times New Roman" w:hAnsi="Times New Roman"/>
+                <w:rFonts w:ascii="Times New Roman" w:hAnsi="Times New Roman" w:eastAsia="Times New Roman" w:cs="Times New Roman"/>
                 <w:b w:val="false"/>
                 <w:bCs w:val="false"/>
                 <w:color w:val="FF0000"/>
                 <w:sz w:val="19"/>
                 <w:szCs w:val="19"/>
               </w:rPr>
-              <w:t xml:space="preserve">Tuzatildi. Hal qilindi: 3.2.4-jadvalga Wilson 95% oraliqlari ustuni (0,8–5,0; 7,9–21,4; 59,6–98,2) va Fisher testi (p &lt; 0,001) qo‘shildi; xulosa «tahlil davri ma’lumotlariga mos» deb yumshatildi (3.2-§, III bob xulosasi, Xulosa).</w:t>
+              <w:t xml:space="preserve">Tuzatildi. Hal qilindi: 3.2.4-jadvalga Wilson 95% oraliqlari ustuni (0,8–5,0; 7,9–21,4; 59,6–98,2) va Fisher testi (p &lt; 0,001) qo‘shildi; xulosa “tahlil davri ma’lumotlariga mos” deb yumshatildi (3.2-§, III bob xulosasi, Xulosa).</w:t>
             </w:r>
           </w:p>
         </w:tc>
@@ -7094,7 +7094,7 @@
             </w:pPr>
             <w:r>
               <w:rPr>
-                <w:rFonts w:ascii="Times New Roman" w:cs="Times New Roman" w:eastAsia="Times New Roman" w:hAnsi="Times New Roman"/>
+                <w:rFonts w:ascii="Times New Roman" w:hAnsi="Times New Roman" w:eastAsia="Times New Roman" w:cs="Times New Roman"/>
                 <w:b w:val="false"/>
                 <w:bCs w:val="false"/>
                 <w:sz w:val="19"/>
@@ -7127,7 +7127,7 @@
             </w:pPr>
             <w:r>
               <w:rPr>
-                <w:rFonts w:ascii="Times New Roman" w:cs="Times New Roman" w:eastAsia="Times New Roman" w:hAnsi="Times New Roman"/>
+                <w:rFonts w:ascii="Times New Roman" w:hAnsi="Times New Roman" w:eastAsia="Times New Roman" w:cs="Times New Roman"/>
                 <w:b w:val="false"/>
                 <w:bCs w:val="false"/>
                 <w:sz w:val="19"/>
@@ -7160,7 +7160,7 @@
             </w:pPr>
             <w:r>
               <w:rPr>
-                <w:rFonts w:ascii="Times New Roman" w:cs="Times New Roman" w:eastAsia="Times New Roman" w:hAnsi="Times New Roman"/>
+                <w:rFonts w:ascii="Times New Roman" w:hAnsi="Times New Roman" w:eastAsia="Times New Roman" w:cs="Times New Roman"/>
                 <w:b w:val="false"/>
                 <w:bCs w:val="false"/>
                 <w:sz w:val="19"/>
@@ -7193,7 +7193,7 @@
             </w:pPr>
             <w:r>
               <w:rPr>
-                <w:rFonts w:ascii="Times New Roman" w:cs="Times New Roman" w:eastAsia="Times New Roman" w:hAnsi="Times New Roman"/>
+                <w:rFonts w:ascii="Times New Roman" w:hAnsi="Times New Roman" w:eastAsia="Times New Roman" w:cs="Times New Roman"/>
                 <w:b w:val="false"/>
                 <w:bCs w:val="false"/>
                 <w:sz w:val="19"/>
@@ -7226,7 +7226,7 @@
             </w:pPr>
             <w:r>
               <w:rPr>
-                <w:rFonts w:ascii="Times New Roman" w:cs="Times New Roman" w:eastAsia="Times New Roman" w:hAnsi="Times New Roman"/>
+                <w:rFonts w:ascii="Times New Roman" w:hAnsi="Times New Roman" w:eastAsia="Times New Roman" w:cs="Times New Roman"/>
                 <w:b w:val="false"/>
                 <w:bCs w:val="false"/>
                 <w:sz w:val="19"/>
@@ -7260,7 +7260,7 @@
             </w:pPr>
             <w:r>
               <w:rPr>
-                <w:rFonts w:ascii="Times New Roman" w:cs="Times New Roman" w:eastAsia="Times New Roman" w:hAnsi="Times New Roman"/>
+                <w:rFonts w:ascii="Times New Roman" w:hAnsi="Times New Roman" w:eastAsia="Times New Roman" w:cs="Times New Roman"/>
                 <w:b w:val="false"/>
                 <w:bCs w:val="false"/>
                 <w:sz w:val="19"/>
@@ -7291,7 +7291,7 @@
             <w:pPr/>
             <w:r>
               <w:rPr>
-                <w:rFonts w:ascii="Times New Roman" w:cs="Times New Roman" w:eastAsia="Times New Roman" w:hAnsi="Times New Roman"/>
+                <w:rFonts w:ascii="Times New Roman" w:hAnsi="Times New Roman" w:eastAsia="Times New Roman" w:cs="Times New Roman"/>
                 <w:b w:val="false"/>
                 <w:bCs w:val="false"/>
                 <w:color w:val="FF0000"/>
@@ -7330,7 +7330,7 @@
             </w:pPr>
             <w:r>
               <w:rPr>
-                <w:rFonts w:ascii="Times New Roman" w:cs="Times New Roman" w:eastAsia="Times New Roman" w:hAnsi="Times New Roman"/>
+                <w:rFonts w:ascii="Times New Roman" w:hAnsi="Times New Roman" w:eastAsia="Times New Roman" w:cs="Times New Roman"/>
                 <w:b w:val="false"/>
                 <w:bCs w:val="false"/>
                 <w:sz w:val="19"/>
@@ -7363,7 +7363,7 @@
             </w:pPr>
             <w:r>
               <w:rPr>
-                <w:rFonts w:ascii="Times New Roman" w:cs="Times New Roman" w:eastAsia="Times New Roman" w:hAnsi="Times New Roman"/>
+                <w:rFonts w:ascii="Times New Roman" w:hAnsi="Times New Roman" w:eastAsia="Times New Roman" w:cs="Times New Roman"/>
                 <w:b w:val="false"/>
                 <w:bCs w:val="false"/>
                 <w:sz w:val="19"/>
@@ -7396,7 +7396,7 @@
             </w:pPr>
             <w:r>
               <w:rPr>
-                <w:rFonts w:ascii="Times New Roman" w:cs="Times New Roman" w:eastAsia="Times New Roman" w:hAnsi="Times New Roman"/>
+                <w:rFonts w:ascii="Times New Roman" w:hAnsi="Times New Roman" w:eastAsia="Times New Roman" w:cs="Times New Roman"/>
                 <w:b w:val="false"/>
                 <w:bCs w:val="false"/>
                 <w:sz w:val="19"/>
@@ -7429,7 +7429,7 @@
             </w:pPr>
             <w:r>
               <w:rPr>
-                <w:rFonts w:ascii="Times New Roman" w:cs="Times New Roman" w:eastAsia="Times New Roman" w:hAnsi="Times New Roman"/>
+                <w:rFonts w:ascii="Times New Roman" w:hAnsi="Times New Roman" w:eastAsia="Times New Roman" w:cs="Times New Roman"/>
                 <w:b w:val="false"/>
                 <w:bCs w:val="false"/>
                 <w:sz w:val="19"/>
@@ -7462,7 +7462,7 @@
             </w:pPr>
             <w:r>
               <w:rPr>
-                <w:rFonts w:ascii="Times New Roman" w:cs="Times New Roman" w:eastAsia="Times New Roman" w:hAnsi="Times New Roman"/>
+                <w:rFonts w:ascii="Times New Roman" w:hAnsi="Times New Roman" w:eastAsia="Times New Roman" w:cs="Times New Roman"/>
                 <w:b w:val="false"/>
                 <w:bCs w:val="false"/>
                 <w:sz w:val="19"/>
@@ -7496,7 +7496,7 @@
             </w:pPr>
             <w:r>
               <w:rPr>
-                <w:rFonts w:ascii="Times New Roman" w:cs="Times New Roman" w:eastAsia="Times New Roman" w:hAnsi="Times New Roman"/>
+                <w:rFonts w:ascii="Times New Roman" w:hAnsi="Times New Roman" w:eastAsia="Times New Roman" w:cs="Times New Roman"/>
                 <w:b w:val="false"/>
                 <w:bCs w:val="false"/>
                 <w:sz w:val="19"/>
@@ -7527,7 +7527,7 @@
             <w:pPr/>
             <w:r>
               <w:rPr>
-                <w:rFonts w:ascii="Times New Roman" w:cs="Times New Roman" w:eastAsia="Times New Roman" w:hAnsi="Times New Roman"/>
+                <w:rFonts w:ascii="Times New Roman" w:hAnsi="Times New Roman" w:eastAsia="Times New Roman" w:cs="Times New Roman"/>
                 <w:b w:val="false"/>
                 <w:bCs w:val="false"/>
                 <w:color w:val="FF0000"/>
@@ -7566,7 +7566,7 @@
             </w:pPr>
             <w:r>
               <w:rPr>
-                <w:rFonts w:ascii="Times New Roman" w:cs="Times New Roman" w:eastAsia="Times New Roman" w:hAnsi="Times New Roman"/>
+                <w:rFonts w:ascii="Times New Roman" w:hAnsi="Times New Roman" w:eastAsia="Times New Roman" w:cs="Times New Roman"/>
                 <w:b w:val="false"/>
                 <w:bCs w:val="false"/>
                 <w:sz w:val="19"/>
@@ -7599,7 +7599,7 @@
             </w:pPr>
             <w:r>
               <w:rPr>
-                <w:rFonts w:ascii="Times New Roman" w:cs="Times New Roman" w:eastAsia="Times New Roman" w:hAnsi="Times New Roman"/>
+                <w:rFonts w:ascii="Times New Roman" w:hAnsi="Times New Roman" w:eastAsia="Times New Roman" w:cs="Times New Roman"/>
                 <w:b w:val="false"/>
                 <w:bCs w:val="false"/>
                 <w:sz w:val="19"/>
@@ -7632,7 +7632,7 @@
             </w:pPr>
             <w:r>
               <w:rPr>
-                <w:rFonts w:ascii="Times New Roman" w:cs="Times New Roman" w:eastAsia="Times New Roman" w:hAnsi="Times New Roman"/>
+                <w:rFonts w:ascii="Times New Roman" w:hAnsi="Times New Roman" w:eastAsia="Times New Roman" w:cs="Times New Roman"/>
                 <w:b w:val="false"/>
                 <w:bCs w:val="false"/>
                 <w:sz w:val="19"/>
@@ -7665,13 +7665,13 @@
             </w:pPr>
             <w:r>
               <w:rPr>
-                <w:rFonts w:ascii="Times New Roman" w:cs="Times New Roman" w:eastAsia="Times New Roman" w:hAnsi="Times New Roman"/>
-                <w:b w:val="false"/>
-                <w:bCs w:val="false"/>
-                <w:sz w:val="19"/>
-                <w:szCs w:val="19"/>
-              </w:rPr>
-              <w:t xml:space="preserve">MHXS indeksida L1 ko‘rsatkichi milliy balansdan («SNS» bazasi) olingan. Shu sababli likvidlik blokidagi ΔMBII ta’rifiga ko‘ra nolga teng chiqadi.</w:t>
+                <w:rFonts w:ascii="Times New Roman" w:hAnsi="Times New Roman" w:eastAsia="Times New Roman" w:cs="Times New Roman"/>
+                <w:b w:val="false"/>
+                <w:bCs w:val="false"/>
+                <w:sz w:val="19"/>
+                <w:szCs w:val="19"/>
+              </w:rPr>
+              <w:t xml:space="preserve">MHXS indeksida L1 ko‘rsatkichi milliy balansdan (“SNS” bazasi) olingan. Shu sababli likvidlik blokidagi ΔMBII ta’rifiga ko‘ra nolga teng chiqadi.</w:t>
             </w:r>
           </w:p>
         </w:tc>
@@ -7698,7 +7698,7 @@
             </w:pPr>
             <w:r>
               <w:rPr>
-                <w:rFonts w:ascii="Times New Roman" w:cs="Times New Roman" w:eastAsia="Times New Roman" w:hAnsi="Times New Roman"/>
+                <w:rFonts w:ascii="Times New Roman" w:hAnsi="Times New Roman" w:eastAsia="Times New Roman" w:cs="Times New Roman"/>
                 <w:b w:val="false"/>
                 <w:bCs w:val="false"/>
                 <w:sz w:val="19"/>
@@ -7732,7 +7732,7 @@
             </w:pPr>
             <w:r>
               <w:rPr>
-                <w:rFonts w:ascii="Times New Roman" w:cs="Times New Roman" w:eastAsia="Times New Roman" w:hAnsi="Times New Roman"/>
+                <w:rFonts w:ascii="Times New Roman" w:hAnsi="Times New Roman" w:eastAsia="Times New Roman" w:cs="Times New Roman"/>
                 <w:b w:val="false"/>
                 <w:bCs w:val="false"/>
                 <w:sz w:val="19"/>
@@ -7763,7 +7763,7 @@
             <w:pPr/>
             <w:r>
               <w:rPr>
-                <w:rFonts w:ascii="Times New Roman" w:cs="Times New Roman" w:eastAsia="Times New Roman" w:hAnsi="Times New Roman"/>
+                <w:rFonts w:ascii="Times New Roman" w:hAnsi="Times New Roman" w:eastAsia="Times New Roman" w:cs="Times New Roman"/>
                 <w:b w:val="false"/>
                 <w:bCs w:val="false"/>
                 <w:color w:val="FF0000"/>
@@ -7802,7 +7802,7 @@
             </w:pPr>
             <w:r>
               <w:rPr>
-                <w:rFonts w:ascii="Times New Roman" w:cs="Times New Roman" w:eastAsia="Times New Roman" w:hAnsi="Times New Roman"/>
+                <w:rFonts w:ascii="Times New Roman" w:hAnsi="Times New Roman" w:eastAsia="Times New Roman" w:cs="Times New Roman"/>
                 <w:b w:val="false"/>
                 <w:bCs w:val="false"/>
                 <w:sz w:val="19"/>
@@ -7835,7 +7835,7 @@
             </w:pPr>
             <w:r>
               <w:rPr>
-                <w:rFonts w:ascii="Times New Roman" w:cs="Times New Roman" w:eastAsia="Times New Roman" w:hAnsi="Times New Roman"/>
+                <w:rFonts w:ascii="Times New Roman" w:hAnsi="Times New Roman" w:eastAsia="Times New Roman" w:cs="Times New Roman"/>
                 <w:b w:val="false"/>
                 <w:bCs w:val="false"/>
                 <w:sz w:val="19"/>
@@ -7868,7 +7868,7 @@
             </w:pPr>
             <w:r>
               <w:rPr>
-                <w:rFonts w:ascii="Times New Roman" w:cs="Times New Roman" w:eastAsia="Times New Roman" w:hAnsi="Times New Roman"/>
+                <w:rFonts w:ascii="Times New Roman" w:hAnsi="Times New Roman" w:eastAsia="Times New Roman" w:cs="Times New Roman"/>
                 <w:b w:val="false"/>
                 <w:bCs w:val="false"/>
                 <w:sz w:val="19"/>
@@ -7901,13 +7901,13 @@
             </w:pPr>
             <w:r>
               <w:rPr>
-                <w:rFonts w:ascii="Times New Roman" w:cs="Times New Roman" w:eastAsia="Times New Roman" w:hAnsi="Times New Roman"/>
-                <w:b w:val="false"/>
-                <w:bCs w:val="false"/>
-                <w:sz w:val="19"/>
-                <w:szCs w:val="19"/>
-              </w:rPr>
-              <w:t xml:space="preserve">Mualliflik ta’rifi «amaliy natijalar» ro‘yxatiga kiritilgan, holbuki bu nazariy natija.</w:t>
+                <w:rFonts w:ascii="Times New Roman" w:hAnsi="Times New Roman" w:eastAsia="Times New Roman" w:cs="Times New Roman"/>
+                <w:b w:val="false"/>
+                <w:bCs w:val="false"/>
+                <w:sz w:val="19"/>
+                <w:szCs w:val="19"/>
+              </w:rPr>
+              <w:t xml:space="preserve">Mualliflik ta’rifi “amaliy natijalar” ro‘yxatiga kiritilgan, holbuki bu nazariy natija.</w:t>
             </w:r>
           </w:p>
         </w:tc>
@@ -7934,7 +7934,7 @@
             </w:pPr>
             <w:r>
               <w:rPr>
-                <w:rFonts w:ascii="Times New Roman" w:cs="Times New Roman" w:eastAsia="Times New Roman" w:hAnsi="Times New Roman"/>
+                <w:rFonts w:ascii="Times New Roman" w:hAnsi="Times New Roman" w:eastAsia="Times New Roman" w:cs="Times New Roman"/>
                 <w:b w:val="false"/>
                 <w:bCs w:val="false"/>
                 <w:sz w:val="19"/>
@@ -7968,7 +7968,7 @@
             </w:pPr>
             <w:r>
               <w:rPr>
-                <w:rFonts w:ascii="Times New Roman" w:cs="Times New Roman" w:eastAsia="Times New Roman" w:hAnsi="Times New Roman"/>
+                <w:rFonts w:ascii="Times New Roman" w:hAnsi="Times New Roman" w:eastAsia="Times New Roman" w:cs="Times New Roman"/>
                 <w:b w:val="false"/>
                 <w:bCs w:val="false"/>
                 <w:sz w:val="19"/>
@@ -7999,14 +7999,14 @@
             <w:pPr/>
             <w:r>
               <w:rPr>
-                <w:rFonts w:ascii="Times New Roman" w:cs="Times New Roman" w:eastAsia="Times New Roman" w:hAnsi="Times New Roman"/>
+                <w:rFonts w:ascii="Times New Roman" w:hAnsi="Times New Roman" w:eastAsia="Times New Roman" w:cs="Times New Roman"/>
                 <w:b w:val="false"/>
                 <w:bCs w:val="false"/>
                 <w:color w:val="FF0000"/>
                 <w:sz w:val="19"/>
                 <w:szCs w:val="19"/>
               </w:rPr>
-              <w:t xml:space="preserve">Tuzatildi. Hal qilindi: mualliflik ta’rifi «amaliy natijalar»dan «ilmiy yangilik»ning birinchi bandiga ko‘chirildi.</w:t>
+              <w:t xml:space="preserve">Tuzatildi. Hal qilindi: mualliflik ta’rifi “amaliy natijalar”dan “ilmiy yangilik”ning birinchi bandiga ko‘chirildi.</w:t>
             </w:r>
           </w:p>
         </w:tc>
@@ -8038,7 +8038,7 @@
             </w:pPr>
             <w:r>
               <w:rPr>
-                <w:rFonts w:ascii="Times New Roman" w:cs="Times New Roman" w:eastAsia="Times New Roman" w:hAnsi="Times New Roman"/>
+                <w:rFonts w:ascii="Times New Roman" w:hAnsi="Times New Roman" w:eastAsia="Times New Roman" w:cs="Times New Roman"/>
                 <w:b w:val="false"/>
                 <w:bCs w:val="false"/>
                 <w:sz w:val="19"/>
@@ -8071,7 +8071,7 @@
             </w:pPr>
             <w:r>
               <w:rPr>
-                <w:rFonts w:ascii="Times New Roman" w:cs="Times New Roman" w:eastAsia="Times New Roman" w:hAnsi="Times New Roman"/>
+                <w:rFonts w:ascii="Times New Roman" w:hAnsi="Times New Roman" w:eastAsia="Times New Roman" w:cs="Times New Roman"/>
                 <w:b w:val="false"/>
                 <w:bCs w:val="false"/>
                 <w:sz w:val="19"/>
@@ -8104,7 +8104,7 @@
             </w:pPr>
             <w:r>
               <w:rPr>
-                <w:rFonts w:ascii="Times New Roman" w:cs="Times New Roman" w:eastAsia="Times New Roman" w:hAnsi="Times New Roman"/>
+                <w:rFonts w:ascii="Times New Roman" w:hAnsi="Times New Roman" w:eastAsia="Times New Roman" w:cs="Times New Roman"/>
                 <w:b w:val="false"/>
                 <w:bCs w:val="false"/>
                 <w:sz w:val="19"/>
@@ -8137,13 +8137,13 @@
             </w:pPr>
             <w:r>
               <w:rPr>
-                <w:rFonts w:ascii="Times New Roman" w:cs="Times New Roman" w:eastAsia="Times New Roman" w:hAnsi="Times New Roman"/>
-                <w:b w:val="false"/>
-                <w:bCs w:val="false"/>
-                <w:sz w:val="19"/>
-                <w:szCs w:val="19"/>
-              </w:rPr>
-              <w:t xml:space="preserve">LCR ni Bazel III ga muvofiqlashtirish yangilik sifatida berilgan, lekin matnda LCR Bazel III bo‘yicha qayta hisoblanmagan. Faqat «banklardagi mablag‘lar ulushi 30,9%» keltirilgan.</w:t>
+                <w:rFonts w:ascii="Times New Roman" w:hAnsi="Times New Roman" w:eastAsia="Times New Roman" w:cs="Times New Roman"/>
+                <w:b w:val="false"/>
+                <w:bCs w:val="false"/>
+                <w:sz w:val="19"/>
+                <w:szCs w:val="19"/>
+              </w:rPr>
+              <w:t xml:space="preserve">LCR ni Bazel III ga muvofiqlashtirish yangilik sifatida berilgan, lekin matnda LCR Bazel III bo‘yicha qayta hisoblanmagan. Faqat “banklardagi mablag‘lar ulushi 30,9%” keltirilgan.</w:t>
             </w:r>
           </w:p>
         </w:tc>
@@ -8170,7 +8170,7 @@
             </w:pPr>
             <w:r>
               <w:rPr>
-                <w:rFonts w:ascii="Times New Roman" w:cs="Times New Roman" w:eastAsia="Times New Roman" w:hAnsi="Times New Roman"/>
+                <w:rFonts w:ascii="Times New Roman" w:hAnsi="Times New Roman" w:eastAsia="Times New Roman" w:cs="Times New Roman"/>
                 <w:b w:val="false"/>
                 <w:bCs w:val="false"/>
                 <w:sz w:val="19"/>
@@ -8204,7 +8204,7 @@
             </w:pPr>
             <w:r>
               <w:rPr>
-                <w:rFonts w:ascii="Times New Roman" w:cs="Times New Roman" w:eastAsia="Times New Roman" w:hAnsi="Times New Roman"/>
+                <w:rFonts w:ascii="Times New Roman" w:hAnsi="Times New Roman" w:eastAsia="Times New Roman" w:cs="Times New Roman"/>
                 <w:b w:val="false"/>
                 <w:bCs w:val="false"/>
                 <w:sz w:val="19"/>
@@ -8235,7 +8235,7 @@
             <w:pPr/>
             <w:r>
               <w:rPr>
-                <w:rFonts w:ascii="Times New Roman" w:cs="Times New Roman" w:eastAsia="Times New Roman" w:hAnsi="Times New Roman"/>
+                <w:rFonts w:ascii="Times New Roman" w:hAnsi="Times New Roman" w:eastAsia="Times New Roman" w:cs="Times New Roman"/>
                 <w:b w:val="false"/>
                 <w:bCs w:val="false"/>
                 <w:color w:val="FF0000"/>
@@ -8274,7 +8274,7 @@
             </w:pPr>
             <w:r>
               <w:rPr>
-                <w:rFonts w:ascii="Times New Roman" w:cs="Times New Roman" w:eastAsia="Times New Roman" w:hAnsi="Times New Roman"/>
+                <w:rFonts w:ascii="Times New Roman" w:hAnsi="Times New Roman" w:eastAsia="Times New Roman" w:cs="Times New Roman"/>
                 <w:b w:val="false"/>
                 <w:bCs w:val="false"/>
                 <w:sz w:val="19"/>
@@ -8307,7 +8307,7 @@
             </w:pPr>
             <w:r>
               <w:rPr>
-                <w:rFonts w:ascii="Times New Roman" w:cs="Times New Roman" w:eastAsia="Times New Roman" w:hAnsi="Times New Roman"/>
+                <w:rFonts w:ascii="Times New Roman" w:hAnsi="Times New Roman" w:eastAsia="Times New Roman" w:cs="Times New Roman"/>
                 <w:b w:val="false"/>
                 <w:bCs w:val="false"/>
                 <w:sz w:val="19"/>
@@ -8340,7 +8340,7 @@
             </w:pPr>
             <w:r>
               <w:rPr>
-                <w:rFonts w:ascii="Times New Roman" w:cs="Times New Roman" w:eastAsia="Times New Roman" w:hAnsi="Times New Roman"/>
+                <w:rFonts w:ascii="Times New Roman" w:hAnsi="Times New Roman" w:eastAsia="Times New Roman" w:cs="Times New Roman"/>
                 <w:b w:val="false"/>
                 <w:bCs w:val="false"/>
                 <w:sz w:val="19"/>
@@ -8373,13 +8373,13 @@
             </w:pPr>
             <w:r>
               <w:rPr>
-                <w:rFonts w:ascii="Times New Roman" w:cs="Times New Roman" w:eastAsia="Times New Roman" w:hAnsi="Times New Roman"/>
-                <w:b w:val="false"/>
-                <w:bCs w:val="false"/>
-                <w:sz w:val="19"/>
-                <w:szCs w:val="19"/>
-              </w:rPr>
-              <w:t xml:space="preserve">Usullar ro‘yxatida «ekspert baholash» bor, lekin ishda ekspert so‘rovi o‘tkazilmagan: vaznlarni muallifning o‘zi belgilagan.</w:t>
+                <w:rFonts w:ascii="Times New Roman" w:hAnsi="Times New Roman" w:eastAsia="Times New Roman" w:cs="Times New Roman"/>
+                <w:b w:val="false"/>
+                <w:bCs w:val="false"/>
+                <w:sz w:val="19"/>
+                <w:szCs w:val="19"/>
+              </w:rPr>
+              <w:t xml:space="preserve">Usullar ro‘yxatida “ekspert baholash” bor, lekin ishda ekspert so‘rovi o‘tkazilmagan: vaznlarni muallifning o‘zi belgilagan.</w:t>
             </w:r>
           </w:p>
         </w:tc>
@@ -8406,13 +8406,13 @@
             </w:pPr>
             <w:r>
               <w:rPr>
-                <w:rFonts w:ascii="Times New Roman" w:cs="Times New Roman" w:eastAsia="Times New Roman" w:hAnsi="Times New Roman"/>
-                <w:b w:val="false"/>
-                <w:bCs w:val="false"/>
-                <w:sz w:val="19"/>
-                <w:szCs w:val="19"/>
-              </w:rPr>
-              <w:t xml:space="preserve">«Ekspert yo‘li bilan (muallif bahosi)» deb aniqlashtiring yoki so‘rov natijasini keltiring.</w:t>
+                <w:rFonts w:ascii="Times New Roman" w:hAnsi="Times New Roman" w:eastAsia="Times New Roman" w:cs="Times New Roman"/>
+                <w:b w:val="false"/>
+                <w:bCs w:val="false"/>
+                <w:sz w:val="19"/>
+                <w:szCs w:val="19"/>
+              </w:rPr>
+              <w:t xml:space="preserve">“Ekspert yo‘li bilan (muallif bahosi)” deb aniqlashtiring yoki so‘rov natijasini keltiring.</w:t>
             </w:r>
           </w:p>
         </w:tc>
@@ -8440,7 +8440,7 @@
             </w:pPr>
             <w:r>
               <w:rPr>
-                <w:rFonts w:ascii="Times New Roman" w:cs="Times New Roman" w:eastAsia="Times New Roman" w:hAnsi="Times New Roman"/>
+                <w:rFonts w:ascii="Times New Roman" w:hAnsi="Times New Roman" w:eastAsia="Times New Roman" w:cs="Times New Roman"/>
                 <w:b w:val="false"/>
                 <w:bCs w:val="false"/>
                 <w:sz w:val="19"/>
@@ -8471,14 +8471,14 @@
             <w:pPr/>
             <w:r>
               <w:rPr>
-                <w:rFonts w:ascii="Times New Roman" w:cs="Times New Roman" w:eastAsia="Times New Roman" w:hAnsi="Times New Roman"/>
+                <w:rFonts w:ascii="Times New Roman" w:hAnsi="Times New Roman" w:eastAsia="Times New Roman" w:cs="Times New Roman"/>
                 <w:b w:val="false"/>
                 <w:bCs w:val="false"/>
                 <w:color w:val="FF0000"/>
                 <w:sz w:val="19"/>
                 <w:szCs w:val="19"/>
               </w:rPr>
-              <w:t xml:space="preserve">Tuzatildi. Hal qilindi: usullar ro‘yxatida «ekspert baholash (vaznlarni muallif belgilashi va ularni entropiya, variatsiya, bosh komponentlar va logit usullari bilan tekshirish), bootstrap va Monte-Karlo» deb aniqlashtirildi.</w:t>
+              <w:t xml:space="preserve">Tuzatildi. Hal qilindi: usullar ro‘yxatida “ekspert baholash (vaznlarni muallif belgilashi va ularni entropiya, variatsiya, bosh komponentlar va logit usullari bilan tekshirish), bootstrap va Monte-Karlo” deb aniqlashtirildi.</w:t>
             </w:r>
           </w:p>
         </w:tc>
@@ -8510,7 +8510,7 @@
             </w:pPr>
             <w:r>
               <w:rPr>
-                <w:rFonts w:ascii="Times New Roman" w:cs="Times New Roman" w:eastAsia="Times New Roman" w:hAnsi="Times New Roman"/>
+                <w:rFonts w:ascii="Times New Roman" w:hAnsi="Times New Roman" w:eastAsia="Times New Roman" w:cs="Times New Roman"/>
                 <w:b w:val="false"/>
                 <w:bCs w:val="false"/>
                 <w:sz w:val="19"/>
@@ -8543,7 +8543,7 @@
             </w:pPr>
             <w:r>
               <w:rPr>
-                <w:rFonts w:ascii="Times New Roman" w:cs="Times New Roman" w:eastAsia="Times New Roman" w:hAnsi="Times New Roman"/>
+                <w:rFonts w:ascii="Times New Roman" w:hAnsi="Times New Roman" w:eastAsia="Times New Roman" w:cs="Times New Roman"/>
                 <w:b w:val="false"/>
                 <w:bCs w:val="false"/>
                 <w:sz w:val="19"/>
@@ -8576,7 +8576,7 @@
             </w:pPr>
             <w:r>
               <w:rPr>
-                <w:rFonts w:ascii="Times New Roman" w:cs="Times New Roman" w:eastAsia="Times New Roman" w:hAnsi="Times New Roman"/>
+                <w:rFonts w:ascii="Times New Roman" w:hAnsi="Times New Roman" w:eastAsia="Times New Roman" w:cs="Times New Roman"/>
                 <w:b w:val="false"/>
                 <w:bCs w:val="false"/>
                 <w:sz w:val="19"/>
@@ -8609,7 +8609,7 @@
             </w:pPr>
             <w:r>
               <w:rPr>
-                <w:rFonts w:ascii="Times New Roman" w:cs="Times New Roman" w:eastAsia="Times New Roman" w:hAnsi="Times New Roman"/>
+                <w:rFonts w:ascii="Times New Roman" w:hAnsi="Times New Roman" w:eastAsia="Times New Roman" w:cs="Times New Roman"/>
                 <w:b w:val="false"/>
                 <w:bCs w:val="false"/>
                 <w:sz w:val="19"/>
@@ -8642,7 +8642,7 @@
             </w:pPr>
             <w:r>
               <w:rPr>
-                <w:rFonts w:ascii="Times New Roman" w:cs="Times New Roman" w:eastAsia="Times New Roman" w:hAnsi="Times New Roman"/>
+                <w:rFonts w:ascii="Times New Roman" w:hAnsi="Times New Roman" w:eastAsia="Times New Roman" w:cs="Times New Roman"/>
                 <w:b w:val="false"/>
                 <w:bCs w:val="false"/>
                 <w:sz w:val="19"/>
@@ -8676,7 +8676,7 @@
             </w:pPr>
             <w:r>
               <w:rPr>
-                <w:rFonts w:ascii="Times New Roman" w:cs="Times New Roman" w:eastAsia="Times New Roman" w:hAnsi="Times New Roman"/>
+                <w:rFonts w:ascii="Times New Roman" w:hAnsi="Times New Roman" w:eastAsia="Times New Roman" w:cs="Times New Roman"/>
                 <w:b w:val="false"/>
                 <w:bCs w:val="false"/>
                 <w:sz w:val="19"/>
@@ -8707,7 +8707,7 @@
             <w:pPr/>
             <w:r>
               <w:rPr>
-                <w:rFonts w:ascii="Times New Roman" w:cs="Times New Roman" w:eastAsia="Times New Roman" w:hAnsi="Times New Roman"/>
+                <w:rFonts w:ascii="Times New Roman" w:hAnsi="Times New Roman" w:eastAsia="Times New Roman" w:cs="Times New Roman"/>
                 <w:b w:val="false"/>
                 <w:bCs w:val="false"/>
                 <w:color w:val="FF0000"/>
@@ -8746,7 +8746,7 @@
             </w:pPr>
             <w:r>
               <w:rPr>
-                <w:rFonts w:ascii="Times New Roman" w:cs="Times New Roman" w:eastAsia="Times New Roman" w:hAnsi="Times New Roman"/>
+                <w:rFonts w:ascii="Times New Roman" w:hAnsi="Times New Roman" w:eastAsia="Times New Roman" w:cs="Times New Roman"/>
                 <w:b w:val="false"/>
                 <w:bCs w:val="false"/>
                 <w:sz w:val="19"/>
@@ -8779,7 +8779,7 @@
             </w:pPr>
             <w:r>
               <w:rPr>
-                <w:rFonts w:ascii="Times New Roman" w:cs="Times New Roman" w:eastAsia="Times New Roman" w:hAnsi="Times New Roman"/>
+                <w:rFonts w:ascii="Times New Roman" w:hAnsi="Times New Roman" w:eastAsia="Times New Roman" w:cs="Times New Roman"/>
                 <w:b w:val="false"/>
                 <w:bCs w:val="false"/>
                 <w:sz w:val="19"/>
@@ -8812,7 +8812,7 @@
             </w:pPr>
             <w:r>
               <w:rPr>
-                <w:rFonts w:ascii="Times New Roman" w:cs="Times New Roman" w:eastAsia="Times New Roman" w:hAnsi="Times New Roman"/>
+                <w:rFonts w:ascii="Times New Roman" w:hAnsi="Times New Roman" w:eastAsia="Times New Roman" w:cs="Times New Roman"/>
                 <w:b w:val="false"/>
                 <w:bCs w:val="false"/>
                 <w:sz w:val="19"/>
@@ -8845,13 +8845,13 @@
             </w:pPr>
             <w:r>
               <w:rPr>
-                <w:rFonts w:ascii="Times New Roman" w:cs="Times New Roman" w:eastAsia="Times New Roman" w:hAnsi="Times New Roman"/>
-                <w:b w:val="false"/>
-                <w:bCs w:val="false"/>
-                <w:sz w:val="19"/>
-                <w:szCs w:val="19"/>
-              </w:rPr>
-              <w:t xml:space="preserve">Bank prudensial hisobot shakllaridan (crs003C, crs005C va boshqalar) foydalanilgan. Bu shakllar ochiq e’lon qilinmaydi. Ish esa «ochiq ma’lumotlarga asoslangan metodika» deb taqdim etilgan.</w:t>
+                <w:rFonts w:ascii="Times New Roman" w:hAnsi="Times New Roman" w:eastAsia="Times New Roman" w:cs="Times New Roman"/>
+                <w:b w:val="false"/>
+                <w:bCs w:val="false"/>
+                <w:sz w:val="19"/>
+                <w:szCs w:val="19"/>
+              </w:rPr>
+              <w:t xml:space="preserve">Bank prudensial hisobot shakllaridan (crs003C, crs005C va boshqalar) foydalanilgan. Bu shakllar ochiq e’lon qilinmaydi. Ish esa “ochiq ma’lumotlarga asoslangan metodika” deb taqdim etilgan.</w:t>
             </w:r>
           </w:p>
         </w:tc>
@@ -8878,7 +8878,7 @@
             </w:pPr>
             <w:r>
               <w:rPr>
-                <w:rFonts w:ascii="Times New Roman" w:cs="Times New Roman" w:eastAsia="Times New Roman" w:hAnsi="Times New Roman"/>
+                <w:rFonts w:ascii="Times New Roman" w:hAnsi="Times New Roman" w:eastAsia="Times New Roman" w:cs="Times New Roman"/>
                 <w:b w:val="false"/>
                 <w:bCs w:val="false"/>
                 <w:sz w:val="19"/>
@@ -8912,7 +8912,7 @@
             </w:pPr>
             <w:r>
               <w:rPr>
-                <w:rFonts w:ascii="Times New Roman" w:cs="Times New Roman" w:eastAsia="Times New Roman" w:hAnsi="Times New Roman"/>
+                <w:rFonts w:ascii="Times New Roman" w:hAnsi="Times New Roman" w:eastAsia="Times New Roman" w:cs="Times New Roman"/>
                 <w:b w:val="false"/>
                 <w:bCs w:val="false"/>
                 <w:sz w:val="19"/>
@@ -8943,14 +8943,14 @@
             <w:pPr/>
             <w:r>
               <w:rPr>
-                <w:rFonts w:ascii="Times New Roman" w:cs="Times New Roman" w:eastAsia="Times New Roman" w:hAnsi="Times New Roman"/>
+                <w:rFonts w:ascii="Times New Roman" w:hAnsi="Times New Roman" w:eastAsia="Times New Roman" w:cs="Times New Roman"/>
                 <w:b w:val="false"/>
                 <w:bCs w:val="false"/>
                 <w:color w:val="FF0000"/>
                 <w:sz w:val="19"/>
                 <w:szCs w:val="19"/>
               </w:rPr>
-              <w:t xml:space="preserve">Tuzatildi. Hal qilindi: 2.3-§ ga ochiq/yopiq ma’lumotlar chegarasi va takrorlanuvchanlik izohi qo‘shildi («banklarning ruxsati bilan» – muallif tasdiqlashi kerak).</w:t>
+              <w:t xml:space="preserve">Tuzatildi. Hal qilindi: 2.3-§ ga ochiq/yopiq ma’lumotlar chegarasi va takrorlanuvchanlik izohi qo‘shildi (“banklarning ruxsati bilan” – muallif tasdiqlashi kerak).</w:t>
             </w:r>
           </w:p>
         </w:tc>
@@ -8982,7 +8982,7 @@
             </w:pPr>
             <w:r>
               <w:rPr>
-                <w:rFonts w:ascii="Times New Roman" w:cs="Times New Roman" w:eastAsia="Times New Roman" w:hAnsi="Times New Roman"/>
+                <w:rFonts w:ascii="Times New Roman" w:hAnsi="Times New Roman" w:eastAsia="Times New Roman" w:cs="Times New Roman"/>
                 <w:b w:val="false"/>
                 <w:bCs w:val="false"/>
                 <w:sz w:val="19"/>
@@ -9015,7 +9015,7 @@
             </w:pPr>
             <w:r>
               <w:rPr>
-                <w:rFonts w:ascii="Times New Roman" w:cs="Times New Roman" w:eastAsia="Times New Roman" w:hAnsi="Times New Roman"/>
+                <w:rFonts w:ascii="Times New Roman" w:hAnsi="Times New Roman" w:eastAsia="Times New Roman" w:cs="Times New Roman"/>
                 <w:b w:val="false"/>
                 <w:bCs w:val="false"/>
                 <w:sz w:val="19"/>
@@ -9048,7 +9048,7 @@
             </w:pPr>
             <w:r>
               <w:rPr>
-                <w:rFonts w:ascii="Times New Roman" w:cs="Times New Roman" w:eastAsia="Times New Roman" w:hAnsi="Times New Roman"/>
+                <w:rFonts w:ascii="Times New Roman" w:hAnsi="Times New Roman" w:eastAsia="Times New Roman" w:cs="Times New Roman"/>
                 <w:b w:val="false"/>
                 <w:bCs w:val="false"/>
                 <w:sz w:val="19"/>
@@ -9081,7 +9081,7 @@
             </w:pPr>
             <w:r>
               <w:rPr>
-                <w:rFonts w:ascii="Times New Roman" w:cs="Times New Roman" w:eastAsia="Times New Roman" w:hAnsi="Times New Roman"/>
+                <w:rFonts w:ascii="Times New Roman" w:hAnsi="Times New Roman" w:eastAsia="Times New Roman" w:cs="Times New Roman"/>
                 <w:b w:val="false"/>
                 <w:bCs w:val="false"/>
                 <w:sz w:val="19"/>
@@ -9114,13 +9114,13 @@
             </w:pPr>
             <w:r>
               <w:rPr>
-                <w:rFonts w:ascii="Times New Roman" w:cs="Times New Roman" w:eastAsia="Times New Roman" w:hAnsi="Times New Roman"/>
-                <w:b w:val="false"/>
-                <w:bCs w:val="false"/>
-                <w:sz w:val="19"/>
-                <w:szCs w:val="19"/>
-              </w:rPr>
-              <w:t xml:space="preserve">Bu cheklovni «prognoz» emas, «sezgirlik/stress-ssenariy» deb nomlash bilan aniq ko‘rsating. Kapitalga ta’sirni (zaxira → foyda → kapital) ham qo‘shish tavsiya etiladi.</w:t>
+                <w:rFonts w:ascii="Times New Roman" w:hAnsi="Times New Roman" w:eastAsia="Times New Roman" w:cs="Times New Roman"/>
+                <w:b w:val="false"/>
+                <w:bCs w:val="false"/>
+                <w:sz w:val="19"/>
+                <w:szCs w:val="19"/>
+              </w:rPr>
+              <w:t xml:space="preserve">Bu cheklovni “prognoz” emas, “sezgirlik/stress-ssenariy” deb nomlash bilan aniq ko‘rsating. Kapitalga ta’sirni (zaxira → foyda → kapital) ham qo‘shish tavsiya etiladi.</w:t>
             </w:r>
           </w:p>
         </w:tc>
@@ -9148,7 +9148,7 @@
             </w:pPr>
             <w:r>
               <w:rPr>
-                <w:rFonts w:ascii="Times New Roman" w:cs="Times New Roman" w:eastAsia="Times New Roman" w:hAnsi="Times New Roman"/>
+                <w:rFonts w:ascii="Times New Roman" w:hAnsi="Times New Roman" w:eastAsia="Times New Roman" w:cs="Times New Roman"/>
                 <w:b w:val="false"/>
                 <w:bCs w:val="false"/>
                 <w:sz w:val="19"/>
@@ -9179,14 +9179,14 @@
             <w:pPr/>
             <w:r>
               <w:rPr>
-                <w:rFonts w:ascii="Times New Roman" w:cs="Times New Roman" w:eastAsia="Times New Roman" w:hAnsi="Times New Roman"/>
+                <w:rFonts w:ascii="Times New Roman" w:hAnsi="Times New Roman" w:eastAsia="Times New Roman" w:cs="Times New Roman"/>
                 <w:b w:val="false"/>
                 <w:bCs w:val="false"/>
                 <w:color w:val="FF0000"/>
                 <w:sz w:val="19"/>
                 <w:szCs w:val="19"/>
               </w:rPr>
-              <w:t xml:space="preserve">Tuzatildi. Hal qilindi (kapkanal_kam.py): ssenariylarga kapital kanali qo‘shilib tekshirildi – MBII ko‘pi bilan 0,04 ballga pasayadi, keskin salbiy ssenariyda qizil banklar soni o‘zgarmaydi (4 ta), faqat salbiy 2028 da MKB sariqdan qizilga o‘tadi (2,755 → 2,747). 4.2-§ cheklovlariga yozildi va natija «sezgirlik (stress-ssenariy) tahlili» deb belgilandi. Paragraf nomi o‘zgartirilmadi (muallif xohlasa «ssenariy prognozi» deb o‘zgartirishi mumkin).</w:t>
+              <w:t xml:space="preserve">Tuzatildi. Hal qilindi (kapkanal_kam.py): ssenariylarga kapital kanali qo‘shilib tekshirildi – MBII ko‘pi bilan 0,04 ballga pasayadi, keskin salbiy ssenariyda qizil banklar soni o‘zgarmaydi (4 ta), faqat salbiy 2028 da MKB sariqdan qizilga o‘tadi (2,755 → 2,747). 4.2-§ cheklovlariga yozildi va natija “sezgirlik (stress-ssenariy) tahlili” deb belgilandi. Paragraf nomi o‘zgartirilmadi (muallif xohlasa “ssenariy prognozi” deb o‘zgartirishi mumkin).</w:t>
             </w:r>
           </w:p>
         </w:tc>
@@ -9218,7 +9218,7 @@
             </w:pPr>
             <w:r>
               <w:rPr>
-                <w:rFonts w:ascii="Times New Roman" w:cs="Times New Roman" w:eastAsia="Times New Roman" w:hAnsi="Times New Roman"/>
+                <w:rFonts w:ascii="Times New Roman" w:hAnsi="Times New Roman" w:eastAsia="Times New Roman" w:cs="Times New Roman"/>
                 <w:b w:val="false"/>
                 <w:bCs w:val="false"/>
                 <w:sz w:val="19"/>
@@ -9251,7 +9251,7 @@
             </w:pPr>
             <w:r>
               <w:rPr>
-                <w:rFonts w:ascii="Times New Roman" w:cs="Times New Roman" w:eastAsia="Times New Roman" w:hAnsi="Times New Roman"/>
+                <w:rFonts w:ascii="Times New Roman" w:hAnsi="Times New Roman" w:eastAsia="Times New Roman" w:cs="Times New Roman"/>
                 <w:b w:val="false"/>
                 <w:bCs w:val="false"/>
                 <w:sz w:val="19"/>
@@ -9284,7 +9284,7 @@
             </w:pPr>
             <w:r>
               <w:rPr>
-                <w:rFonts w:ascii="Times New Roman" w:cs="Times New Roman" w:eastAsia="Times New Roman" w:hAnsi="Times New Roman"/>
+                <w:rFonts w:ascii="Times New Roman" w:hAnsi="Times New Roman" w:eastAsia="Times New Roman" w:cs="Times New Roman"/>
                 <w:b w:val="false"/>
                 <w:bCs w:val="false"/>
                 <w:sz w:val="19"/>
@@ -9317,13 +9317,13 @@
             </w:pPr>
             <w:r>
               <w:rPr>
-                <w:rFonts w:ascii="Times New Roman" w:cs="Times New Roman" w:eastAsia="Times New Roman" w:hAnsi="Times New Roman"/>
-                <w:b w:val="false"/>
-                <w:bCs w:val="false"/>
-                <w:sz w:val="19"/>
-                <w:szCs w:val="19"/>
-              </w:rPr>
-              <w:t xml:space="preserve">«Yevropa bank boshqarmasi 2009-yildan buyon ma’lumot yig‘adi» deyilgan, lekin EBA 2011-yilda tashkil etilgan.</w:t>
+                <w:rFonts w:ascii="Times New Roman" w:hAnsi="Times New Roman" w:eastAsia="Times New Roman" w:cs="Times New Roman"/>
+                <w:b w:val="false"/>
+                <w:bCs w:val="false"/>
+                <w:sz w:val="19"/>
+                <w:szCs w:val="19"/>
+              </w:rPr>
+              <w:t xml:space="preserve">“Yevropa bank boshqarmasi 2009-yildan buyon ma’lumot yig‘adi” deyilgan, lekin EBA 2011-yilda tashkil etilgan.</w:t>
             </w:r>
           </w:p>
         </w:tc>
@@ -9350,7 +9350,7 @@
             </w:pPr>
             <w:r>
               <w:rPr>
-                <w:rFonts w:ascii="Times New Roman" w:cs="Times New Roman" w:eastAsia="Times New Roman" w:hAnsi="Times New Roman"/>
+                <w:rFonts w:ascii="Times New Roman" w:hAnsi="Times New Roman" w:eastAsia="Times New Roman" w:cs="Times New Roman"/>
                 <w:b w:val="false"/>
                 <w:bCs w:val="false"/>
                 <w:sz w:val="19"/>
@@ -9384,7 +9384,7 @@
             </w:pPr>
             <w:r>
               <w:rPr>
-                <w:rFonts w:ascii="Times New Roman" w:cs="Times New Roman" w:eastAsia="Times New Roman" w:hAnsi="Times New Roman"/>
+                <w:rFonts w:ascii="Times New Roman" w:hAnsi="Times New Roman" w:eastAsia="Times New Roman" w:cs="Times New Roman"/>
                 <w:b w:val="false"/>
                 <w:bCs w:val="false"/>
                 <w:sz w:val="19"/>
@@ -9415,7 +9415,7 @@
             <w:pPr/>
             <w:r>
               <w:rPr>
-                <w:rFonts w:ascii="Times New Roman" w:cs="Times New Roman" w:eastAsia="Times New Roman" w:hAnsi="Times New Roman"/>
+                <w:rFonts w:ascii="Times New Roman" w:hAnsi="Times New Roman" w:eastAsia="Times New Roman" w:cs="Times New Roman"/>
                 <w:b w:val="false"/>
                 <w:bCs w:val="false"/>
                 <w:color w:val="FF0000"/>
@@ -9454,7 +9454,7 @@
             </w:pPr>
             <w:r>
               <w:rPr>
-                <w:rFonts w:ascii="Times New Roman" w:cs="Times New Roman" w:eastAsia="Times New Roman" w:hAnsi="Times New Roman"/>
+                <w:rFonts w:ascii="Times New Roman" w:hAnsi="Times New Roman" w:eastAsia="Times New Roman" w:cs="Times New Roman"/>
                 <w:b w:val="false"/>
                 <w:bCs w:val="false"/>
                 <w:sz w:val="19"/>
@@ -9487,7 +9487,7 @@
             </w:pPr>
             <w:r>
               <w:rPr>
-                <w:rFonts w:ascii="Times New Roman" w:cs="Times New Roman" w:eastAsia="Times New Roman" w:hAnsi="Times New Roman"/>
+                <w:rFonts w:ascii="Times New Roman" w:hAnsi="Times New Roman" w:eastAsia="Times New Roman" w:cs="Times New Roman"/>
                 <w:b w:val="false"/>
                 <w:bCs w:val="false"/>
                 <w:sz w:val="19"/>
@@ -9520,7 +9520,7 @@
             </w:pPr>
             <w:r>
               <w:rPr>
-                <w:rFonts w:ascii="Times New Roman" w:cs="Times New Roman" w:eastAsia="Times New Roman" w:hAnsi="Times New Roman"/>
+                <w:rFonts w:ascii="Times New Roman" w:hAnsi="Times New Roman" w:eastAsia="Times New Roman" w:cs="Times New Roman"/>
                 <w:b w:val="false"/>
                 <w:bCs w:val="false"/>
                 <w:sz w:val="19"/>
@@ -9553,13 +9553,13 @@
             </w:pPr>
             <w:r>
               <w:rPr>
-                <w:rFonts w:ascii="Times New Roman" w:cs="Times New Roman" w:eastAsia="Times New Roman" w:hAnsi="Times New Roman"/>
-                <w:b w:val="false"/>
-                <w:bCs w:val="false"/>
-                <w:sz w:val="19"/>
-                <w:szCs w:val="19"/>
-              </w:rPr>
-              <w:t xml:space="preserve">Uch joyda havola noto‘g‘ri: «2.3-paragrafda ko‘rsatilganidek» (to‘g‘risi 2.1-§), «1.2-paragrafda ko‘rib chiqilgan prosiklik» (bu masala 2.3-§ boshida, Abad–Suarez misolida ko‘rilgan) va keyingi bobga «ko‘rsatilganidek» deb havola.</w:t>
+                <w:rFonts w:ascii="Times New Roman" w:hAnsi="Times New Roman" w:eastAsia="Times New Roman" w:cs="Times New Roman"/>
+                <w:b w:val="false"/>
+                <w:bCs w:val="false"/>
+                <w:sz w:val="19"/>
+                <w:szCs w:val="19"/>
+              </w:rPr>
+              <w:t xml:space="preserve">Uch joyda havola noto‘g‘ri: “2.3-paragrafda ko‘rsatilganidek” (to‘g‘risi 2.1-§), “1.2-paragrafda ko‘rib chiqilgan prosiklik” (bu masala 2.3-§ boshida, Abad–Suarez misolida ko‘rilgan) va keyingi bobga “ko‘rsatilganidek” deb havola.</w:t>
             </w:r>
           </w:p>
         </w:tc>
@@ -9586,7 +9586,7 @@
             </w:pPr>
             <w:r>
               <w:rPr>
-                <w:rFonts w:ascii="Times New Roman" w:cs="Times New Roman" w:eastAsia="Times New Roman" w:hAnsi="Times New Roman"/>
+                <w:rFonts w:ascii="Times New Roman" w:hAnsi="Times New Roman" w:eastAsia="Times New Roman" w:cs="Times New Roman"/>
                 <w:b w:val="false"/>
                 <w:bCs w:val="false"/>
                 <w:sz w:val="19"/>
@@ -9620,7 +9620,7 @@
             </w:pPr>
             <w:r>
               <w:rPr>
-                <w:rFonts w:ascii="Times New Roman" w:cs="Times New Roman" w:eastAsia="Times New Roman" w:hAnsi="Times New Roman"/>
+                <w:rFonts w:ascii="Times New Roman" w:hAnsi="Times New Roman" w:eastAsia="Times New Roman" w:cs="Times New Roman"/>
                 <w:b w:val="false"/>
                 <w:bCs w:val="false"/>
                 <w:sz w:val="19"/>
@@ -9651,7 +9651,7 @@
             <w:pPr/>
             <w:r>
               <w:rPr>
-                <w:rFonts w:ascii="Times New Roman" w:cs="Times New Roman" w:eastAsia="Times New Roman" w:hAnsi="Times New Roman"/>
+                <w:rFonts w:ascii="Times New Roman" w:hAnsi="Times New Roman" w:eastAsia="Times New Roman" w:cs="Times New Roman"/>
                 <w:b w:val="false"/>
                 <w:bCs w:val="false"/>
                 <w:color w:val="FF0000"/>
@@ -9690,7 +9690,7 @@
             </w:pPr>
             <w:r>
               <w:rPr>
-                <w:rFonts w:ascii="Times New Roman" w:cs="Times New Roman" w:eastAsia="Times New Roman" w:hAnsi="Times New Roman"/>
+                <w:rFonts w:ascii="Times New Roman" w:hAnsi="Times New Roman" w:eastAsia="Times New Roman" w:cs="Times New Roman"/>
                 <w:b w:val="false"/>
                 <w:bCs w:val="false"/>
                 <w:sz w:val="19"/>
@@ -9723,7 +9723,7 @@
             </w:pPr>
             <w:r>
               <w:rPr>
-                <w:rFonts w:ascii="Times New Roman" w:cs="Times New Roman" w:eastAsia="Times New Roman" w:hAnsi="Times New Roman"/>
+                <w:rFonts w:ascii="Times New Roman" w:hAnsi="Times New Roman" w:eastAsia="Times New Roman" w:cs="Times New Roman"/>
                 <w:b w:val="false"/>
                 <w:bCs w:val="false"/>
                 <w:sz w:val="19"/>
@@ -9756,7 +9756,7 @@
             </w:pPr>
             <w:r>
               <w:rPr>
-                <w:rFonts w:ascii="Times New Roman" w:cs="Times New Roman" w:eastAsia="Times New Roman" w:hAnsi="Times New Roman"/>
+                <w:rFonts w:ascii="Times New Roman" w:hAnsi="Times New Roman" w:eastAsia="Times New Roman" w:cs="Times New Roman"/>
                 <w:b w:val="false"/>
                 <w:bCs w:val="false"/>
                 <w:sz w:val="19"/>
@@ -9789,13 +9789,13 @@
             </w:pPr>
             <w:r>
               <w:rPr>
-                <w:rFonts w:ascii="Times New Roman" w:cs="Times New Roman" w:eastAsia="Times New Roman" w:hAnsi="Times New Roman"/>
-                <w:b w:val="false"/>
-                <w:bCs w:val="false"/>
-                <w:sz w:val="19"/>
-                <w:szCs w:val="19"/>
-              </w:rPr>
-              <w:t xml:space="preserve">Faqat 2.1-§ da raqamlangan kichik sarlavhalar va «Paragraf bo‘yicha xulosa» sarlavhasi bor, boshqa paragraflarda yo‘q.</w:t>
+                <w:rFonts w:ascii="Times New Roman" w:hAnsi="Times New Roman" w:eastAsia="Times New Roman" w:cs="Times New Roman"/>
+                <w:b w:val="false"/>
+                <w:bCs w:val="false"/>
+                <w:sz w:val="19"/>
+                <w:szCs w:val="19"/>
+              </w:rPr>
+              <w:t xml:space="preserve">Faqat 2.1-§ da raqamlangan kichik sarlavhalar va “Paragraf bo‘yicha xulosa” sarlavhasi bor, boshqa paragraflarda yo‘q.</w:t>
             </w:r>
           </w:p>
         </w:tc>
@@ -9822,7 +9822,7 @@
             </w:pPr>
             <w:r>
               <w:rPr>
-                <w:rFonts w:ascii="Times New Roman" w:cs="Times New Roman" w:eastAsia="Times New Roman" w:hAnsi="Times New Roman"/>
+                <w:rFonts w:ascii="Times New Roman" w:hAnsi="Times New Roman" w:eastAsia="Times New Roman" w:cs="Times New Roman"/>
                 <w:b w:val="false"/>
                 <w:bCs w:val="false"/>
                 <w:sz w:val="19"/>
@@ -9856,7 +9856,7 @@
             </w:pPr>
             <w:r>
               <w:rPr>
-                <w:rFonts w:ascii="Times New Roman" w:cs="Times New Roman" w:eastAsia="Times New Roman" w:hAnsi="Times New Roman"/>
+                <w:rFonts w:ascii="Times New Roman" w:hAnsi="Times New Roman" w:eastAsia="Times New Roman" w:cs="Times New Roman"/>
                 <w:b w:val="false"/>
                 <w:bCs w:val="false"/>
                 <w:sz w:val="19"/>
@@ -9887,14 +9887,14 @@
             <w:pPr/>
             <w:r>
               <w:rPr>
-                <w:rFonts w:ascii="Times New Roman" w:cs="Times New Roman" w:eastAsia="Times New Roman" w:hAnsi="Times New Roman"/>
+                <w:rFonts w:ascii="Times New Roman" w:hAnsi="Times New Roman" w:eastAsia="Times New Roman" w:cs="Times New Roman"/>
                 <w:b w:val="false"/>
                 <w:bCs w:val="false"/>
                 <w:color w:val="FF0000"/>
                 <w:sz w:val="19"/>
                 <w:szCs w:val="19"/>
               </w:rPr>
-              <w:t xml:space="preserve">Tuzatildi. Hal qilindi: 2.1-§ dagi raqamlangan kichik sarlavhalar va «Paragraf bo‘yicha xulosa» sarlavhasi olib tashlandi, xulosa boshqa paragraflardagi kabi «…tadqiq etgan holda xulosa qilish mumkinki» shaklida yozildi (mundarijani F9 bilan yangilang).</w:t>
+              <w:t xml:space="preserve">Tuzatildi. Hal qilindi: 2.1-§ dagi raqamlangan kichik sarlavhalar va “Paragraf bo‘yicha xulosa” sarlavhasi olib tashlandi, xulosa boshqa paragraflardagi kabi “…tadqiq etgan holda xulosa qilish mumkinki” shaklida yozildi (mundarijani F9 bilan yangilang).</w:t>
             </w:r>
           </w:p>
         </w:tc>
@@ -9925,7 +9925,7 @@
             </w:pPr>
             <w:r>
               <w:rPr>
-                <w:rFonts w:ascii="Times New Roman" w:cs="Times New Roman" w:eastAsia="Times New Roman" w:hAnsi="Times New Roman"/>
+                <w:rFonts w:ascii="Times New Roman" w:hAnsi="Times New Roman" w:eastAsia="Times New Roman" w:cs="Times New Roman"/>
                 <w:b/>
                 <w:bCs/>
                 <w:sz w:val="21"/>
@@ -9963,7 +9963,7 @@
             </w:pPr>
             <w:r>
               <w:rPr>
-                <w:rFonts w:ascii="Times New Roman" w:cs="Times New Roman" w:eastAsia="Times New Roman" w:hAnsi="Times New Roman"/>
+                <w:rFonts w:ascii="Times New Roman" w:hAnsi="Times New Roman" w:eastAsia="Times New Roman" w:cs="Times New Roman"/>
                 <w:b w:val="false"/>
                 <w:bCs w:val="false"/>
                 <w:sz w:val="19"/>
@@ -9996,7 +9996,7 @@
             </w:pPr>
             <w:r>
               <w:rPr>
-                <w:rFonts w:ascii="Times New Roman" w:cs="Times New Roman" w:eastAsia="Times New Roman" w:hAnsi="Times New Roman"/>
+                <w:rFonts w:ascii="Times New Roman" w:hAnsi="Times New Roman" w:eastAsia="Times New Roman" w:cs="Times New Roman"/>
                 <w:b w:val="false"/>
                 <w:bCs w:val="false"/>
                 <w:sz w:val="19"/>
@@ -10029,7 +10029,7 @@
             </w:pPr>
             <w:r>
               <w:rPr>
-                <w:rFonts w:ascii="Times New Roman" w:cs="Times New Roman" w:eastAsia="Times New Roman" w:hAnsi="Times New Roman"/>
+                <w:rFonts w:ascii="Times New Roman" w:hAnsi="Times New Roman" w:eastAsia="Times New Roman" w:cs="Times New Roman"/>
                 <w:b w:val="false"/>
                 <w:bCs w:val="false"/>
                 <w:sz w:val="19"/>
@@ -10062,7 +10062,7 @@
             </w:pPr>
             <w:r>
               <w:rPr>
-                <w:rFonts w:ascii="Times New Roman" w:cs="Times New Roman" w:eastAsia="Times New Roman" w:hAnsi="Times New Roman"/>
+                <w:rFonts w:ascii="Times New Roman" w:hAnsi="Times New Roman" w:eastAsia="Times New Roman" w:cs="Times New Roman"/>
                 <w:b w:val="false"/>
                 <w:bCs w:val="false"/>
                 <w:sz w:val="19"/>
@@ -10095,7 +10095,7 @@
             </w:pPr>
             <w:r>
               <w:rPr>
-                <w:rFonts w:ascii="Times New Roman" w:cs="Times New Roman" w:eastAsia="Times New Roman" w:hAnsi="Times New Roman"/>
+                <w:rFonts w:ascii="Times New Roman" w:hAnsi="Times New Roman" w:eastAsia="Times New Roman" w:cs="Times New Roman"/>
                 <w:b w:val="false"/>
                 <w:bCs w:val="false"/>
                 <w:sz w:val="19"/>
@@ -10129,7 +10129,7 @@
             </w:pPr>
             <w:r>
               <w:rPr>
-                <w:rFonts w:ascii="Times New Roman" w:cs="Times New Roman" w:eastAsia="Times New Roman" w:hAnsi="Times New Roman"/>
+                <w:rFonts w:ascii="Times New Roman" w:hAnsi="Times New Roman" w:eastAsia="Times New Roman" w:cs="Times New Roman"/>
                 <w:b w:val="false"/>
                 <w:bCs w:val="false"/>
                 <w:sz w:val="19"/>
@@ -10160,7 +10160,7 @@
             <w:pPr/>
             <w:r>
               <w:rPr>
-                <w:rFonts w:ascii="Times New Roman" w:cs="Times New Roman" w:eastAsia="Times New Roman" w:hAnsi="Times New Roman"/>
+                <w:rFonts w:ascii="Times New Roman" w:hAnsi="Times New Roman" w:eastAsia="Times New Roman" w:cs="Times New Roman"/>
                 <w:b w:val="false"/>
                 <w:bCs w:val="false"/>
                 <w:color w:val="FF0000"/>
@@ -10199,7 +10199,7 @@
             </w:pPr>
             <w:r>
               <w:rPr>
-                <w:rFonts w:ascii="Times New Roman" w:cs="Times New Roman" w:eastAsia="Times New Roman" w:hAnsi="Times New Roman"/>
+                <w:rFonts w:ascii="Times New Roman" w:hAnsi="Times New Roman" w:eastAsia="Times New Roman" w:cs="Times New Roman"/>
                 <w:b w:val="false"/>
                 <w:bCs w:val="false"/>
                 <w:sz w:val="19"/>
@@ -10232,7 +10232,7 @@
             </w:pPr>
             <w:r>
               <w:rPr>
-                <w:rFonts w:ascii="Times New Roman" w:cs="Times New Roman" w:eastAsia="Times New Roman" w:hAnsi="Times New Roman"/>
+                <w:rFonts w:ascii="Times New Roman" w:hAnsi="Times New Roman" w:eastAsia="Times New Roman" w:cs="Times New Roman"/>
                 <w:b w:val="false"/>
                 <w:bCs w:val="false"/>
                 <w:sz w:val="19"/>
@@ -10265,7 +10265,7 @@
             </w:pPr>
             <w:r>
               <w:rPr>
-                <w:rFonts w:ascii="Times New Roman" w:cs="Times New Roman" w:eastAsia="Times New Roman" w:hAnsi="Times New Roman"/>
+                <w:rFonts w:ascii="Times New Roman" w:hAnsi="Times New Roman" w:eastAsia="Times New Roman" w:cs="Times New Roman"/>
                 <w:b w:val="false"/>
                 <w:bCs w:val="false"/>
                 <w:sz w:val="19"/>
@@ -10298,13 +10298,13 @@
             </w:pPr>
             <w:r>
               <w:rPr>
-                <w:rFonts w:ascii="Times New Roman" w:cs="Times New Roman" w:eastAsia="Times New Roman" w:hAnsi="Times New Roman"/>
-                <w:b w:val="false"/>
-                <w:bCs w:val="false"/>
-                <w:sz w:val="19"/>
-                <w:szCs w:val="19"/>
-              </w:rPr>
-              <w:t xml:space="preserve">«Jadal o‘sdi … ammo davlat ulushi»; «ulushi … ulushi» takrori; 2026 va 2024-yil ko‘rsatkichlari bir qarama-qarshi gapda aralashgan.</w:t>
+                <w:rFonts w:ascii="Times New Roman" w:hAnsi="Times New Roman" w:eastAsia="Times New Roman" w:cs="Times New Roman"/>
+                <w:b w:val="false"/>
+                <w:bCs w:val="false"/>
+                <w:sz w:val="19"/>
+                <w:szCs w:val="19"/>
+              </w:rPr>
+              <w:t xml:space="preserve">“Jadal o‘sdi … ammo davlat ulushi”; “ulushi … ulushi” takrori; 2026 va 2024-yil ko‘rsatkichlari bir qarama-qarshi gapda aralashgan.</w:t>
             </w:r>
           </w:p>
         </w:tc>
@@ -10331,7 +10331,7 @@
             </w:pPr>
             <w:r>
               <w:rPr>
-                <w:rFonts w:ascii="Times New Roman" w:cs="Times New Roman" w:eastAsia="Times New Roman" w:hAnsi="Times New Roman"/>
+                <w:rFonts w:ascii="Times New Roman" w:hAnsi="Times New Roman" w:eastAsia="Times New Roman" w:cs="Times New Roman"/>
                 <w:b w:val="false"/>
                 <w:bCs w:val="false"/>
                 <w:sz w:val="19"/>
@@ -10365,7 +10365,7 @@
             </w:pPr>
             <w:r>
               <w:rPr>
-                <w:rFonts w:ascii="Times New Roman" w:cs="Times New Roman" w:eastAsia="Times New Roman" w:hAnsi="Times New Roman"/>
+                <w:rFonts w:ascii="Times New Roman" w:hAnsi="Times New Roman" w:eastAsia="Times New Roman" w:cs="Times New Roman"/>
                 <w:b w:val="false"/>
                 <w:bCs w:val="false"/>
                 <w:sz w:val="19"/>
@@ -10396,7 +10396,7 @@
             <w:pPr/>
             <w:r>
               <w:rPr>
-                <w:rFonts w:ascii="Times New Roman" w:cs="Times New Roman" w:eastAsia="Times New Roman" w:hAnsi="Times New Roman"/>
+                <w:rFonts w:ascii="Times New Roman" w:hAnsi="Times New Roman" w:eastAsia="Times New Roman" w:cs="Times New Roman"/>
                 <w:b w:val="false"/>
                 <w:bCs w:val="false"/>
                 <w:color w:val="FF0000"/>
@@ -10435,7 +10435,7 @@
             </w:pPr>
             <w:r>
               <w:rPr>
-                <w:rFonts w:ascii="Times New Roman" w:cs="Times New Roman" w:eastAsia="Times New Roman" w:hAnsi="Times New Roman"/>
+                <w:rFonts w:ascii="Times New Roman" w:hAnsi="Times New Roman" w:eastAsia="Times New Roman" w:cs="Times New Roman"/>
                 <w:b w:val="false"/>
                 <w:bCs w:val="false"/>
                 <w:sz w:val="19"/>
@@ -10468,7 +10468,7 @@
             </w:pPr>
             <w:r>
               <w:rPr>
-                <w:rFonts w:ascii="Times New Roman" w:cs="Times New Roman" w:eastAsia="Times New Roman" w:hAnsi="Times New Roman"/>
+                <w:rFonts w:ascii="Times New Roman" w:hAnsi="Times New Roman" w:eastAsia="Times New Roman" w:cs="Times New Roman"/>
                 <w:b w:val="false"/>
                 <w:bCs w:val="false"/>
                 <w:sz w:val="19"/>
@@ -10501,7 +10501,7 @@
             </w:pPr>
             <w:r>
               <w:rPr>
-                <w:rFonts w:ascii="Times New Roman" w:cs="Times New Roman" w:eastAsia="Times New Roman" w:hAnsi="Times New Roman"/>
+                <w:rFonts w:ascii="Times New Roman" w:hAnsi="Times New Roman" w:eastAsia="Times New Roman" w:cs="Times New Roman"/>
                 <w:b w:val="false"/>
                 <w:bCs w:val="false"/>
                 <w:sz w:val="19"/>
@@ -10534,13 +10534,13 @@
             </w:pPr>
             <w:r>
               <w:rPr>
-                <w:rFonts w:ascii="Times New Roman" w:cs="Times New Roman" w:eastAsia="Times New Roman" w:hAnsi="Times New Roman"/>
-                <w:b w:val="false"/>
-                <w:bCs w:val="false"/>
-                <w:sz w:val="19"/>
-                <w:szCs w:val="19"/>
-              </w:rPr>
-              <w:t xml:space="preserve">Ketma-ket ikki gap «Demak,» bilan boshlangan.</w:t>
+                <w:rFonts w:ascii="Times New Roman" w:hAnsi="Times New Roman" w:eastAsia="Times New Roman" w:cs="Times New Roman"/>
+                <w:b w:val="false"/>
+                <w:bCs w:val="false"/>
+                <w:sz w:val="19"/>
+                <w:szCs w:val="19"/>
+              </w:rPr>
+              <w:t xml:space="preserve">Ketma-ket ikki gap “Demak,” bilan boshlangan.</w:t>
             </w:r>
           </w:p>
         </w:tc>
@@ -10567,13 +10567,13 @@
             </w:pPr>
             <w:r>
               <w:rPr>
-                <w:rFonts w:ascii="Times New Roman" w:cs="Times New Roman" w:eastAsia="Times New Roman" w:hAnsi="Times New Roman"/>
-                <w:b w:val="false"/>
-                <w:bCs w:val="false"/>
-                <w:sz w:val="19"/>
-                <w:szCs w:val="19"/>
-              </w:rPr>
-              <w:t xml:space="preserve">Birinchisi «Bundan ko‘rinadiki» bilan almashtirildi.</w:t>
+                <w:rFonts w:ascii="Times New Roman" w:hAnsi="Times New Roman" w:eastAsia="Times New Roman" w:cs="Times New Roman"/>
+                <w:b w:val="false"/>
+                <w:bCs w:val="false"/>
+                <w:sz w:val="19"/>
+                <w:szCs w:val="19"/>
+              </w:rPr>
+              <w:t xml:space="preserve">Birinchisi “Bundan ko‘rinadiki” bilan almashtirildi.</w:t>
             </w:r>
           </w:p>
         </w:tc>
@@ -10601,7 +10601,7 @@
             </w:pPr>
             <w:r>
               <w:rPr>
-                <w:rFonts w:ascii="Times New Roman" w:cs="Times New Roman" w:eastAsia="Times New Roman" w:hAnsi="Times New Roman"/>
+                <w:rFonts w:ascii="Times New Roman" w:hAnsi="Times New Roman" w:eastAsia="Times New Roman" w:cs="Times New Roman"/>
                 <w:b w:val="false"/>
                 <w:bCs w:val="false"/>
                 <w:sz w:val="19"/>
@@ -10632,7 +10632,7 @@
             <w:pPr/>
             <w:r>
               <w:rPr>
-                <w:rFonts w:ascii="Times New Roman" w:cs="Times New Roman" w:eastAsia="Times New Roman" w:hAnsi="Times New Roman"/>
+                <w:rFonts w:ascii="Times New Roman" w:hAnsi="Times New Roman" w:eastAsia="Times New Roman" w:cs="Times New Roman"/>
                 <w:b w:val="false"/>
                 <w:bCs w:val="false"/>
                 <w:color w:val="FF0000"/>
@@ -10671,7 +10671,7 @@
             </w:pPr>
             <w:r>
               <w:rPr>
-                <w:rFonts w:ascii="Times New Roman" w:cs="Times New Roman" w:eastAsia="Times New Roman" w:hAnsi="Times New Roman"/>
+                <w:rFonts w:ascii="Times New Roman" w:hAnsi="Times New Roman" w:eastAsia="Times New Roman" w:cs="Times New Roman"/>
                 <w:b w:val="false"/>
                 <w:bCs w:val="false"/>
                 <w:sz w:val="19"/>
@@ -10704,7 +10704,7 @@
             </w:pPr>
             <w:r>
               <w:rPr>
-                <w:rFonts w:ascii="Times New Roman" w:cs="Times New Roman" w:eastAsia="Times New Roman" w:hAnsi="Times New Roman"/>
+                <w:rFonts w:ascii="Times New Roman" w:hAnsi="Times New Roman" w:eastAsia="Times New Roman" w:cs="Times New Roman"/>
                 <w:b w:val="false"/>
                 <w:bCs w:val="false"/>
                 <w:sz w:val="19"/>
@@ -10737,7 +10737,7 @@
             </w:pPr>
             <w:r>
               <w:rPr>
-                <w:rFonts w:ascii="Times New Roman" w:cs="Times New Roman" w:eastAsia="Times New Roman" w:hAnsi="Times New Roman"/>
+                <w:rFonts w:ascii="Times New Roman" w:hAnsi="Times New Roman" w:eastAsia="Times New Roman" w:cs="Times New Roman"/>
                 <w:b w:val="false"/>
                 <w:bCs w:val="false"/>
                 <w:sz w:val="19"/>
@@ -10770,13 +10770,13 @@
             </w:pPr>
             <w:r>
               <w:rPr>
-                <w:rFonts w:ascii="Times New Roman" w:cs="Times New Roman" w:eastAsia="Times New Roman" w:hAnsi="Times New Roman"/>
-                <w:b w:val="false"/>
-                <w:bCs w:val="false"/>
-                <w:sz w:val="19"/>
-                <w:szCs w:val="19"/>
-              </w:rPr>
-              <w:t xml:space="preserve">«Ikki jihatda farq qiladi» deyilgan, ammo vaznlar to‘rt blok bo‘yicha farq qiladi.</w:t>
+                <w:rFonts w:ascii="Times New Roman" w:hAnsi="Times New Roman" w:eastAsia="Times New Roman" w:cs="Times New Roman"/>
+                <w:b w:val="false"/>
+                <w:bCs w:val="false"/>
+                <w:sz w:val="19"/>
+                <w:szCs w:val="19"/>
+              </w:rPr>
+              <w:t xml:space="preserve">“Ikki jihatda farq qiladi” deyilgan, ammo vaznlar to‘rt blok bo‘yicha farq qiladi.</w:t>
             </w:r>
           </w:p>
         </w:tc>
@@ -10803,13 +10803,13 @@
             </w:pPr>
             <w:r>
               <w:rPr>
-                <w:rFonts w:ascii="Times New Roman" w:cs="Times New Roman" w:eastAsia="Times New Roman" w:hAnsi="Times New Roman"/>
-                <w:b w:val="false"/>
-                <w:bCs w:val="false"/>
-                <w:sz w:val="19"/>
-                <w:szCs w:val="19"/>
-              </w:rPr>
-              <w:t xml:space="preserve">«Asosan ikki jihatda» deb tuzatildi.</w:t>
+                <w:rFonts w:ascii="Times New Roman" w:hAnsi="Times New Roman" w:eastAsia="Times New Roman" w:cs="Times New Roman"/>
+                <w:b w:val="false"/>
+                <w:bCs w:val="false"/>
+                <w:sz w:val="19"/>
+                <w:szCs w:val="19"/>
+              </w:rPr>
+              <w:t xml:space="preserve">“Asosan ikki jihatda” deb tuzatildi.</w:t>
             </w:r>
           </w:p>
         </w:tc>
@@ -10837,7 +10837,7 @@
             </w:pPr>
             <w:r>
               <w:rPr>
-                <w:rFonts w:ascii="Times New Roman" w:cs="Times New Roman" w:eastAsia="Times New Roman" w:hAnsi="Times New Roman"/>
+                <w:rFonts w:ascii="Times New Roman" w:hAnsi="Times New Roman" w:eastAsia="Times New Roman" w:cs="Times New Roman"/>
                 <w:b w:val="false"/>
                 <w:bCs w:val="false"/>
                 <w:sz w:val="19"/>
@@ -10868,7 +10868,7 @@
             <w:pPr/>
             <w:r>
               <w:rPr>
-                <w:rFonts w:ascii="Times New Roman" w:cs="Times New Roman" w:eastAsia="Times New Roman" w:hAnsi="Times New Roman"/>
+                <w:rFonts w:ascii="Times New Roman" w:hAnsi="Times New Roman" w:eastAsia="Times New Roman" w:cs="Times New Roman"/>
                 <w:b w:val="false"/>
                 <w:bCs w:val="false"/>
                 <w:color w:val="FF0000"/>
@@ -10907,7 +10907,7 @@
             </w:pPr>
             <w:r>
               <w:rPr>
-                <w:rFonts w:ascii="Times New Roman" w:cs="Times New Roman" w:eastAsia="Times New Roman" w:hAnsi="Times New Roman"/>
+                <w:rFonts w:ascii="Times New Roman" w:hAnsi="Times New Roman" w:eastAsia="Times New Roman" w:cs="Times New Roman"/>
                 <w:b w:val="false"/>
                 <w:bCs w:val="false"/>
                 <w:sz w:val="19"/>
@@ -10940,7 +10940,7 @@
             </w:pPr>
             <w:r>
               <w:rPr>
-                <w:rFonts w:ascii="Times New Roman" w:cs="Times New Roman" w:eastAsia="Times New Roman" w:hAnsi="Times New Roman"/>
+                <w:rFonts w:ascii="Times New Roman" w:hAnsi="Times New Roman" w:eastAsia="Times New Roman" w:cs="Times New Roman"/>
                 <w:b w:val="false"/>
                 <w:bCs w:val="false"/>
                 <w:sz w:val="19"/>
@@ -10973,7 +10973,7 @@
             </w:pPr>
             <w:r>
               <w:rPr>
-                <w:rFonts w:ascii="Times New Roman" w:cs="Times New Roman" w:eastAsia="Times New Roman" w:hAnsi="Times New Roman"/>
+                <w:rFonts w:ascii="Times New Roman" w:hAnsi="Times New Roman" w:eastAsia="Times New Roman" w:cs="Times New Roman"/>
                 <w:b w:val="false"/>
                 <w:bCs w:val="false"/>
                 <w:sz w:val="19"/>
@@ -11006,13 +11006,13 @@
             </w:pPr>
             <w:r>
               <w:rPr>
-                <w:rFonts w:ascii="Times New Roman" w:cs="Times New Roman" w:eastAsia="Times New Roman" w:hAnsi="Times New Roman"/>
-                <w:b w:val="false"/>
-                <w:bCs w:val="false"/>
-                <w:sz w:val="19"/>
-                <w:szCs w:val="19"/>
-              </w:rPr>
-              <w:t xml:space="preserve">«Boshqa sharoitlar teng bo‘lganda» deyilgan, lekin 1-model faqat bank hajmi va chorak effektlarini nazorat qiladi.</w:t>
+                <w:rFonts w:ascii="Times New Roman" w:hAnsi="Times New Roman" w:eastAsia="Times New Roman" w:cs="Times New Roman"/>
+                <w:b w:val="false"/>
+                <w:bCs w:val="false"/>
+                <w:sz w:val="19"/>
+                <w:szCs w:val="19"/>
+              </w:rPr>
+              <w:t xml:space="preserve">“Boshqa sharoitlar teng bo‘lganda” deyilgan, lekin 1-model faqat bank hajmi va chorak effektlarini nazorat qiladi.</w:t>
             </w:r>
           </w:p>
         </w:tc>
@@ -11039,7 +11039,7 @@
             </w:pPr>
             <w:r>
               <w:rPr>
-                <w:rFonts w:ascii="Times New Roman" w:cs="Times New Roman" w:eastAsia="Times New Roman" w:hAnsi="Times New Roman"/>
+                <w:rFonts w:ascii="Times New Roman" w:hAnsi="Times New Roman" w:eastAsia="Times New Roman" w:cs="Times New Roman"/>
                 <w:b w:val="false"/>
                 <w:bCs w:val="false"/>
                 <w:sz w:val="19"/>
@@ -11073,7 +11073,7 @@
             </w:pPr>
             <w:r>
               <w:rPr>
-                <w:rFonts w:ascii="Times New Roman" w:cs="Times New Roman" w:eastAsia="Times New Roman" w:hAnsi="Times New Roman"/>
+                <w:rFonts w:ascii="Times New Roman" w:hAnsi="Times New Roman" w:eastAsia="Times New Roman" w:cs="Times New Roman"/>
                 <w:b w:val="false"/>
                 <w:bCs w:val="false"/>
                 <w:sz w:val="19"/>
@@ -11104,7 +11104,7 @@
             <w:pPr/>
             <w:r>
               <w:rPr>
-                <w:rFonts w:ascii="Times New Roman" w:cs="Times New Roman" w:eastAsia="Times New Roman" w:hAnsi="Times New Roman"/>
+                <w:rFonts w:ascii="Times New Roman" w:hAnsi="Times New Roman" w:eastAsia="Times New Roman" w:cs="Times New Roman"/>
                 <w:b w:val="false"/>
                 <w:bCs w:val="false"/>
                 <w:color w:val="FF0000"/>
@@ -11143,7 +11143,7 @@
             </w:pPr>
             <w:r>
               <w:rPr>
-                <w:rFonts w:ascii="Times New Roman" w:cs="Times New Roman" w:eastAsia="Times New Roman" w:hAnsi="Times New Roman"/>
+                <w:rFonts w:ascii="Times New Roman" w:hAnsi="Times New Roman" w:eastAsia="Times New Roman" w:cs="Times New Roman"/>
                 <w:b w:val="false"/>
                 <w:bCs w:val="false"/>
                 <w:sz w:val="19"/>
@@ -11176,7 +11176,7 @@
             </w:pPr>
             <w:r>
               <w:rPr>
-                <w:rFonts w:ascii="Times New Roman" w:cs="Times New Roman" w:eastAsia="Times New Roman" w:hAnsi="Times New Roman"/>
+                <w:rFonts w:ascii="Times New Roman" w:hAnsi="Times New Roman" w:eastAsia="Times New Roman" w:cs="Times New Roman"/>
                 <w:b w:val="false"/>
                 <w:bCs w:val="false"/>
                 <w:sz w:val="19"/>
@@ -11209,7 +11209,7 @@
             </w:pPr>
             <w:r>
               <w:rPr>
-                <w:rFonts w:ascii="Times New Roman" w:cs="Times New Roman" w:eastAsia="Times New Roman" w:hAnsi="Times New Roman"/>
+                <w:rFonts w:ascii="Times New Roman" w:hAnsi="Times New Roman" w:eastAsia="Times New Roman" w:cs="Times New Roman"/>
                 <w:b w:val="false"/>
                 <w:bCs w:val="false"/>
                 <w:sz w:val="19"/>
@@ -11242,13 +11242,13 @@
             </w:pPr>
             <w:r>
               <w:rPr>
-                <w:rFonts w:ascii="Times New Roman" w:cs="Times New Roman" w:eastAsia="Times New Roman" w:hAnsi="Times New Roman"/>
-                <w:b w:val="false"/>
-                <w:bCs w:val="false"/>
-                <w:sz w:val="19"/>
-                <w:szCs w:val="19"/>
-              </w:rPr>
-              <w:t xml:space="preserve">«[ilmiy-tadqiqot mavzusi nomi]», aprobatsiya bo‘limidagi «[__] ta» va nashrlar soni bo‘limidagi «[__]» to‘ldirilmagan.</w:t>
+                <w:rFonts w:ascii="Times New Roman" w:hAnsi="Times New Roman" w:eastAsia="Times New Roman" w:cs="Times New Roman"/>
+                <w:b w:val="false"/>
+                <w:bCs w:val="false"/>
+                <w:sz w:val="19"/>
+                <w:szCs w:val="19"/>
+              </w:rPr>
+              <w:t xml:space="preserve">“[ilmiy-tadqiqot mavzusi nomi]”, aprobatsiya bo‘limidagi “[__] ta” va nashrlar soni bo‘limidagi “[__]” to‘ldirilmagan.</w:t>
             </w:r>
           </w:p>
         </w:tc>
@@ -11275,7 +11275,7 @@
             </w:pPr>
             <w:r>
               <w:rPr>
-                <w:rFonts w:ascii="Times New Roman" w:cs="Times New Roman" w:eastAsia="Times New Roman" w:hAnsi="Times New Roman"/>
+                <w:rFonts w:ascii="Times New Roman" w:hAnsi="Times New Roman" w:eastAsia="Times New Roman" w:cs="Times New Roman"/>
                 <w:b w:val="false"/>
                 <w:bCs w:val="false"/>
                 <w:sz w:val="19"/>
@@ -11309,7 +11309,7 @@
             </w:pPr>
             <w:r>
               <w:rPr>
-                <w:rFonts w:ascii="Times New Roman" w:cs="Times New Roman" w:eastAsia="Times New Roman" w:hAnsi="Times New Roman"/>
+                <w:rFonts w:ascii="Times New Roman" w:hAnsi="Times New Roman" w:eastAsia="Times New Roman" w:cs="Times New Roman"/>
                 <w:b w:val="false"/>
                 <w:bCs w:val="false"/>
                 <w:sz w:val="19"/>
@@ -11340,7 +11340,7 @@
             <w:pPr/>
             <w:r>
               <w:rPr>
-                <w:rFonts w:ascii="Times New Roman" w:cs="Times New Roman" w:eastAsia="Times New Roman" w:hAnsi="Times New Roman"/>
+                <w:rFonts w:ascii="Times New Roman" w:hAnsi="Times New Roman" w:eastAsia="Times New Roman" w:cs="Times New Roman"/>
                 <w:b w:val="false"/>
                 <w:bCs w:val="false"/>
                 <w:color w:val="FF0000"/>
@@ -11379,7 +11379,7 @@
             </w:pPr>
             <w:r>
               <w:rPr>
-                <w:rFonts w:ascii="Times New Roman" w:cs="Times New Roman" w:eastAsia="Times New Roman" w:hAnsi="Times New Roman"/>
+                <w:rFonts w:ascii="Times New Roman" w:hAnsi="Times New Roman" w:eastAsia="Times New Roman" w:cs="Times New Roman"/>
                 <w:b w:val="false"/>
                 <w:bCs w:val="false"/>
                 <w:sz w:val="19"/>
@@ -11412,7 +11412,7 @@
             </w:pPr>
             <w:r>
               <w:rPr>
-                <w:rFonts w:ascii="Times New Roman" w:cs="Times New Roman" w:eastAsia="Times New Roman" w:hAnsi="Times New Roman"/>
+                <w:rFonts w:ascii="Times New Roman" w:hAnsi="Times New Roman" w:eastAsia="Times New Roman" w:cs="Times New Roman"/>
                 <w:b w:val="false"/>
                 <w:bCs w:val="false"/>
                 <w:sz w:val="19"/>
@@ -11445,7 +11445,7 @@
             </w:pPr>
             <w:r>
               <w:rPr>
-                <w:rFonts w:ascii="Times New Roman" w:cs="Times New Roman" w:eastAsia="Times New Roman" w:hAnsi="Times New Roman"/>
+                <w:rFonts w:ascii="Times New Roman" w:hAnsi="Times New Roman" w:eastAsia="Times New Roman" w:cs="Times New Roman"/>
                 <w:b w:val="false"/>
                 <w:bCs w:val="false"/>
                 <w:sz w:val="19"/>
@@ -11478,13 +11478,13 @@
             </w:pPr>
             <w:r>
               <w:rPr>
-                <w:rFonts w:ascii="Times New Roman" w:cs="Times New Roman" w:eastAsia="Times New Roman" w:hAnsi="Times New Roman"/>
-                <w:b w:val="false"/>
-                <w:bCs w:val="false"/>
-                <w:sz w:val="19"/>
-                <w:szCs w:val="19"/>
-              </w:rPr>
-              <w:t xml:space="preserve">Bajarilgan joy – Denov tadbirkorlik va pedagogika universiteti, shahar esa «Toshkent – 2026».</w:t>
+                <w:rFonts w:ascii="Times New Roman" w:hAnsi="Times New Roman" w:eastAsia="Times New Roman" w:cs="Times New Roman"/>
+                <w:b w:val="false"/>
+                <w:bCs w:val="false"/>
+                <w:sz w:val="19"/>
+                <w:szCs w:val="19"/>
+              </w:rPr>
+              <w:t xml:space="preserve">Bajarilgan joy – Denov tadbirkorlik va pedagogika universiteti, shahar esa “Toshkent – 2026”.</w:t>
             </w:r>
           </w:p>
         </w:tc>
@@ -11511,7 +11511,7 @@
             </w:pPr>
             <w:r>
               <w:rPr>
-                <w:rFonts w:ascii="Times New Roman" w:cs="Times New Roman" w:eastAsia="Times New Roman" w:hAnsi="Times New Roman"/>
+                <w:rFonts w:ascii="Times New Roman" w:hAnsi="Times New Roman" w:eastAsia="Times New Roman" w:cs="Times New Roman"/>
                 <w:b w:val="false"/>
                 <w:bCs w:val="false"/>
                 <w:sz w:val="19"/>
@@ -11545,7 +11545,7 @@
             </w:pPr>
             <w:r>
               <w:rPr>
-                <w:rFonts w:ascii="Times New Roman" w:cs="Times New Roman" w:eastAsia="Times New Roman" w:hAnsi="Times New Roman"/>
+                <w:rFonts w:ascii="Times New Roman" w:hAnsi="Times New Roman" w:eastAsia="Times New Roman" w:cs="Times New Roman"/>
                 <w:b w:val="false"/>
                 <w:bCs w:val="false"/>
                 <w:sz w:val="19"/>
@@ -11576,14 +11576,14 @@
             <w:pPr/>
             <w:r>
               <w:rPr>
-                <w:rFonts w:ascii="Times New Roman" w:cs="Times New Roman" w:eastAsia="Times New Roman" w:hAnsi="Times New Roman"/>
+                <w:rFonts w:ascii="Times New Roman" w:hAnsi="Times New Roman" w:eastAsia="Times New Roman" w:cs="Times New Roman"/>
                 <w:b w:val="false"/>
                 <w:bCs w:val="false"/>
                 <w:color w:val="FF0000"/>
                 <w:sz w:val="19"/>
                 <w:szCs w:val="19"/>
               </w:rPr>
-              <w:t xml:space="preserve">Asoslandi. O‘zgartirilmadi: Ilmiy kengash Toshkentda (Tashkent International University) joylashgani uchun «Toshkent – 2026» saqlandi; OAK talabi boshqacha bo‘lsa, muallif o‘zgartiradi.</w:t>
+              <w:t xml:space="preserve">Asoslandi. O‘zgartirilmadi: Ilmiy kengash Toshkentda (Tashkent International University) joylashgani uchun “Toshkent – 2026” saqlandi; OAK talabi boshqacha bo‘lsa, muallif o‘zgartiradi.</w:t>
             </w:r>
           </w:p>
         </w:tc>
@@ -11615,7 +11615,7 @@
             </w:pPr>
             <w:r>
               <w:rPr>
-                <w:rFonts w:ascii="Times New Roman" w:cs="Times New Roman" w:eastAsia="Times New Roman" w:hAnsi="Times New Roman"/>
+                <w:rFonts w:ascii="Times New Roman" w:hAnsi="Times New Roman" w:eastAsia="Times New Roman" w:cs="Times New Roman"/>
                 <w:b w:val="false"/>
                 <w:bCs w:val="false"/>
                 <w:sz w:val="19"/>
@@ -11648,7 +11648,7 @@
             </w:pPr>
             <w:r>
               <w:rPr>
-                <w:rFonts w:ascii="Times New Roman" w:cs="Times New Roman" w:eastAsia="Times New Roman" w:hAnsi="Times New Roman"/>
+                <w:rFonts w:ascii="Times New Roman" w:hAnsi="Times New Roman" w:eastAsia="Times New Roman" w:cs="Times New Roman"/>
                 <w:b w:val="false"/>
                 <w:bCs w:val="false"/>
                 <w:sz w:val="19"/>
@@ -11681,7 +11681,7 @@
             </w:pPr>
             <w:r>
               <w:rPr>
-                <w:rFonts w:ascii="Times New Roman" w:cs="Times New Roman" w:eastAsia="Times New Roman" w:hAnsi="Times New Roman"/>
+                <w:rFonts w:ascii="Times New Roman" w:hAnsi="Times New Roman" w:eastAsia="Times New Roman" w:cs="Times New Roman"/>
                 <w:b w:val="false"/>
                 <w:bCs w:val="false"/>
                 <w:sz w:val="19"/>
@@ -11714,7 +11714,7 @@
             </w:pPr>
             <w:r>
               <w:rPr>
-                <w:rFonts w:ascii="Times New Roman" w:cs="Times New Roman" w:eastAsia="Times New Roman" w:hAnsi="Times New Roman"/>
+                <w:rFonts w:ascii="Times New Roman" w:hAnsi="Times New Roman" w:eastAsia="Times New Roman" w:cs="Times New Roman"/>
                 <w:b w:val="false"/>
                 <w:bCs w:val="false"/>
                 <w:sz w:val="19"/>
@@ -11747,13 +11747,13 @@
             </w:pPr>
             <w:r>
               <w:rPr>
-                <w:rFonts w:ascii="Times New Roman" w:cs="Times New Roman" w:eastAsia="Times New Roman" w:hAnsi="Times New Roman"/>
-                <w:b w:val="false"/>
-                <w:bCs w:val="false"/>
-                <w:sz w:val="19"/>
-                <w:szCs w:val="19"/>
-              </w:rPr>
-              <w:t xml:space="preserve">Ro‘yxatni to‘ldiring, sayt manzillarini olib tashlang va Kirishdagi «174 ta manba» sonini yangilang.</w:t>
+                <w:rFonts w:ascii="Times New Roman" w:hAnsi="Times New Roman" w:eastAsia="Times New Roman" w:cs="Times New Roman"/>
+                <w:b w:val="false"/>
+                <w:bCs w:val="false"/>
+                <w:sz w:val="19"/>
+                <w:szCs w:val="19"/>
+              </w:rPr>
+              <w:t xml:space="preserve">Ro‘yxatni to‘ldiring, sayt manzillarini olib tashlang va Kirishdagi “174 ta manba” sonini yangilang.</w:t>
             </w:r>
           </w:p>
         </w:tc>
@@ -11781,7 +11781,7 @@
             </w:pPr>
             <w:r>
               <w:rPr>
-                <w:rFonts w:ascii="Times New Roman" w:cs="Times New Roman" w:eastAsia="Times New Roman" w:hAnsi="Times New Roman"/>
+                <w:rFonts w:ascii="Times New Roman" w:hAnsi="Times New Roman" w:eastAsia="Times New Roman" w:cs="Times New Roman"/>
                 <w:b w:val="false"/>
                 <w:bCs w:val="false"/>
                 <w:sz w:val="19"/>
@@ -11812,7 +11812,7 @@
             <w:pPr/>
             <w:r>
               <w:rPr>
-                <w:rFonts w:ascii="Times New Roman" w:cs="Times New Roman" w:eastAsia="Times New Roman" w:hAnsi="Times New Roman"/>
+                <w:rFonts w:ascii="Times New Roman" w:hAnsi="Times New Roman" w:eastAsia="Times New Roman" w:cs="Times New Roman"/>
                 <w:b w:val="false"/>
                 <w:bCs w:val="false"/>
                 <w:color w:val="FF0000"/>
@@ -11851,7 +11851,7 @@
             </w:pPr>
             <w:r>
               <w:rPr>
-                <w:rFonts w:ascii="Times New Roman" w:cs="Times New Roman" w:eastAsia="Times New Roman" w:hAnsi="Times New Roman"/>
+                <w:rFonts w:ascii="Times New Roman" w:hAnsi="Times New Roman" w:eastAsia="Times New Roman" w:cs="Times New Roman"/>
                 <w:b w:val="false"/>
                 <w:bCs w:val="false"/>
                 <w:sz w:val="19"/>
@@ -11884,7 +11884,7 @@
             </w:pPr>
             <w:r>
               <w:rPr>
-                <w:rFonts w:ascii="Times New Roman" w:cs="Times New Roman" w:eastAsia="Times New Roman" w:hAnsi="Times New Roman"/>
+                <w:rFonts w:ascii="Times New Roman" w:hAnsi="Times New Roman" w:eastAsia="Times New Roman" w:cs="Times New Roman"/>
                 <w:b w:val="false"/>
                 <w:bCs w:val="false"/>
                 <w:sz w:val="19"/>
@@ -11917,7 +11917,7 @@
             </w:pPr>
             <w:r>
               <w:rPr>
-                <w:rFonts w:ascii="Times New Roman" w:cs="Times New Roman" w:eastAsia="Times New Roman" w:hAnsi="Times New Roman"/>
+                <w:rFonts w:ascii="Times New Roman" w:hAnsi="Times New Roman" w:eastAsia="Times New Roman" w:cs="Times New Roman"/>
                 <w:b w:val="false"/>
                 <w:bCs w:val="false"/>
                 <w:sz w:val="19"/>
@@ -11950,7 +11950,7 @@
             </w:pPr>
             <w:r>
               <w:rPr>
-                <w:rFonts w:ascii="Times New Roman" w:cs="Times New Roman" w:eastAsia="Times New Roman" w:hAnsi="Times New Roman"/>
+                <w:rFonts w:ascii="Times New Roman" w:hAnsi="Times New Roman" w:eastAsia="Times New Roman" w:cs="Times New Roman"/>
                 <w:b w:val="false"/>
                 <w:bCs w:val="false"/>
                 <w:sz w:val="19"/>
@@ -11983,7 +11983,7 @@
             </w:pPr>
             <w:r>
               <w:rPr>
-                <w:rFonts w:ascii="Times New Roman" w:cs="Times New Roman" w:eastAsia="Times New Roman" w:hAnsi="Times New Roman"/>
+                <w:rFonts w:ascii="Times New Roman" w:hAnsi="Times New Roman" w:eastAsia="Times New Roman" w:cs="Times New Roman"/>
                 <w:b w:val="false"/>
                 <w:bCs w:val="false"/>
                 <w:sz w:val="19"/>
@@ -12017,7 +12017,7 @@
             </w:pPr>
             <w:r>
               <w:rPr>
-                <w:rFonts w:ascii="Times New Roman" w:cs="Times New Roman" w:eastAsia="Times New Roman" w:hAnsi="Times New Roman"/>
+                <w:rFonts w:ascii="Times New Roman" w:hAnsi="Times New Roman" w:eastAsia="Times New Roman" w:cs="Times New Roman"/>
                 <w:b w:val="false"/>
                 <w:bCs w:val="false"/>
                 <w:sz w:val="19"/>
@@ -12048,7 +12048,7 @@
             <w:pPr/>
             <w:r>
               <w:rPr>
-                <w:rFonts w:ascii="Times New Roman" w:cs="Times New Roman" w:eastAsia="Times New Roman" w:hAnsi="Times New Roman"/>
+                <w:rFonts w:ascii="Times New Roman" w:hAnsi="Times New Roman" w:eastAsia="Times New Roman" w:cs="Times New Roman"/>
                 <w:b w:val="false"/>
                 <w:bCs w:val="false"/>
                 <w:color w:val="FF0000"/>
@@ -12087,7 +12087,7 @@
             </w:pPr>
             <w:r>
               <w:rPr>
-                <w:rFonts w:ascii="Times New Roman" w:cs="Times New Roman" w:eastAsia="Times New Roman" w:hAnsi="Times New Roman"/>
+                <w:rFonts w:ascii="Times New Roman" w:hAnsi="Times New Roman" w:eastAsia="Times New Roman" w:cs="Times New Roman"/>
                 <w:b w:val="false"/>
                 <w:bCs w:val="false"/>
                 <w:sz w:val="19"/>
@@ -12120,7 +12120,7 @@
             </w:pPr>
             <w:r>
               <w:rPr>
-                <w:rFonts w:ascii="Times New Roman" w:cs="Times New Roman" w:eastAsia="Times New Roman" w:hAnsi="Times New Roman"/>
+                <w:rFonts w:ascii="Times New Roman" w:hAnsi="Times New Roman" w:eastAsia="Times New Roman" w:cs="Times New Roman"/>
                 <w:b w:val="false"/>
                 <w:bCs w:val="false"/>
                 <w:sz w:val="19"/>
@@ -12153,7 +12153,7 @@
             </w:pPr>
             <w:r>
               <w:rPr>
-                <w:rFonts w:ascii="Times New Roman" w:cs="Times New Roman" w:eastAsia="Times New Roman" w:hAnsi="Times New Roman"/>
+                <w:rFonts w:ascii="Times New Roman" w:hAnsi="Times New Roman" w:eastAsia="Times New Roman" w:cs="Times New Roman"/>
                 <w:b w:val="false"/>
                 <w:bCs w:val="false"/>
                 <w:sz w:val="19"/>
@@ -12186,13 +12186,13 @@
             </w:pPr>
             <w:r>
               <w:rPr>
-                <w:rFonts w:ascii="Times New Roman" w:cs="Times New Roman" w:eastAsia="Times New Roman" w:hAnsi="Times New Roman"/>
-                <w:b w:val="false"/>
-                <w:bCs w:val="false"/>
-                <w:sz w:val="19"/>
-                <w:szCs w:val="19"/>
-              </w:rPr>
-              <w:t xml:space="preserve">Sarlavhalarda «Oʻ/koʻ» belgisi (U+02BB) ishlatilgan, matnning qolgan qismida esa «O‘» (U+2018).</w:t>
+                <w:rFonts w:ascii="Times New Roman" w:hAnsi="Times New Roman" w:eastAsia="Times New Roman" w:cs="Times New Roman"/>
+                <w:b w:val="false"/>
+                <w:bCs w:val="false"/>
+                <w:sz w:val="19"/>
+                <w:szCs w:val="19"/>
+              </w:rPr>
+              <w:t xml:space="preserve">Sarlavhalarda “Oʻ/koʻ” belgisi (U+02BB) ishlatilgan, matnning qolgan qismida esa “O‘” (U+2018).</w:t>
             </w:r>
           </w:p>
         </w:tc>
@@ -12219,7 +12219,7 @@
             </w:pPr>
             <w:r>
               <w:rPr>
-                <w:rFonts w:ascii="Times New Roman" w:cs="Times New Roman" w:eastAsia="Times New Roman" w:hAnsi="Times New Roman"/>
+                <w:rFonts w:ascii="Times New Roman" w:hAnsi="Times New Roman" w:eastAsia="Times New Roman" w:cs="Times New Roman"/>
                 <w:b w:val="false"/>
                 <w:bCs w:val="false"/>
                 <w:sz w:val="19"/>
@@ -12253,7 +12253,7 @@
             </w:pPr>
             <w:r>
               <w:rPr>
-                <w:rFonts w:ascii="Times New Roman" w:cs="Times New Roman" w:eastAsia="Times New Roman" w:hAnsi="Times New Roman"/>
+                <w:rFonts w:ascii="Times New Roman" w:hAnsi="Times New Roman" w:eastAsia="Times New Roman" w:cs="Times New Roman"/>
                 <w:b w:val="false"/>
                 <w:bCs w:val="false"/>
                 <w:sz w:val="19"/>
@@ -12284,7 +12284,7 @@
             <w:pPr/>
             <w:r>
               <w:rPr>
-                <w:rFonts w:ascii="Times New Roman" w:cs="Times New Roman" w:eastAsia="Times New Roman" w:hAnsi="Times New Roman"/>
+                <w:rFonts w:ascii="Times New Roman" w:hAnsi="Times New Roman" w:eastAsia="Times New Roman" w:cs="Times New Roman"/>
                 <w:b w:val="false"/>
                 <w:bCs w:val="false"/>
                 <w:color w:val="FF0000"/>
@@ -12304,7 +12304,7 @@
       </w:pPr>
       <w:r>
         <w:rPr>
-          <w:rFonts w:ascii="Times New Roman" w:cs="Times New Roman" w:eastAsia="Times New Roman" w:hAnsi="Times New Roman"/>
+          <w:rFonts w:ascii="Times New Roman" w:hAnsi="Times New Roman" w:eastAsia="Times New Roman" w:cs="Times New Roman"/>
           <w:b w:val="false"/>
           <w:bCs w:val="false"/>
           <w:sz w:val="24"/>
@@ -12320,7 +12320,7 @@
       </w:pPr>
       <w:r>
         <w:rPr>
-          <w:rFonts w:ascii="Times New Roman" w:cs="Times New Roman" w:eastAsia="Times New Roman" w:hAnsi="Times New Roman"/>
+          <w:rFonts w:ascii="Times New Roman" w:hAnsi="Times New Roman" w:eastAsia="Times New Roman" w:cs="Times New Roman"/>
           <w:b/>
           <w:bCs/>
           <w:sz w:val="24"/>
@@ -12336,7 +12336,7 @@
       </w:pPr>
       <w:r>
         <w:rPr>
-          <w:rFonts w:ascii="Times New Roman" w:cs="Times New Roman" w:eastAsia="Times New Roman" w:hAnsi="Times New Roman"/>
+          <w:rFonts w:ascii="Times New Roman" w:hAnsi="Times New Roman" w:eastAsia="Times New Roman" w:cs="Times New Roman"/>
           <w:b w:val="false"/>
           <w:bCs w:val="false"/>
           <w:sz w:val="22"/>
@@ -12352,7 +12352,7 @@
       </w:pPr>
       <w:r>
         <w:rPr>
-          <w:rFonts w:ascii="Times New Roman" w:cs="Times New Roman" w:eastAsia="Times New Roman" w:hAnsi="Times New Roman"/>
+          <w:rFonts w:ascii="Times New Roman" w:hAnsi="Times New Roman" w:eastAsia="Times New Roman" w:cs="Times New Roman"/>
           <w:b w:val="false"/>
           <w:bCs w:val="false"/>
           <w:sz w:val="22"/>

</xml_diff>